<commit_message>
draft(UNAPPROVED): rewrite FMS.1–4 v2 from each standard's own OEs
FMS.5 v2.2 remains the section skeleton only. This pass drops fire-cloned
stop-work, Night Duty Officer command, and fixed 5.x/NN counts, and rebuilds
each policy from its v1 substance (NBC/WHO/BEMMP/MDR/HTM as in v1). No SQL.

Co-authored-by: upadhyaymehul9-prog <upadhyaymehul9-prog@users.noreply.github.com>
</commit_message>
<xml_diff>
--- a/policies/build/preview/FMS.1_v2_preview.docx
+++ b/policies/build/preview/FMS.1_v2_preview.docx
@@ -175,7 +175,7 @@
                 <w:sz w:val="18"/>
                 <w:szCs w:val="18"/>
               </w:rPr>
-              <w:t xml:space="preserve">2.0</w:t>
+              <w:t xml:space="preserve">2.1</w:t>
             </w:r>
           </w:p>
         </w:tc>
@@ -640,6 +640,98 @@
           </w:p>
         </w:tc>
       </w:tr>
+      <w:tr>
+        <w:tc>
+          <w:tcPr>
+            <w:tcW w:type="pct" w:w="22%"/>
+            <w:tcBorders>
+              <w:top w:val="single" w:color="999999" w:sz="4"/>
+              <w:left w:val="single" w:color="999999" w:sz="4"/>
+              <w:bottom w:val="single" w:color="999999" w:sz="4"/>
+              <w:right w:val="single" w:color="999999" w:sz="4"/>
+            </w:tcBorders>
+            <w:shd w:fill="E8E8E8" w:val="clear"/>
+          </w:tcPr>
+          <w:p>
+            <w:r>
+              <w:rPr>
+                <w:b/>
+                <w:bCs/>
+                <w:sz w:val="18"/>
+                <w:szCs w:val="18"/>
+              </w:rPr>
+              <w:t xml:space="preserve">Dialysis in directory</w:t>
+            </w:r>
+          </w:p>
+        </w:tc>
+        <w:tc>
+          <w:tcPr>
+            <w:tcW w:type="pct" w:w="28%"/>
+            <w:tcBorders>
+              <w:top w:val="single" w:color="999999" w:sz="4"/>
+              <w:left w:val="single" w:color="999999" w:sz="4"/>
+              <w:bottom w:val="single" w:color="999999" w:sz="4"/>
+              <w:right w:val="single" w:color="999999" w:sz="4"/>
+            </w:tcBorders>
+          </w:tcPr>
+          <w:p>
+            <w:r>
+              <w:rPr>
+                <w:b w:val="false"/>
+                <w:bCs w:val="false"/>
+                <w:sz w:val="18"/>
+                <w:szCs w:val="18"/>
+              </w:rPr>
+              <w:t xml:space="preserve">«no — recorded absence»</w:t>
+            </w:r>
+          </w:p>
+        </w:tc>
+        <w:tc>
+          <w:tcPr>
+            <w:tcW w:type="pct" w:w="22%"/>
+            <w:tcBorders>
+              <w:top w:val="single" w:color="999999" w:sz="4"/>
+              <w:left w:val="single" w:color="999999" w:sz="4"/>
+              <w:bottom w:val="single" w:color="999999" w:sz="4"/>
+              <w:right w:val="single" w:color="999999" w:sz="4"/>
+            </w:tcBorders>
+            <w:shd w:fill="E8E8E8" w:val="clear"/>
+          </w:tcPr>
+          <w:p>
+            <w:r>
+              <w:rPr>
+                <w:b/>
+                <w:bCs/>
+                <w:sz w:val="18"/>
+                <w:szCs w:val="18"/>
+              </w:rPr>
+              <w:t xml:space="preserve">After-hours facilities roster</w:t>
+            </w:r>
+          </w:p>
+        </w:tc>
+        <w:tc>
+          <w:tcPr>
+            <w:tcW w:type="pct" w:w="28%"/>
+            <w:tcBorders>
+              <w:top w:val="single" w:color="999999" w:sz="4"/>
+              <w:left w:val="single" w:color="999999" w:sz="4"/>
+              <w:bottom w:val="single" w:color="999999" w:sz="4"/>
+              <w:right w:val="single" w:color="999999" w:sz="4"/>
+            </w:tcBorders>
+          </w:tcPr>
+          <w:p>
+            <w:r>
+              <w:rPr>
+                <w:b w:val="false"/>
+                <w:bCs w:val="false"/>
+                <w:sz w:val="18"/>
+                <w:szCs w:val="18"/>
+              </w:rPr>
+              <w:t xml:space="preserve">«________»</w:t>
+            </w:r>
+          </w:p>
+        </w:tc>
+      </w:tr>
     </w:tbl>
     <w:p>
       <w:pPr>
@@ -680,31 +772,31 @@
           <w:sz w:val="22"/>
           <w:szCs w:val="22"/>
         </w:rPr>
-        <w:t xml:space="preserve">This policy governs how Preview Hospital plans its buildings and space, holds the drawings the occupancy actually required, directs patients and families through the site, keeps potable water and electricity available around the clock, proves that backup sources work under load, and runs named energy and environment initiatives.</w:t>
-      </w:r>
-    </w:p>
-    <w:p>
-      <w:pPr>
-        <w:spacing w:after="140"/>
-      </w:pPr>
-      <w:r>
-        <w:rPr>
-          <w:sz w:val="22"/>
-          <w:szCs w:val="22"/>
-        </w:rPr>
-        <w:t xml:space="preserve">It sets the standards the hospital requires of the people who plan space, operate plant and post signs. It is not a consultant drawing set, a generator-vendor manual, or a green-hospital certification application.</w:t>
-      </w:r>
-    </w:p>
-    <w:p>
-      <w:pPr>
-        <w:spacing w:after="140"/>
-      </w:pPr>
-      <w:r>
-        <w:rPr>
-          <w:sz w:val="22"/>
-          <w:szCs w:val="22"/>
-        </w:rPr>
-        <w:t xml:space="preserve">Editable defaults are marked «like this». True blanks — «________» — have no sensible default and must be completed before this document is signed.</w:t>
+        <w:t xml:space="preserve">This policy governs how Preview Hospital matches built space to the services it actually offers, holds the as-built drawings the occupancy required, posts wayfinding patients and families can follow, keeps potable water and electricity available round the clock, proves that alternate electricity and water work under load, and runs named energy-efficient and environment-friendly initiatives.</w:t>
+      </w:r>
+    </w:p>
+    <w:p>
+      <w:pPr>
+        <w:spacing w:after="140"/>
+      </w:pPr>
+      <w:r>
+        <w:rPr>
+          <w:sz w:val="22"/>
+          <w:szCs w:val="22"/>
+        </w:rPr>
+        <w:t xml:space="preserve">It is the planned-operation method for the building and its utilities. It is not a consultant drawing set, a generator-vendor manual, a green-hospital certification application, or a substitute for the occupancy conditions the local building authority issued for this site.</w:t>
+      </w:r>
+    </w:p>
+    <w:p>
+      <w:pPr>
+        <w:spacing w:after="140"/>
+      </w:pPr>
+      <w:r>
+        <w:rPr>
+          <w:sz w:val="22"/>
+          <w:szCs w:val="22"/>
+        </w:rPr>
+        <w:t xml:space="preserve">Editable defaults in this document are marked «like this». A hospital that adopts the default keeps the wording. A hospital that needs a different owner, interval or arrangement replaces the marked text before issue. True blanks — «________» — have no sensible default and must be completed before this document is signed.</w:t>
       </w:r>
     </w:p>
     <w:p>
@@ -725,31 +817,115 @@
           <w:sz w:val="22"/>
           <w:szCs w:val="22"/>
         </w:rPr>
-        <w:t xml:space="preserve">This policy applies to the buildings and plant of Preview Hospital and to the people who plan space, hold drawings, post wayfinding, operate potable-water and electrical systems and their backups, and run this year's energy and environment initiatives.</w:t>
-      </w:r>
-    </w:p>
-    <w:p>
-      <w:pPr>
-        <w:spacing w:after="140"/>
-      </w:pPr>
-      <w:r>
-        <w:rPr>
-          <w:sz w:val="22"/>
-          <w:szCs w:val="22"/>
-        </w:rPr>
-        <w:t xml:space="preserve">It covers: space matched to the services the hospital actually offers; the controlled as-built drawing set; internal and external wayfinding; round-the-clock potable water and electricity; alternate electricity and water, tested under load; and measured energy-efficient and environment-friendly initiatives.</w:t>
-      </w:r>
-    </w:p>
-    <w:p>
-      <w:pPr>
-        <w:spacing w:after="140"/>
-      </w:pPr>
-      <w:r>
-        <w:rPr>
-          <w:sz w:val="22"/>
-          <w:szCs w:val="22"/>
-        </w:rPr>
-        <w:t xml:space="preserve">It does not govern patient-safety devices, monthly facility rounds, electrical-installation audits, unused-material disposal or building hazardous materials (those are the facility-safety programme). It does not govern medical-equipment PPM (the equipment programme), medical gases (the gas programme), or fire and non-fire emergency plans. A power or water failure that is declared an emergency is handed to the fire-and-non-fire programme; routine backup testing stays here. Biomedical-waste colours stay the infection-control waste programme. Patient-facing expected cost is not a facilities tariff.</w:t>
+        <w:t xml:space="preserve">This policy applies to the physical facilities of Preview Hospital and to the people who plan space, hold drawings, post wayfinding, operate potable-water and electrical systems and their backups, and run this year's energy and environment initiatives.</w:t>
+      </w:r>
+    </w:p>
+    <w:p>
+      <w:pPr>
+        <w:spacing w:after="140"/>
+      </w:pPr>
+      <w:r>
+        <w:rPr>
+          <w:sz w:val="22"/>
+          <w:szCs w:val="22"/>
+        </w:rPr>
+        <w:t xml:space="preserve">It covers: appropriateness of facilities and space to the defined scope of services; as-built and updated drawings; internal and external sign postings; round-the-clock potable water and electricity; alternate electricity and water sources and the tests that prove they work; and energy-efficient / environment-friendly initiatives.</w:t>
+      </w:r>
+    </w:p>
+    <w:p>
+      <w:pPr>
+        <w:spacing w:after="140"/>
+      </w:pPr>
+      <w:r>
+        <w:rPr>
+          <w:sz w:val="22"/>
+          <w:szCs w:val="22"/>
+        </w:rPr>
+        <w:t xml:space="preserve">It does not govern patient-safety devices, monthly facility inspection rounds, electrical-installation audits, unused-material disposal, or building hazardous materials — those belong to the facility-safety programme. It does not govern medical-equipment preventive maintenance, medical gases, or fire and non-fire emergency plans. A power or water failure that is declared an emergency is handed to the fire-and-non-fire programme; routine backup testing stays here.</w:t>
+      </w:r>
+    </w:p>
+    <w:p>
+      <w:pPr>
+        <w:spacing w:after="140"/>
+      </w:pPr>
+      <w:r>
+        <w:rPr>
+          <w:sz w:val="22"/>
+          <w:szCs w:val="22"/>
+        </w:rPr>
+        <w:t xml:space="preserve">The defined scope of services is the service-directory programme. This policy owns that the built space can hold those services. A service the directory does not provide is a recorded absence, not another hospital's floor plate.</w:t>
+      </w:r>
+    </w:p>
+    <w:p>
+      <w:pPr>
+        <w:spacing w:after="140"/>
+      </w:pPr>
+      <w:r>
+        <w:rPr>
+          <w:sz w:val="22"/>
+          <w:szCs w:val="22"/>
+        </w:rPr>
+        <w:t xml:space="preserve">Radiation, restricted-area, pregnancy-caution and PC-PNDT notices are the laboratory and imaging safety programme. This policy owns hospital-wide wayfinding. Emergency-exit display is the fire programme; those sheets must be consistent with wayfinding but are not this posting counted twice.</w:t>
+      </w:r>
+    </w:p>
+    <w:p>
+      <w:pPr>
+        <w:spacing w:after="140"/>
+      </w:pPr>
+      <w:r>
+        <w:rPr>
+          <w:sz w:val="22"/>
+          <w:szCs w:val="22"/>
+        </w:rPr>
+        <w:t xml:space="preserve">A diesel generator, pump or UPS that is building plant is this policy. A ventilator or steriliser is the equipment programme. Steriliser validation as a reprocessing act stays the infection-control sterilisation programme.</w:t>
+      </w:r>
+    </w:p>
+    <w:p>
+      <w:pPr>
+        <w:spacing w:after="140"/>
+      </w:pPr>
+      <w:r>
+        <w:rPr>
+          <w:sz w:val="22"/>
+          <w:szCs w:val="22"/>
+        </w:rPr>
+        <w:t xml:space="preserve">Piped medical-gas plant electricity or water may be essential circuits here; the gas programme remains the gas programme.</w:t>
+      </w:r>
+    </w:p>
+    <w:p>
+      <w:pPr>
+        <w:spacing w:after="140"/>
+      </w:pPr>
+      <w:r>
+        <w:rPr>
+          <w:sz w:val="22"/>
+          <w:szCs w:val="22"/>
+        </w:rPr>
+        <w:t xml:space="preserve">Biomedical-waste colour, transport and authorisation stay the infection-control waste programme. Kitchen food-safety stays that waste/food programme. Patient-facing expected cost is not a facilities tariff.</w:t>
+      </w:r>
+    </w:p>
+    <w:p>
+      <w:pPr>
+        <w:spacing w:after="140"/>
+      </w:pPr>
+      <w:r>
+        <w:rPr>
+          <w:sz w:val="22"/>
+          <w:szCs w:val="22"/>
+        </w:rPr>
+        <w:t xml:space="preserve">Indian Public Health Standards 2022 and the National Building Code of India, 2016, are space and building-code frameworks as the local authority applied them. They are not a NABH bed-count, occupancy-subdivision or sprinkler mandate for every small hospital.</w:t>
+      </w:r>
+    </w:p>
+    <w:p>
+      <w:pPr>
+        <w:spacing w:after="140"/>
+      </w:pPr>
+      <w:r>
+        <w:rPr>
+          <w:sz w:val="22"/>
+          <w:szCs w:val="22"/>
+        </w:rPr>
+        <w:t xml:space="preserve">Coulliette and Arduino is the dialysis-water framework only if dialysis is in the service directory. If dialysis is not provided, that is a recorded absence, not a copied reverse-osmosis SOP.</w:t>
       </w:r>
     </w:p>
     <w:p>
@@ -770,67 +946,79 @@
           <w:sz w:val="22"/>
           <w:szCs w:val="22"/>
         </w:rPr>
-        <w:t xml:space="preserve">A service listed in the hospital's service directory has the waiting, clinical, diagnostic, utility, storage and staff space it needs. A corridor is not a ward. A sluice is not a sterile store. A service the directory does not provide is recorded as not offered; it is not given another hospital's floor plate. Indian Public Health Standards 2022 and NBC 2016 occupancy, as the local authority applied them, are the space frameworks — not a NABH bed-count mandate.</w:t>
-      </w:r>
-    </w:p>
-    <w:p>
-      <w:pPr>
-        <w:spacing w:after="140"/>
-      </w:pPr>
-      <w:r>
-        <w:rPr>
-          <w:sz w:val="22"/>
-          <w:szCs w:val="22"/>
-        </w:rPr>
-        <w:t xml:space="preserve">The controlled as-built set is the set the local building and fire authority required for this occupancy under the National Building Code of India, 2016, as applied: architectural, structural, electrical single-line, plumbing/water, fire/detection (used by the fire programme), and medical-gas sheets if a piped system exists (used by the gas programme). The set is updated when the building or a major service run changes. A brochure plan is not that set.</w:t>
-      </w:r>
-    </w:p>
-    <w:p>
-      <w:pPr>
-        <w:spacing w:after="140"/>
-      </w:pPr>
-      <w:r>
-        <w:rPr>
-          <w:sz w:val="22"/>
-          <w:szCs w:val="22"/>
-        </w:rPr>
-        <w:t xml:space="preserve">Wayfinding gets a first-time family to the entrance, registration, toilets, emergency, lifts, wards and the way out, in «Gujarati and English». Radiation, restricted-area, pregnancy-caution and PC-PNDT notices are the laboratory and imaging safety programme. Fire-exit plans are the fire programme. Those notices are not this wayfinding.</w:t>
-      </w:r>
-    </w:p>
-    <w:p>
-      <w:pPr>
-        <w:spacing w:after="140"/>
-      </w:pPr>
-      <w:r>
-        <w:rPr>
-          <w:sz w:val="22"/>
-          <w:szCs w:val="22"/>
-        </w:rPr>
-        <w:t xml:space="preserve">Potable water and electricity are live at the points of use at 03:00, not only at the morning check. Essential circuits — emergency; OT, labour, ICU/HDU, nursery and blood bank if those services exist; ventilators; emergency lighting; fire detection; medical-gas plant or manifold alarms — remain energised. Potable-water quality testing uses WHO Guidelines for Drinking-water Quality, 4th edition, as the framework. Dialysis water, if dialysis is offered, uses Coulliette and Arduino as the haemodialysis-water framework; if dialysis is not offered, that is recorded as not applicable.</w:t>
-      </w:r>
-    </w:p>
-    <w:p>
-      <w:pPr>
-        <w:spacing w:after="140"/>
-      </w:pPr>
-      <w:r>
-        <w:rPr>
-          <w:sz w:val="22"/>
-          <w:szCs w:val="22"/>
-        </w:rPr>
-        <w:t xml:space="preserve">Backup electricity is a loaded test of the essential-circuit list — not a weekly no-load crank. Backup water is tank-to-tap movement, pump auto-start, or a tanker that can be mobilised at night. Tests run «monthly». IS 732 wiring practice and IS 3043 earthing inform how the installation should behave; they are NBC-pointed frameworks, not extra statutes in the disclaimer.</w:t>
-      </w:r>
-    </w:p>
-    <w:p>
-      <w:pPr>
-        <w:spacing w:after="140"/>
-      </w:pPr>
-      <w:r>
-        <w:rPr>
-          <w:sz w:val="22"/>
-          <w:szCs w:val="22"/>
-        </w:rPr>
-        <w:t xml:space="preserve">Energy and environment initiatives are named, owned, baselined and reviewed. Dhillon (2015) is the green-hospital framework, not a rating mandate and not authority to cut clinical ventilation. Biomedical-waste colours stay the infection-control waste programme.</w:t>
+        <w:t xml:space="preserve">Preview Hospital matches waiting, clinical, diagnostic, utility, storage and staff space to the services it actually runs. A corridor is not a ward. A sluice is not a sterile store. A service the directory does not provide is recorded as not offered.</w:t>
+      </w:r>
+    </w:p>
+    <w:p>
+      <w:pPr>
+        <w:spacing w:after="140"/>
+      </w:pPr>
+      <w:r>
+        <w:rPr>
+          <w:sz w:val="22"/>
+          <w:szCs w:val="22"/>
+        </w:rPr>
+        <w:t xml:space="preserve">Preview Hospital holds the as-built drawing set the local building and fire authority required for this occupancy under the National Building Code of India, 2016, as applied, and updates that set when the building or a major service run changes. A brochure plan, or a consultant drawing never marked as-built, is not that set.</w:t>
+      </w:r>
+    </w:p>
+    <w:p>
+      <w:pPr>
+        <w:spacing w:after="140"/>
+      </w:pPr>
+      <w:r>
+        <w:rPr>
+          <w:sz w:val="22"/>
+          <w:szCs w:val="22"/>
+        </w:rPr>
+        <w:t xml:space="preserve">Preview Hospital posts internal and external wayfinding a first-time family can follow to the entrance, registration, toilets, emergency, lifts, wards and the way out, in «Gujarati and English». Radiation and PC-PNDT notices are not this wayfinding. Fire-exit plans are not this wayfinding.</w:t>
+      </w:r>
+    </w:p>
+    <w:p>
+      <w:pPr>
+        <w:spacing w:after="140"/>
+      </w:pPr>
+      <w:r>
+        <w:rPr>
+          <w:sz w:val="22"/>
+          <w:szCs w:val="22"/>
+        </w:rPr>
+        <w:t xml:space="preserve">Preview Hospital keeps potable water and electricity available round the clock at the points of use that serve patients and care, including night and holiday, not only at the morning check.</w:t>
+      </w:r>
+    </w:p>
+    <w:p>
+      <w:pPr>
+        <w:spacing w:after="140"/>
+      </w:pPr>
+      <w:r>
+        <w:rPr>
+          <w:sz w:val="22"/>
+          <w:szCs w:val="22"/>
+        </w:rPr>
+        <w:t xml:space="preserve">Preview Hospital provides alternate electricity and water for failure or shortage, and tests that they actually work at «monthly» frequency: a loaded run of the essential-circuit list, not a no-load crank; tank-to-tap movement or pump auto-start, not a sealed tanker memorandum with no night number.</w:t>
+      </w:r>
+    </w:p>
+    <w:p>
+      <w:pPr>
+        <w:spacing w:after="140"/>
+      </w:pPr>
+      <w:r>
+        <w:rPr>
+          <w:sz w:val="22"/>
+          <w:szCs w:val="22"/>
+        </w:rPr>
+        <w:t xml:space="preserve">Preview Hospital takes named energy-efficient and environment-friendly initiatives with an owner, a baseline and a result. Dhillon (2015) is the green-hospital framework, not a rating mandate and not authority to cut clinical ventilation below what the services require.</w:t>
+      </w:r>
+    </w:p>
+    <w:p>
+      <w:pPr>
+        <w:spacing w:after="140"/>
+      </w:pPr>
+      <w:r>
+        <w:rPr>
+          <w:sz w:val="22"/>
+          <w:szCs w:val="22"/>
+        </w:rPr>
+        <w:t xml:space="preserve">Preview Hospital does not treat a generator that is cranked but never takes essential-circuit load, a drawing that does not match the built floor, or a green-hospital poster with no measured initiative, as that duty.</w:t>
       </w:r>
     </w:p>
     <w:p>
@@ -851,7 +1039,7 @@
           <w:sz w:val="22"/>
           <w:szCs w:val="22"/>
         </w:rPr>
-        <w:t xml:space="preserve">The following are prohibited.</w:t>
+        <w:t xml:space="preserve">The following are prohibited. There is no operational exception and no "until the vendor comes" exception.</w:t>
       </w:r>
     </w:p>
     <w:p>
@@ -863,7 +1051,7 @@
           <w:sz w:val="22"/>
           <w:szCs w:val="22"/>
         </w:rPr>
-        <w:t xml:space="preserve">1. Occupying or using a clinical area whose essential water or electricity is known to have failed, unless a compensating provision is already in place and the Medical Superintendent has accepted the residual risk in writing until restoration.</w:t>
+        <w:t xml:space="preserve">1. Using a corridor as a ward, a sluice as a sterile store, or another hospital's floor plate for a service this hospital's directory does not provide.</w:t>
       </w:r>
     </w:p>
     <w:p>
@@ -875,7 +1063,7 @@
           <w:sz w:val="22"/>
           <w:szCs w:val="22"/>
         </w:rPr>
-        <w:t xml:space="preserve">2. Treating a no-load generator crank, a UPS that has not been discharge-tested, a seized tank outlet, or a tanker memorandum with no night number, as a functioning backup test.</w:t>
+        <w:t xml:space="preserve">2. Using a brochure floor plan, or a consultant drawing never marked as-built, as the occupancy set.</w:t>
       </w:r>
     </w:p>
     <w:p>
@@ -887,7 +1075,7 @@
           <w:sz w:val="22"/>
           <w:szCs w:val="22"/>
         </w:rPr>
-        <w:t xml:space="preserve">3. Using a brochure floor plan, or a consultant drawing never marked as-built, as the occupancy set.</w:t>
+        <w:t xml:space="preserve">3. Occupying a newly altered floor before the controlled as-built set has been updated for that change.</w:t>
       </w:r>
     </w:p>
     <w:p>
@@ -899,7 +1087,7 @@
           <w:sz w:val="22"/>
           <w:szCs w:val="22"/>
         </w:rPr>
-        <w:t xml:space="preserve">4. Shutting clinical ventilation, HVAC or essential circuits to show an energy saving.</w:t>
+        <w:t xml:space="preserve">4. Offering radiation, restricted-area, pregnancy-caution or PC-PNDT notices, or the fire-exit display, as the wayfinding system.</w:t>
       </w:r>
     </w:p>
     <w:p>
@@ -911,19 +1099,91 @@
           <w:sz w:val="22"/>
           <w:szCs w:val="22"/>
         </w:rPr>
-        <w:t xml:space="preserve">5. Offering radiation or PC-PNDT notices, or the fire-exit display, as the wayfinding system.</w:t>
-      </w:r>
-    </w:p>
-    <w:p>
-      <w:pPr>
-        <w:spacing w:after="140"/>
-      </w:pPr>
-      <w:r>
-        <w:rPr>
-          <w:sz w:val="22"/>
-          <w:szCs w:val="22"/>
-        </w:rPr>
-        <w:t xml:space="preserve">Anyone who sees a prohibited act stops it under the stop-work clause and reports it the same shift to the «Maintenance In-Charge» or, at night, the Night Duty Officer.</w:t>
+        <w:t xml:space="preserve">5. Treating a morning check as round-the-clock availability. A tap that should serve patients and a circuit that should serve care must be live at night and on a holiday.</w:t>
+      </w:r>
+    </w:p>
+    <w:p>
+      <w:pPr>
+        <w:spacing w:after="80"/>
+      </w:pPr>
+      <w:r>
+        <w:rPr>
+          <w:sz w:val="22"/>
+          <w:szCs w:val="22"/>
+        </w:rPr>
+        <w:t xml:space="preserve">6. Drawing drinking or clinical-wash water from a tap that failed its last quality test, or from a point labelled non-potable.</w:t>
+      </w:r>
+    </w:p>
+    <w:p>
+      <w:pPr>
+        <w:spacing w:after="80"/>
+      </w:pPr>
+      <w:r>
+        <w:rPr>
+          <w:sz w:val="22"/>
+          <w:szCs w:val="22"/>
+        </w:rPr>
+        <w:t xml:space="preserve">7. Treating a no-load generator crank, a UPS that has not been discharge-tested, a seized tank outlet, or a tanker memorandum with no night number, as a functioning backup test.</w:t>
+      </w:r>
+    </w:p>
+    <w:p>
+      <w:pPr>
+        <w:spacing w:after="80"/>
+      </w:pPr>
+      <w:r>
+        <w:rPr>
+          <w:sz w:val="22"/>
+          <w:szCs w:val="22"/>
+        </w:rPr>
+        <w:t xml:space="preserve">8. Signing a backup-test sheet for a generator that did not take the essential-circuit list, or for a water backup that did not move water to a point of use.</w:t>
+      </w:r>
+    </w:p>
+    <w:p>
+      <w:pPr>
+        <w:spacing w:after="80"/>
+      </w:pPr>
+      <w:r>
+        <w:rPr>
+          <w:sz w:val="22"/>
+          <w:szCs w:val="22"/>
+        </w:rPr>
+        <w:t xml:space="preserve">9. Shutting clinical ventilation, HVAC or essential circuits to show an energy saving.</w:t>
+      </w:r>
+    </w:p>
+    <w:p>
+      <w:pPr>
+        <w:spacing w:after="80"/>
+      </w:pPr>
+      <w:r>
+        <w:rPr>
+          <w:sz w:val="22"/>
+          <w:szCs w:val="22"/>
+        </w:rPr>
+        <w:t xml:space="preserve">10. Offering a green-hospital poster, a single LED retrofit as the whole programme, an unused rooftop array, an energy audit that produced no action, or a tree-planting photograph, as this year's initiative.</w:t>
+      </w:r>
+    </w:p>
+    <w:p>
+      <w:pPr>
+        <w:spacing w:after="80"/>
+      </w:pPr>
+      <w:r>
+        <w:rPr>
+          <w:sz w:val="22"/>
+          <w:szCs w:val="22"/>
+        </w:rPr>
+        <w:t xml:space="preserve">11. Rewriting biomedical-waste colours, transport or authorisation as an environment-friendly measure. That waste stream stays the infection-control waste programme.</w:t>
+      </w:r>
+    </w:p>
+    <w:p>
+      <w:pPr>
+        <w:spacing w:after="140"/>
+      </w:pPr>
+      <w:r>
+        <w:rPr>
+          <w:sz w:val="22"/>
+          <w:szCs w:val="22"/>
+        </w:rPr>
+        <w:t xml:space="preserve">A person who finds a dry clinical tap, a dark essential circuit, a drawing that does not match the floor, or a backup test being signed without load, reports it the same shift to the «Maintenance In-Charge». If that person is not on site, the report goes to the «named person on the after-hours facilities roster».</w:t>
       </w:r>
     </w:p>
     <w:p>
@@ -941,43 +1201,43 @@
         <w:spacing w:after="100" w:before="220"/>
       </w:pPr>
       <w:r>
-        <w:t xml:space="preserve">5.1 Space, drawings and wayfinding</w:t>
-      </w:r>
-    </w:p>
-    <w:p>
-      <w:pPr>
-        <w:spacing w:after="140"/>
-      </w:pPr>
-      <w:r>
-        <w:rPr>
-          <w:sz w:val="22"/>
-          <w:szCs w:val="22"/>
-        </w:rPr>
-        <w:t xml:space="preserve">The Maintenance In-Charge holds a dated record that the built space matches the service directory: waiting, clinical, diagnostic, utility, storage and staff rooms for every service actually offered. A mismatch is reported to the Medical Superintendent and is not papered over with another hospital's floor plate.</w:t>
-      </w:r>
-    </w:p>
-    <w:p>
-      <w:pPr>
-        <w:spacing w:after="140"/>
-      </w:pPr>
-      <w:r>
-        <w:rPr>
-          <w:sz w:val="22"/>
-          <w:szCs w:val="22"/>
-        </w:rPr>
-        <w:t xml:space="preserve">The same person holds the controlled as-built set and the update log. After a building change or a major service run, the set is updated before the floor is reoccupied. Fire sheets are the set the fire programme uses; medical-gas sheets, if piped, are the set the gas programme uses. This policy holds the master.</w:t>
-      </w:r>
-    </w:p>
-    <w:p>
-      <w:pPr>
-        <w:spacing w:after="140"/>
-      </w:pPr>
-      <w:r>
-        <w:rPr>
-          <w:sz w:val="22"/>
-          <w:szCs w:val="22"/>
-        </w:rPr>
-        <w:t xml:space="preserve">Wayfinding is inspected «monthly» for faded, contradictory or missing signs. A visitor who cannot read the majority language is still directed: «pictograms at entrance, registration, emergency, toilets and exit». Staff on induction walk the public route once before they work a night shift.</w:t>
+        <w:t xml:space="preserve">5.1 Match built space to the services we offer</w:t>
+      </w:r>
+    </w:p>
+    <w:p>
+      <w:pPr>
+        <w:spacing w:after="140"/>
+      </w:pPr>
+      <w:r>
+        <w:rPr>
+          <w:sz w:val="22"/>
+          <w:szCs w:val="22"/>
+        </w:rPr>
+        <w:t xml:space="preserve">The defined scope of services is the service directory. This section is the built match: waiting, clinical, diagnostic, utility, storage and staff spaces this hospital actually runs can physically hold those services.</w:t>
+      </w:r>
+    </w:p>
+    <w:p>
+      <w:pPr>
+        <w:spacing w:after="140"/>
+      </w:pPr>
+      <w:r>
+        <w:rPr>
+          <w:sz w:val="22"/>
+          <w:szCs w:val="22"/>
+        </w:rPr>
+        <w:t xml:space="preserve">How appropriateness is judged — against that directory and, as frameworks, Indian Public Health Standards 2022 and NBC 2016 occupancy as the local authority applied it — is held by the «Maintenance In-Charge» as a dated space-to-scope record. A mismatch is reported to the Medical Superintendent. A service the directory does not provide is a recorded absence, not a copied intensive-care floor plate.</w:t>
+      </w:r>
+    </w:p>
+    <w:p>
+      <w:pPr>
+        <w:spacing w:after="140"/>
+      </w:pPr>
+      <w:r>
+        <w:rPr>
+          <w:sz w:val="22"/>
+          <w:szCs w:val="22"/>
+        </w:rPr>
+        <w:t xml:space="preserve">When a service is added or withdrawn, the space record is updated before the service is offered or the room is re-used. Clinical heads confirm that the space still matches the services they actually run.</w:t>
       </w:r>
     </w:p>
     <w:p>
@@ -986,55 +1246,43 @@
         <w:spacing w:after="100" w:before="220"/>
       </w:pPr>
       <w:r>
-        <w:t xml:space="preserve">5.2 Round-the-clock water and electricity</w:t>
-      </w:r>
-    </w:p>
-    <w:p>
-      <w:pPr>
-        <w:spacing w:after="140"/>
-      </w:pPr>
-      <w:r>
-        <w:rPr>
-          <w:sz w:val="22"/>
-          <w:szCs w:val="22"/>
-        </w:rPr>
-        <w:t xml:space="preserve">Points of use for drinking, clinical wash, kitchen water as the food programme uses it, CSSD if present, and dialysis if present, deliver water when needed. A roof tank that is full on paper while the OT scrub is dry is a failure of this policy.</w:t>
-      </w:r>
-    </w:p>
-    <w:p>
-      <w:pPr>
-        <w:spacing w:after="140"/>
-      </w:pPr>
-      <w:r>
-        <w:rPr>
-          <w:sz w:val="22"/>
-          <w:szCs w:val="22"/>
-        </w:rPr>
-        <w:t xml:space="preserve">Essential circuits named in the policy standards stay energised. A live incoming meter with a dark theatre because changeover never closed is a failure of this policy.</w:t>
-      </w:r>
-    </w:p>
-    <w:p>
-      <w:pPr>
-        <w:spacing w:after="140"/>
-      </w:pPr>
-      <w:r>
-        <w:rPr>
-          <w:sz w:val="22"/>
-          <w:szCs w:val="22"/>
-        </w:rPr>
-        <w:t xml:space="preserve">The «Maintenance In-Charge» watches availability, including night and holiday, and records every interruption. Restoration is the same shift unless the Medical Superintendent has accepted a dated compensating arrangement. This policy does not invent a NABH minutes-to-restore clock.</w:t>
-      </w:r>
-    </w:p>
-    <w:p>
-      <w:pPr>
-        <w:spacing w:after="140"/>
-      </w:pPr>
-      <w:r>
-        <w:rPr>
-          <w:sz w:val="22"/>
-          <w:szCs w:val="22"/>
-        </w:rPr>
-        <w:t xml:space="preserve">Potable-water quality tests follow WHO GDWQ 4th edition at the points and interval that edition requires for this supply. Legionella control applies to aerosolising systems this hospital actually runs (cooling towers, decorative fountains, unused dead-legs) or is recorded as not applicable if none exist.</w:t>
+        <w:t xml:space="preserve">5.2 Hold the as-built drawings and update them</w:t>
+      </w:r>
+    </w:p>
+    <w:p>
+      <w:pPr>
+        <w:spacing w:after="140"/>
+      </w:pPr>
+      <w:r>
+        <w:rPr>
+          <w:sz w:val="22"/>
+          <w:szCs w:val="22"/>
+        </w:rPr>
+        <w:t xml:space="preserve">NBC 2016 is the Indian building-code framework the local building and fire authority typically uses for occupancy, means of egress and services drawings. This hospital holds the as-built set that occupancy and that authority actually required.</w:t>
+      </w:r>
+    </w:p>
+    <w:p>
+      <w:pPr>
+        <w:spacing w:after="140"/>
+      </w:pPr>
+      <w:r>
+        <w:rPr>
+          <w:sz w:val="22"/>
+          <w:szCs w:val="22"/>
+        </w:rPr>
+        <w:t xml:space="preserve">The controlled set includes, as this occupancy required: architectural; structural; electrical single-line; plumbing and water; fire and detection sheets the fire programme will use; and medical-gas sheets the gas programme will use if a piped system exists. Those other programmes use working copies. This policy holds the master.</w:t>
+      </w:r>
+    </w:p>
+    <w:p>
+      <w:pPr>
+        <w:spacing w:after="140"/>
+      </w:pPr>
+      <w:r>
+        <w:rPr>
+          <w:sz w:val="22"/>
+          <w:szCs w:val="22"/>
+        </w:rPr>
+        <w:t xml:space="preserve">The «Maintenance In-Charge» updates the set when the building or a major service run changes, before the altered floor is reoccupied. A brochure floor plan is not this set.</w:t>
       </w:r>
     </w:p>
     <w:p>
@@ -1043,43 +1291,43 @@
         <w:spacing w:after="100" w:before="220"/>
       </w:pPr>
       <w:r>
-        <w:t xml:space="preserve">5.3 Alternate sources — loaded tests</w:t>
-      </w:r>
-    </w:p>
-    <w:p>
-      <w:pPr>
-        <w:spacing w:after="140"/>
-      </w:pPr>
-      <w:r>
-        <w:rPr>
-          <w:sz w:val="22"/>
-          <w:szCs w:val="22"/>
-        </w:rPr>
-        <w:t xml:space="preserve">When incoming electricity fails or is shed, the diesel generator, UPS/inverter for circuits that cannot wait for a start (ventilators, monitors, lights over an open table), and automatic mains-failure changeover if installed, take the essential-circuit list. The test is a loaded run of that list, with the Maintenance In-Charge present so a changeover failure is seen before a night outage. Fuel, coolant and battery condition are recorded. Frequency: «monthly». A start-only test is not this test.</w:t>
-      </w:r>
-    </w:p>
-    <w:p>
-      <w:pPr>
-        <w:spacing w:after="140"/>
-      </w:pPr>
-      <w:r>
-        <w:rPr>
-          <w:sz w:val="22"/>
-          <w:szCs w:val="22"/>
-        </w:rPr>
-        <w:t xml:space="preserve">When municipal or borewell water fails or is short, reserve tanks with working float valves, a second borewell if this hospital has one, a tanker contract that can deliver at night, and pumps that auto-start, move water to the points of use. The test proves tank-to-tap movement or pump auto-start. Frequency: «monthly».</w:t>
-      </w:r>
-    </w:p>
-    <w:p>
-      <w:pPr>
-        <w:spacing w:after="140"/>
-      </w:pPr>
-      <w:r>
-        <w:rPr>
-          <w:sz w:val="22"/>
-          <w:szCs w:val="22"/>
-        </w:rPr>
-        <w:t xml:space="preserve">A utility failure that is declared an emergency is the fire-and-non-fire programme. This section is the test before that night.</w:t>
+        <w:t xml:space="preserve">5.3 Post internal and external wayfinding</w:t>
+      </w:r>
+    </w:p>
+    <w:p>
+      <w:pPr>
+        <w:spacing w:after="140"/>
+      </w:pPr>
+      <w:r>
+        <w:rPr>
+          <w:sz w:val="22"/>
+          <w:szCs w:val="22"/>
+        </w:rPr>
+        <w:t xml:space="preserve">Wayfinding is how a first-time family finds the entrance, registration, toilets, emergency, lifts, wards and the way out, in language they actually read. Languages and scripts on the public route are «Gujarati and English». A visitor who cannot read the majority language is still directed by «pictograms at entrance, registration, emergency, toilets and exit».</w:t>
+      </w:r>
+    </w:p>
+    <w:p>
+      <w:pPr>
+        <w:spacing w:after="140"/>
+      </w:pPr>
+      <w:r>
+        <w:rPr>
+          <w:sz w:val="22"/>
+          <w:szCs w:val="22"/>
+        </w:rPr>
+        <w:t xml:space="preserve">Radiation, restricted-area, pregnancy-caution and PC-PNDT notices are not this system. Fire-exit plans are the fire programme; they must not contradict these signs.</w:t>
+      </w:r>
+    </w:p>
+    <w:p>
+      <w:pPr>
+        <w:spacing w:after="140"/>
+      </w:pPr>
+      <w:r>
+        <w:rPr>
+          <w:sz w:val="22"/>
+          <w:szCs w:val="22"/>
+        </w:rPr>
+        <w:t xml:space="preserve">The «Maintenance In-Charge» inspects faded, contradictory or missing signs «monthly». Department in-charges do not cover a public sign with a clinical notice.</w:t>
       </w:r>
     </w:p>
     <w:p>
@@ -1088,43 +1336,181 @@
         <w:spacing w:after="100" w:before="220"/>
       </w:pPr>
       <w:r>
-        <w:t xml:space="preserve">5.4 Energy and environment initiatives</w:t>
-      </w:r>
-    </w:p>
-    <w:p>
-      <w:pPr>
-        <w:spacing w:after="140"/>
-      </w:pPr>
-      <w:r>
-        <w:rPr>
-          <w:sz w:val="22"/>
-          <w:szCs w:val="22"/>
-        </w:rPr>
-        <w:t xml:space="preserve">Each calendar year the Medical Superintendent names the initiatives in force, the owner, the baseline and the review date. Initiatives this hospital actually runs — measured electricity or fuel use, lighting or HVAC set-back in non-clinical hours, solar if installed, rainwater or condensate reuse if installed, reduction of single-use non-clinical materials — are recorded with a baseline and a result.</w:t>
-      </w:r>
-    </w:p>
-    <w:p>
-      <w:pPr>
-        <w:spacing w:after="140"/>
-      </w:pPr>
-      <w:r>
-        <w:rPr>
-          <w:sz w:val="22"/>
-          <w:szCs w:val="22"/>
-        </w:rPr>
-        <w:t xml:space="preserve">An unused rooftop array, an energy audit with no action, a single LED retrofit offered as the whole programme, or a tree-planting photograph, is not this year's initiative. Clinical ventilation is not reduced below what the services require.</w:t>
-      </w:r>
-    </w:p>
-    <w:p>
-      <w:pPr>
-        <w:spacing w:after="140"/>
-      </w:pPr>
-      <w:r>
-        <w:rPr>
-          <w:sz w:val="22"/>
-          <w:szCs w:val="22"/>
-        </w:rPr>
-        <w:t xml:space="preserve">Municipal waste is not mixed into the biomedical-waste stream. Colours, transport and authorisation stay the infection-control waste programme.</w:t>
+        <w:t xml:space="preserve">5.4 Keep potable water and electricity available round the clock</w:t>
+      </w:r>
+    </w:p>
+    <w:p>
+      <w:pPr>
+        <w:spacing w:after="140"/>
+      </w:pPr>
+      <w:r>
+        <w:rPr>
+          <w:sz w:val="22"/>
+          <w:szCs w:val="22"/>
+        </w:rPr>
+        <w:t xml:space="preserve">Availability is the duty: a tap that should serve patients and a circuit that should serve care are live at 03:00, not only at the morning check.</w:t>
+      </w:r>
+    </w:p>
+    <w:p>
+      <w:pPr>
+        <w:spacing w:after="140"/>
+      </w:pPr>
+      <w:r>
+        <w:rPr>
+          <w:sz w:val="22"/>
+          <w:szCs w:val="22"/>
+        </w:rPr>
+        <w:t xml:space="preserve">Potable water. Points of use this hospital has defined for drinking, clinical wash, kitchen (as the food programme uses water, not as this document rewriting that programme), CSSD if present, and dialysis if present, actually deliver water when needed. A roof tank that is full on paper while the operating-theatre scrub is dry because a valve is shut is a failure of this policy.</w:t>
+      </w:r>
+    </w:p>
+    <w:p>
+      <w:pPr>
+        <w:spacing w:after="140"/>
+      </w:pPr>
+      <w:r>
+        <w:rPr>
+          <w:sz w:val="22"/>
+          <w:szCs w:val="22"/>
+        </w:rPr>
+        <w:t xml:space="preserve">Quality testing is not a second NABH interval invented here. WHO Guidelines for Drinking-water Quality, 4th edition, is the framework for which parameters are tested, at which points, and how often. Local values: parameters «________»; sample points «________»; interval «as WHO GDWQ 4th edition requires for this supply». Dialysis water, if dialysis is in the service directory, uses Coulliette and Arduino as the haemodialysis-water framework; if dialysis is not provided, that is a recorded absence, not a copied reverse-osmosis SOP. Legionella control for aerosolising systems this hospital actually runs (cooling towers, decorative fountains, unused dead-legs) is «the written stagnant-water and Legionella control for systems this hospital actually runs», or a recorded absence if none of those systems exist.</w:t>
+      </w:r>
+    </w:p>
+    <w:p>
+      <w:pPr>
+        <w:spacing w:after="140"/>
+      </w:pPr>
+      <w:r>
+        <w:rPr>
+          <w:sz w:val="22"/>
+          <w:szCs w:val="22"/>
+        </w:rPr>
+        <w:t xml:space="preserve">Electricity. Essential clinical and life-safety circuits — at minimum the areas this hospital actually runs that cannot wait for restoration: emergency; operating theatre, labour, intensive or high-dependency care, nursery and blood bank if those services exist; ventilators and their compressors; emergency lighting; fire detection; and medical-gas plant or manifold alarms — remain energised. A live incoming meter with a dark theatre because a changeover never closed is a failure of this policy.</w:t>
+      </w:r>
+    </w:p>
+    <w:p>
+      <w:pPr>
+        <w:spacing w:after="140"/>
+      </w:pPr>
+      <w:r>
+        <w:rPr>
+          <w:sz w:val="22"/>
+          <w:szCs w:val="22"/>
+        </w:rPr>
+        <w:t xml:space="preserve">The «Maintenance In-Charge» watches availability, including night and holiday. An interruption is recorded the same shift. Restoration is the same shift unless the Medical Superintendent has accepted a dated compensating arrangement. This policy does not invent a NABH minutes-to-restore clock. After hours, the «named person on the after-hours facilities roster» is who a night nurse calls when a tap is dry or an essential circuit is dark.</w:t>
+      </w:r>
+    </w:p>
+    <w:p>
+      <w:pPr>
+        <w:pStyle w:val="Heading2"/>
+        <w:spacing w:after="100" w:before="220"/>
+      </w:pPr>
+      <w:r>
+        <w:t xml:space="preserve">5.5 Test backup electricity and water so they actually work</w:t>
+      </w:r>
+    </w:p>
+    <w:p>
+      <w:pPr>
+        <w:spacing w:after="140"/>
+      </w:pPr>
+      <w:r>
+        <w:rPr>
+          <w:sz w:val="22"/>
+          <w:szCs w:val="22"/>
+        </w:rPr>
+        <w:t xml:space="preserve">When incoming electricity fails or is shed, the backup that will carry the essential circuits named in 5.4 is: the diesel generator; UPS or inverter for circuits that cannot tolerate a start delay (ventilators, monitors, lights over an open table); and any automatic mains-failure changeover this hospital has installed. The failure this test exists to catch is a weekly no-load crank that proves the starter motor, not that the set will take theatre, intensive care and emergency lighting together, or a UPS whose batteries have not been discharge-tested. A start-only test is not a functioning test.</w:t>
+      </w:r>
+    </w:p>
+    <w:p>
+      <w:pPr>
+        <w:spacing w:after="140"/>
+      </w:pPr>
+      <w:r>
+        <w:rPr>
+          <w:sz w:val="22"/>
+          <w:szCs w:val="22"/>
+        </w:rPr>
+        <w:t xml:space="preserve">How the loaded test is done: essential-circuit load, not the workshop socket; the «Maintenance In-Charge» present so a changeover failure is seen before a night outage; fuel, coolant and battery condition recorded. Frequency: «monthly». IS 732 wiring practice and IS 3043 earthing inform how the installation should behave; they are NBC-pointed frameworks, not extra statutes in the disclaimer. Central Electricity Authority electrical-supply regulations are not a numbered FMS chapter reference and are not imported here.</w:t>
+      </w:r>
+    </w:p>
+    <w:p>
+      <w:pPr>
+        <w:spacing w:after="140"/>
+      </w:pPr>
+      <w:r>
+        <w:rPr>
+          <w:sz w:val="22"/>
+          <w:szCs w:val="22"/>
+        </w:rPr>
+        <w:t xml:space="preserve">When municipal or borewell water fails or is short, the backup that actually moves water to the points of use in 5.4 is: reserve tanks with working float valves; a second borewell if this hospital has one; a tanker contract that can deliver at night; and pumps that auto-start. A sealed tanker memorandum with no night number, or a tank whose outlet valve has seized, is not backup. The test proves tank-to-tap movement, pump auto-start, or tanker mobilisation. Frequency: «monthly».</w:t>
+      </w:r>
+    </w:p>
+    <w:p>
+      <w:pPr>
+        <w:spacing w:after="140"/>
+      </w:pPr>
+      <w:r>
+        <w:rPr>
+          <w:sz w:val="22"/>
+          <w:szCs w:val="22"/>
+        </w:rPr>
+        <w:t xml:space="preserve">A utility failure that is declared an emergency is handed to the fire-and-non-fire programme. This section is the test before that night.</w:t>
+      </w:r>
+    </w:p>
+    <w:p>
+      <w:pPr>
+        <w:pStyle w:val="Heading2"/>
+        <w:spacing w:after="100" w:before="220"/>
+      </w:pPr>
+      <w:r>
+        <w:t xml:space="preserve">5.6 Take this year's energy and environment initiatives</w:t>
+      </w:r>
+    </w:p>
+    <w:p>
+      <w:pPr>
+        <w:spacing w:after="140"/>
+      </w:pPr>
+      <w:r>
+        <w:rPr>
+          <w:sz w:val="22"/>
+          <w:szCs w:val="22"/>
+        </w:rPr>
+        <w:t xml:space="preserve">Round-the-clock availability and backup testing are 5.4 and 5.5. This section is that the organisation takes initiatives toward using less energy and harming the environment less, while still meeting those availability duties.</w:t>
+      </w:r>
+    </w:p>
+    <w:p>
+      <w:pPr>
+        <w:spacing w:after="140"/>
+      </w:pPr>
+      <w:r>
+        <w:rPr>
+          <w:sz w:val="22"/>
+          <w:szCs w:val="22"/>
+        </w:rPr>
+        <w:t xml:space="preserve">Dhillon, V. S. (2015), Green Hospital and Climate Change, is the chapter's green-hospital framework. It is not a mandate to hold a named green-building rating, not a pasted energy-audit form, and not authority to reduce clinical ventilation below what this hospital's services require.</w:t>
+      </w:r>
+    </w:p>
+    <w:p>
+      <w:pPr>
+        <w:spacing w:after="140"/>
+      </w:pPr>
+      <w:r>
+        <w:rPr>
+          <w:sz w:val="22"/>
+          <w:szCs w:val="22"/>
+        </w:rPr>
+        <w:t xml:space="preserve">Each calendar year the Medical Superintendent names the initiatives in force, the owner, the baseline and the review date. Initiatives this hospital actually runs — measured electricity or fuel use, lighting or HVAC set-back in non-clinical hours, solar if installed, rainwater or condensate reuse if installed, segregation of municipal waste from the biomedical stream, reduction of single-use non-clinical materials — are recorded with a baseline and a result.</w:t>
+      </w:r>
+    </w:p>
+    <w:p>
+      <w:pPr>
+        <w:spacing w:after="140"/>
+      </w:pPr>
+      <w:r>
+        <w:rPr>
+          <w:sz w:val="22"/>
+          <w:szCs w:val="22"/>
+        </w:rPr>
+        <w:t xml:space="preserve">An unused rooftop solar array, an energy audit that produced no action, a single LED retrofit offered as the whole programme, or a tree-planting photograph, is not this year's initiative. Clinical ventilation is not reduced below what the services require. Biomedical-waste colour, transport and authorisation stay the infection-control waste programme; environment-friendly hospital here is not a second waste SOP.</w:t>
       </w:r>
     </w:p>
     <w:p>
@@ -1145,19 +1531,99 @@
           <w:sz w:val="22"/>
           <w:szCs w:val="22"/>
         </w:rPr>
-        <w:t xml:space="preserve">Every person on the premises has the authority and the duty to stop an act that breaches a non-negotiable rule: occupying a dark essential circuit or a dry clinical tap without a compensating arrangement; passing a no-load crank as a backup test; shutting clinical ventilation for an energy figure; treating a brochure as the as-built set.</w:t>
-      </w:r>
-    </w:p>
-    <w:p>
-      <w:pPr>
-        <w:spacing w:after="140"/>
-      </w:pPr>
-      <w:r>
-        <w:rPr>
-          <w:sz w:val="22"/>
-          <w:szCs w:val="22"/>
-        </w:rPr>
-        <w:t xml:space="preserve">The person says "stop", makes the immediate safe condition they are competent to make, and reports the same shift to the «Maintenance In-Charge» or the Night Duty Officer. There is no retaliation for a good-faith stop-work. A vendor who refuses to stop is required to leave the area.</w:t>
+        <w:t xml:space="preserve">A person who is about to do any of the following does not proceed:</w:t>
+      </w:r>
+    </w:p>
+    <w:p>
+      <w:pPr>
+        <w:pStyle w:val="ListParagraph"/>
+        <w:numPr>
+          <w:ilvl w:val="0"/>
+          <w:numId w:val="1"/>
+        </w:numPr>
+        <w:spacing w:after="60"/>
+      </w:pPr>
+      <w:r>
+        <w:rPr>
+          <w:sz w:val="22"/>
+          <w:szCs w:val="22"/>
+        </w:rPr>
+        <w:t xml:space="preserve">draw drinking or clinical-wash water from a tap that failed its last quality test, or from a point labelled non-potable;</w:t>
+      </w:r>
+    </w:p>
+    <w:p>
+      <w:pPr>
+        <w:pStyle w:val="ListParagraph"/>
+        <w:numPr>
+          <w:ilvl w:val="0"/>
+          <w:numId w:val="1"/>
+        </w:numPr>
+        <w:spacing w:after="60"/>
+      </w:pPr>
+      <w:r>
+        <w:rPr>
+          <w:sz w:val="22"/>
+          <w:szCs w:val="22"/>
+        </w:rPr>
+        <w:t xml:space="preserve">occupy or continue a procedure in a clinical room whose essential circuit is known dark, unless a compensating UPS or generator supply is already carrying that circuit;</w:t>
+      </w:r>
+    </w:p>
+    <w:p>
+      <w:pPr>
+        <w:pStyle w:val="ListParagraph"/>
+        <w:numPr>
+          <w:ilvl w:val="0"/>
+          <w:numId w:val="1"/>
+        </w:numPr>
+        <w:spacing w:after="60"/>
+      </w:pPr>
+      <w:r>
+        <w:rPr>
+          <w:sz w:val="22"/>
+          <w:szCs w:val="22"/>
+        </w:rPr>
+        <w:t xml:space="preserve">sign a backup-test sheet for a generator that did not take the essential-circuit list, or for a water backup that did not move water to a point of use;</w:t>
+      </w:r>
+    </w:p>
+    <w:p>
+      <w:pPr>
+        <w:pStyle w:val="ListParagraph"/>
+        <w:numPr>
+          <w:ilvl w:val="0"/>
+          <w:numId w:val="1"/>
+        </w:numPr>
+        <w:spacing w:after="60"/>
+      </w:pPr>
+      <w:r>
+        <w:rPr>
+          <w:sz w:val="22"/>
+          <w:szCs w:val="22"/>
+        </w:rPr>
+        <w:t xml:space="preserve">shut clinical ventilation or an essential circuit to produce an energy figure.</w:t>
+      </w:r>
+    </w:p>
+    <w:p>
+      <w:pPr>
+        <w:spacing w:after="140"/>
+      </w:pPr>
+      <w:r>
+        <w:rPr>
+          <w:sz w:val="22"/>
+          <w:szCs w:val="22"/>
+        </w:rPr>
+        <w:t xml:space="preserve">They isolate the tap or room if they are competent to, leave the test unsigned, and tell the «Maintenance In-Charge» the same shift — or, if that person is not on site, the «named person on the after-hours facilities roster».</w:t>
+      </w:r>
+    </w:p>
+    <w:p>
+      <w:pPr>
+        <w:spacing w:after="140"/>
+      </w:pPr>
+      <w:r>
+        <w:rPr>
+          <w:sz w:val="22"/>
+          <w:szCs w:val="22"/>
+        </w:rPr>
+        <w:t xml:space="preserve">A good-faith refusal to sign a test that did not take load is not a disciplinary matter. The test is not recorded as passed until a loaded run has been seen.</w:t>
       </w:r>
     </w:p>
     <w:p>
@@ -1178,41 +1644,41 @@
           <w:sz w:val="22"/>
           <w:szCs w:val="22"/>
         </w:rPr>
-        <w:t xml:space="preserve">Roles below are titles, not vacancies. If one person holds two titles in a small hospital, both duties still apply.</w:t>
-      </w:r>
-    </w:p>
-    <w:p>
-      <w:pPr>
-        <w:pStyle w:val="ListParagraph"/>
-        <w:numPr>
-          <w:ilvl w:val="0"/>
-          <w:numId w:val="1"/>
-        </w:numPr>
-        <w:spacing w:after="60"/>
-      </w:pPr>
-      <w:r>
-        <w:rPr>
-          <w:sz w:val="22"/>
-          <w:szCs w:val="22"/>
-        </w:rPr>
-        <w:t xml:space="preserve">Medical Superintendent (Head of the Institution)</w:t>
-      </w:r>
-    </w:p>
-    <w:p>
-      <w:pPr>
-        <w:pStyle w:val="ListParagraph"/>
-        <w:numPr>
-          <w:ilvl w:val="0"/>
-          <w:numId w:val="1"/>
-        </w:numPr>
-        <w:spacing w:after="60"/>
-      </w:pPr>
-      <w:r>
-        <w:rPr>
-          <w:sz w:val="22"/>
-          <w:szCs w:val="22"/>
-        </w:rPr>
-        <w:t xml:space="preserve">Accountable that this policy is issued, resourced and followed.</w:t>
+        <w:t xml:space="preserve">These are the jobs this utilities policy needs. In a small hospital one person may also hold the biomedical or gas-plant lead; they still keep this file as the facilities file, not as a combined fire-and-utilities binder.</w:t>
+      </w:r>
+    </w:p>
+    <w:p>
+      <w:pPr>
+        <w:pStyle w:val="ListParagraph"/>
+        <w:numPr>
+          <w:ilvl w:val="0"/>
+          <w:numId w:val="1"/>
+        </w:numPr>
+        <w:spacing w:after="60"/>
+      </w:pPr>
+      <w:r>
+        <w:rPr>
+          <w:sz w:val="22"/>
+          <w:szCs w:val="22"/>
+        </w:rPr>
+        <w:t xml:space="preserve">Medical Superintendent (head of the institution)</w:t>
+      </w:r>
+    </w:p>
+    <w:p>
+      <w:pPr>
+        <w:pStyle w:val="ListParagraph"/>
+        <w:numPr>
+          <w:ilvl w:val="0"/>
+          <w:numId w:val="1"/>
+        </w:numPr>
+        <w:spacing w:after="60"/>
+      </w:pPr>
+      <w:r>
+        <w:rPr>
+          <w:sz w:val="22"/>
+          <w:szCs w:val="22"/>
+        </w:rPr>
+        <w:t xml:space="preserve">Accountable that facilities operate as this policy requires.</w:t>
       </w:r>
     </w:p>
     <w:p>
@@ -1246,160 +1712,143 @@
           <w:sz w:val="22"/>
           <w:szCs w:val="22"/>
         </w:rPr>
-        <w:t xml:space="preserve">Names this year's energy and environment initiatives.</w:t>
-      </w:r>
-    </w:p>
-    <w:p>
-      <w:pPr>
-        <w:pStyle w:val="ListParagraph"/>
-        <w:numPr>
-          <w:ilvl w:val="0"/>
-          <w:numId w:val="1"/>
-        </w:numPr>
-        <w:spacing w:after="60"/>
-      </w:pPr>
-      <w:r>
-        <w:rPr>
-          <w:sz w:val="22"/>
-          <w:szCs w:val="22"/>
-        </w:rPr>
-        <w:t xml:space="preserve">Maintenance In-Charge</w:t>
-      </w:r>
-    </w:p>
-    <w:p>
-      <w:pPr>
-        <w:pStyle w:val="ListParagraph"/>
-        <w:numPr>
-          <w:ilvl w:val="0"/>
-          <w:numId w:val="1"/>
-        </w:numPr>
-        <w:spacing w:after="60"/>
-      </w:pPr>
-      <w:r>
-        <w:rPr>
-          <w:sz w:val="22"/>
-          <w:szCs w:val="22"/>
-        </w:rPr>
-        <w:t xml:space="preserve">Owns space-to-scope record, controlled drawings, wayfinding inspection, availability watch, loaded backup tests, and the energy-initiative file.</w:t>
-      </w:r>
-    </w:p>
-    <w:p>
-      <w:pPr>
-        <w:pStyle w:val="ListParagraph"/>
-        <w:numPr>
-          <w:ilvl w:val="0"/>
-          <w:numId w:val="1"/>
-        </w:numPr>
-        <w:spacing w:after="60"/>
-      </w:pPr>
-      <w:r>
-        <w:rPr>
-          <w:sz w:val="22"/>
-          <w:szCs w:val="22"/>
-        </w:rPr>
-        <w:t xml:space="preserve">Holds NBC-as-applied occupancy drawings.</w:t>
-      </w:r>
-    </w:p>
-    <w:p>
-      <w:pPr>
-        <w:pStyle w:val="ListParagraph"/>
-        <w:numPr>
-          <w:ilvl w:val="0"/>
-          <w:numId w:val="1"/>
-        </w:numPr>
-        <w:spacing w:after="60"/>
-      </w:pPr>
-      <w:r>
-        <w:rPr>
-          <w:sz w:val="22"/>
-          <w:szCs w:val="22"/>
-        </w:rPr>
-        <w:t xml:space="preserve">Nursing Superintendent</w:t>
-      </w:r>
-    </w:p>
-    <w:p>
-      <w:pPr>
-        <w:pStyle w:val="ListParagraph"/>
-        <w:numPr>
-          <w:ilvl w:val="0"/>
-          <w:numId w:val="1"/>
-        </w:numPr>
-        <w:spacing w:after="60"/>
-      </w:pPr>
-      <w:r>
-        <w:rPr>
-          <w:sz w:val="22"/>
-          <w:szCs w:val="22"/>
-        </w:rPr>
-        <w:t xml:space="preserve">Confirms clinical space still matches the services nursing actually runs.</w:t>
-      </w:r>
-    </w:p>
-    <w:p>
-      <w:pPr>
-        <w:pStyle w:val="ListParagraph"/>
-        <w:numPr>
-          <w:ilvl w:val="0"/>
-          <w:numId w:val="1"/>
-        </w:numPr>
-        <w:spacing w:after="60"/>
-      </w:pPr>
-      <w:r>
-        <w:rPr>
-          <w:sz w:val="22"/>
-          <w:szCs w:val="22"/>
-        </w:rPr>
-        <w:t xml:space="preserve">Ensures wayfinding is not covered by clinical notices.</w:t>
-      </w:r>
-    </w:p>
-    <w:p>
-      <w:pPr>
-        <w:pStyle w:val="ListParagraph"/>
-        <w:numPr>
-          <w:ilvl w:val="0"/>
-          <w:numId w:val="1"/>
-        </w:numPr>
-        <w:spacing w:after="60"/>
-      </w:pPr>
-      <w:r>
-        <w:rPr>
-          <w:sz w:val="22"/>
-          <w:szCs w:val="22"/>
-        </w:rPr>
-        <w:t xml:space="preserve">Night Duty Officer</w:t>
-      </w:r>
-    </w:p>
-    <w:p>
-      <w:pPr>
-        <w:pStyle w:val="ListParagraph"/>
-        <w:numPr>
-          <w:ilvl w:val="0"/>
-          <w:numId w:val="1"/>
-        </w:numPr>
-        <w:spacing w:after="60"/>
-      </w:pPr>
-      <w:r>
-        <w:rPr>
-          <w:sz w:val="22"/>
-          <w:szCs w:val="22"/>
-        </w:rPr>
-        <w:t xml:space="preserve">Holds the Medical Superintendent's utility-failure authority between «20:00 and 08:00».</w:t>
-      </w:r>
-    </w:p>
-    <w:p>
-      <w:pPr>
-        <w:pStyle w:val="ListParagraph"/>
-        <w:numPr>
-          <w:ilvl w:val="0"/>
-          <w:numId w:val="1"/>
-        </w:numPr>
-        <w:spacing w:after="60"/>
-      </w:pPr>
-      <w:r>
-        <w:rPr>
-          <w:sz w:val="22"/>
-          <w:szCs w:val="22"/>
-        </w:rPr>
-        <w:t xml:space="preserve">Records a night interruption and does not treat a dark essential circuit as "until morning."</w:t>
+        <w:t xml:space="preserve">Names this year's energy and environment initiatives and the owner of each.</w:t>
+      </w:r>
+    </w:p>
+    <w:p>
+      <w:pPr>
+        <w:pStyle w:val="ListParagraph"/>
+        <w:numPr>
+          <w:ilvl w:val="0"/>
+          <w:numId w:val="1"/>
+        </w:numPr>
+        <w:spacing w:after="60"/>
+      </w:pPr>
+      <w:r>
+        <w:rPr>
+          <w:sz w:val="22"/>
+          <w:szCs w:val="22"/>
+        </w:rPr>
+        <w:t xml:space="preserve">«Maintenance In-Charge» (named facilities or engineering lead)</w:t>
+      </w:r>
+    </w:p>
+    <w:p>
+      <w:pPr>
+        <w:pStyle w:val="ListParagraph"/>
+        <w:numPr>
+          <w:ilvl w:val="0"/>
+          <w:numId w:val="1"/>
+        </w:numPr>
+        <w:spacing w:after="60"/>
+      </w:pPr>
+      <w:r>
+        <w:rPr>
+          <w:sz w:val="22"/>
+          <w:szCs w:val="22"/>
+        </w:rPr>
+        <w:t xml:space="preserve">Holds the space-to-scope record, the controlled as-built set and update log, wayfinding inspection, availability watch, loaded backup tests, and the energy-initiative file.</w:t>
+      </w:r>
+    </w:p>
+    <w:p>
+      <w:pPr>
+        <w:pStyle w:val="ListParagraph"/>
+        <w:numPr>
+          <w:ilvl w:val="0"/>
+          <w:numId w:val="1"/>
+        </w:numPr>
+        <w:spacing w:after="60"/>
+      </w:pPr>
+      <w:r>
+        <w:rPr>
+          <w:sz w:val="22"/>
+          <w:szCs w:val="22"/>
+        </w:rPr>
+        <w:t xml:space="preserve">Runs the loaded electricity test and the water-movement test.</w:t>
+      </w:r>
+    </w:p>
+    <w:p>
+      <w:pPr>
+        <w:pStyle w:val="ListParagraph"/>
+        <w:numPr>
+          <w:ilvl w:val="0"/>
+          <w:numId w:val="1"/>
+        </w:numPr>
+        <w:spacing w:after="60"/>
+      </w:pPr>
+      <w:r>
+        <w:rPr>
+          <w:sz w:val="22"/>
+          <w:szCs w:val="22"/>
+        </w:rPr>
+        <w:t xml:space="preserve">Names the «named person on the after-hours facilities roster» who takes a dry-tap or dark-circuit call when the Maintenance In-Charge is not on site.</w:t>
+      </w:r>
+    </w:p>
+    <w:p>
+      <w:pPr>
+        <w:pStyle w:val="ListParagraph"/>
+        <w:numPr>
+          <w:ilvl w:val="0"/>
+          <w:numId w:val="1"/>
+        </w:numPr>
+        <w:spacing w:after="60"/>
+      </w:pPr>
+      <w:r>
+        <w:rPr>
+          <w:sz w:val="22"/>
+          <w:szCs w:val="22"/>
+        </w:rPr>
+        <w:t xml:space="preserve">Clinical heads / department in-charges</w:t>
+      </w:r>
+    </w:p>
+    <w:p>
+      <w:pPr>
+        <w:pStyle w:val="ListParagraph"/>
+        <w:numPr>
+          <w:ilvl w:val="0"/>
+          <w:numId w:val="1"/>
+        </w:numPr>
+        <w:spacing w:after="60"/>
+      </w:pPr>
+      <w:r>
+        <w:rPr>
+          <w:sz w:val="22"/>
+          <w:szCs w:val="22"/>
+        </w:rPr>
+        <w:t xml:space="preserve">Confirm that space still matches the services they actually run.</w:t>
+      </w:r>
+    </w:p>
+    <w:p>
+      <w:pPr>
+        <w:pStyle w:val="ListParagraph"/>
+        <w:numPr>
+          <w:ilvl w:val="0"/>
+          <w:numId w:val="1"/>
+        </w:numPr>
+        <w:spacing w:after="60"/>
+      </w:pPr>
+      <w:r>
+        <w:rPr>
+          <w:sz w:val="22"/>
+          <w:szCs w:val="22"/>
+        </w:rPr>
+        <w:t xml:space="preserve">Report a mismatch when a service is added or withdrawn.</w:t>
+      </w:r>
+    </w:p>
+    <w:p>
+      <w:pPr>
+        <w:pStyle w:val="ListParagraph"/>
+        <w:numPr>
+          <w:ilvl w:val="0"/>
+          <w:numId w:val="1"/>
+        </w:numPr>
+        <w:spacing w:after="60"/>
+      </w:pPr>
+      <w:r>
+        <w:rPr>
+          <w:sz w:val="22"/>
+          <w:szCs w:val="22"/>
+        </w:rPr>
+        <w:t xml:space="preserve">Do not cover public wayfinding with a clinical notice.</w:t>
       </w:r>
     </w:p>
     <w:p>
@@ -1433,51 +1882,97 @@
           <w:sz w:val="22"/>
           <w:szCs w:val="22"/>
         </w:rPr>
-        <w:t xml:space="preserve">Audits this policy «quarterly» (see monitoring).</w:t>
-      </w:r>
-    </w:p>
-    <w:p>
-      <w:pPr>
-        <w:pStyle w:val="ListParagraph"/>
-        <w:numPr>
-          <w:ilvl w:val="0"/>
-          <w:numId w:val="1"/>
-        </w:numPr>
-        <w:spacing w:after="60"/>
-      </w:pPr>
-      <w:r>
-        <w:rPr>
-          <w:sz w:val="22"/>
-          <w:szCs w:val="22"/>
-        </w:rPr>
-        <w:t xml:space="preserve">Department in-charges</w:t>
-      </w:r>
-    </w:p>
-    <w:p>
-      <w:pPr>
-        <w:pStyle w:val="ListParagraph"/>
-        <w:numPr>
-          <w:ilvl w:val="0"/>
-          <w:numId w:val="1"/>
-        </w:numPr>
-        <w:spacing w:after="60"/>
-      </w:pPr>
-      <w:r>
-        <w:rPr>
-          <w:sz w:val="22"/>
-          <w:szCs w:val="22"/>
-        </w:rPr>
-        <w:t xml:space="preserve">Report a space mismatch when a service is added or withdrawn.</w:t>
-      </w:r>
-    </w:p>
-    <w:p>
-      <w:pPr>
-        <w:pStyle w:val="ListParagraph"/>
-        <w:numPr>
-          <w:ilvl w:val="0"/>
-          <w:numId w:val="1"/>
-        </w:numPr>
-        <w:spacing w:after="60"/>
+        <w:t xml:space="preserve">Audits the records in section 8.</w:t>
+      </w:r>
+    </w:p>
+    <w:p>
+      <w:pPr>
+        <w:pStyle w:val="ListParagraph"/>
+        <w:numPr>
+          <w:ilvl w:val="0"/>
+          <w:numId w:val="1"/>
+        </w:numPr>
+        <w:spacing w:after="60"/>
+      </w:pPr>
+      <w:r>
+        <w:rPr>
+          <w:sz w:val="22"/>
+          <w:szCs w:val="22"/>
+        </w:rPr>
+        <w:t xml:space="preserve">Staff who operate plant</w:t>
+      </w:r>
+    </w:p>
+    <w:p>
+      <w:pPr>
+        <w:pStyle w:val="ListParagraph"/>
+        <w:numPr>
+          <w:ilvl w:val="0"/>
+          <w:numId w:val="1"/>
+        </w:numPr>
+        <w:spacing w:after="60"/>
+      </w:pPr>
+      <w:r>
+        <w:rPr>
+          <w:sz w:val="22"/>
+          <w:szCs w:val="22"/>
+        </w:rPr>
+        <w:t xml:space="preserve">Named on the trained-operator list before they start the generator or operate changeover.</w:t>
+      </w:r>
+    </w:p>
+    <w:p>
+      <w:pPr>
+        <w:pStyle w:val="ListParagraph"/>
+        <w:numPr>
+          <w:ilvl w:val="0"/>
+          <w:numId w:val="1"/>
+        </w:numPr>
+        <w:spacing w:after="60"/>
+      </w:pPr>
+      <w:r>
+        <w:rPr>
+          <w:sz w:val="22"/>
+          <w:szCs w:val="22"/>
+        </w:rPr>
+        <w:t xml:space="preserve">Do not sign a test they did not see take load.</w:t>
+      </w:r>
+    </w:p>
+    <w:p>
+      <w:pPr>
+        <w:pStyle w:val="ListParagraph"/>
+        <w:numPr>
+          <w:ilvl w:val="0"/>
+          <w:numId w:val="1"/>
+        </w:numPr>
+        <w:spacing w:after="60"/>
+      </w:pPr>
+      <w:r>
+        <w:rPr>
+          <w:sz w:val="22"/>
+          <w:szCs w:val="22"/>
+        </w:rPr>
+        <w:t xml:space="preserve">All staff</w:t>
+      </w:r>
+    </w:p>
+    <w:p>
+      <w:pPr>
+        <w:pStyle w:val="ListParagraph"/>
+        <w:numPr>
+          <w:ilvl w:val="0"/>
+          <w:numId w:val="1"/>
+        </w:numPr>
+        <w:spacing w:after="60"/>
+      </w:pPr>
+      <w:r>
+        <w:rPr>
+          <w:sz w:val="22"/>
+          <w:szCs w:val="22"/>
+        </w:rPr>
+        <w:t xml:space="preserve">Report a dark essential circuit, a dry clinical tap, a drawing that does not match the floor, or a green poster with no initiative.</w:t>
+      </w:r>
+    </w:p>
+    <w:p>
+      <w:pPr>
+        <w:spacing w:after="140"/>
       </w:pPr>
       <w:r>
         <w:rPr>
@@ -1501,7 +1996,7 @@
           <w:sz w:val="22"/>
           <w:szCs w:val="22"/>
         </w:rPr>
-        <w:t xml:space="preserve">Space match: Maintenance In-Charge (R); Medical Superintendent (A)</w:t>
+        <w:t xml:space="preserve">Space match: Maintenance In-Charge (R); Medical Superintendent (A); clinical heads (C)</w:t>
       </w:r>
     </w:p>
     <w:p>
@@ -1535,41 +2030,41 @@
           <w:sz w:val="22"/>
           <w:szCs w:val="22"/>
         </w:rPr>
-        <w:t xml:space="preserve">Wayfinding: Maintenance In-Charge (R); Nursing Superintendent (A for notices)</w:t>
-      </w:r>
-    </w:p>
-    <w:p>
-      <w:pPr>
-        <w:pStyle w:val="ListParagraph"/>
-        <w:numPr>
-          <w:ilvl w:val="0"/>
-          <w:numId w:val="1"/>
-        </w:numPr>
-        <w:spacing w:after="60"/>
-      </w:pPr>
-      <w:r>
-        <w:rPr>
-          <w:sz w:val="22"/>
-          <w:szCs w:val="22"/>
-        </w:rPr>
-        <w:t xml:space="preserve">Availability: Maintenance In-Charge (R); Night Duty Officer (A at night)</w:t>
-      </w:r>
-    </w:p>
-    <w:p>
-      <w:pPr>
-        <w:pStyle w:val="ListParagraph"/>
-        <w:numPr>
-          <w:ilvl w:val="0"/>
-          <w:numId w:val="1"/>
-        </w:numPr>
-        <w:spacing w:after="60"/>
-      </w:pPr>
-      <w:r>
-        <w:rPr>
-          <w:sz w:val="22"/>
-          <w:szCs w:val="22"/>
-        </w:rPr>
-        <w:t xml:space="preserve">Loaded tests: Maintenance In-Charge (R/A)</w:t>
+        <w:t xml:space="preserve">Wayfinding: Maintenance In-Charge (R/A)</w:t>
+      </w:r>
+    </w:p>
+    <w:p>
+      <w:pPr>
+        <w:pStyle w:val="ListParagraph"/>
+        <w:numPr>
+          <w:ilvl w:val="0"/>
+          <w:numId w:val="1"/>
+        </w:numPr>
+        <w:spacing w:after="60"/>
+      </w:pPr>
+      <w:r>
+        <w:rPr>
+          <w:sz w:val="22"/>
+          <w:szCs w:val="22"/>
+        </w:rPr>
+        <w:t xml:space="preserve">Availability watch: Maintenance In-Charge (R); after-hours facilities roster (R when the lead is off site); Medical Superintendent (A)</w:t>
+      </w:r>
+    </w:p>
+    <w:p>
+      <w:pPr>
+        <w:pStyle w:val="ListParagraph"/>
+        <w:numPr>
+          <w:ilvl w:val="0"/>
+          <w:numId w:val="1"/>
+        </w:numPr>
+        <w:spacing w:after="60"/>
+      </w:pPr>
+      <w:r>
+        <w:rPr>
+          <w:sz w:val="22"/>
+          <w:szCs w:val="22"/>
+        </w:rPr>
+        <w:t xml:space="preserve">Loaded backup tests: Maintenance In-Charge (R/A)</w:t>
       </w:r>
     </w:p>
     <w:p>
@@ -1603,7 +2098,7 @@
           <w:sz w:val="22"/>
           <w:szCs w:val="22"/>
         </w:rPr>
-        <w:t xml:space="preserve">Stop-work: all staff (R); Maintenance In-Charge (A for restart)</w:t>
+        <w:t xml:space="preserve">Audit: Quality Coordinator (R); Medical Superintendent (A)</w:t>
       </w:r>
     </w:p>
     <w:p>
@@ -1629,12 +2124,7 @@
     </w:p>
     <w:p>
       <w:pPr>
-        <w:pStyle w:val="ListParagraph"/>
-        <w:numPr>
-          <w:ilvl w:val="0"/>
-          <w:numId w:val="1"/>
-        </w:numPr>
-        <w:spacing w:after="60"/>
+        <w:spacing w:after="140"/>
       </w:pPr>
       <w:r>
         <w:rPr>
@@ -1658,133 +2148,162 @@
           <w:sz w:val="22"/>
           <w:szCs w:val="22"/>
         </w:rPr>
-        <w:t xml:space="preserve">Space still matches the service directory; unused services are recorded as not offered.</w:t>
-      </w:r>
-    </w:p>
-    <w:p>
-      <w:pPr>
-        <w:pStyle w:val="ListParagraph"/>
-        <w:numPr>
-          <w:ilvl w:val="0"/>
-          <w:numId w:val="1"/>
-        </w:numPr>
-        <w:spacing w:after="60"/>
-      </w:pPr>
-      <w:r>
-        <w:rPr>
-          <w:sz w:val="22"/>
-          <w:szCs w:val="22"/>
-        </w:rPr>
-        <w:t xml:space="preserve">As-built set matches the floor; last update is dated.</w:t>
-      </w:r>
-    </w:p>
-    <w:p>
-      <w:pPr>
-        <w:pStyle w:val="ListParagraph"/>
-        <w:numPr>
-          <w:ilvl w:val="0"/>
-          <w:numId w:val="1"/>
-        </w:numPr>
-        <w:spacing w:after="60"/>
-      </w:pPr>
-      <w:r>
-        <w:rPr>
-          <w:sz w:val="22"/>
-          <w:szCs w:val="22"/>
-        </w:rPr>
-        <w:t xml:space="preserve">Wayfinding still directs a first-time family; it is not a radiation notice.</w:t>
-      </w:r>
-    </w:p>
-    <w:p>
-      <w:pPr>
-        <w:pStyle w:val="ListParagraph"/>
-        <w:numPr>
-          <w:ilvl w:val="0"/>
-          <w:numId w:val="1"/>
-        </w:numPr>
-        <w:spacing w:after="60"/>
-      </w:pPr>
-      <w:r>
-        <w:rPr>
-          <w:sz w:val="22"/>
-          <w:szCs w:val="22"/>
-        </w:rPr>
-        <w:t xml:space="preserve">Availability records cover night and holiday.</w:t>
-      </w:r>
-    </w:p>
-    <w:p>
-      <w:pPr>
-        <w:pStyle w:val="ListParagraph"/>
-        <w:numPr>
-          <w:ilvl w:val="0"/>
-          <w:numId w:val="1"/>
-        </w:numPr>
-        <w:spacing w:after="60"/>
-      </w:pPr>
-      <w:r>
-        <w:rPr>
-          <w:sz w:val="22"/>
-          <w:szCs w:val="22"/>
-        </w:rPr>
-        <w:t xml:space="preserve">Last loaded electricity test took the essential-circuit list; last water test moved water to a point of use.</w:t>
-      </w:r>
-    </w:p>
-    <w:p>
-      <w:pPr>
-        <w:pStyle w:val="ListParagraph"/>
-        <w:numPr>
-          <w:ilvl w:val="0"/>
-          <w:numId w:val="1"/>
-        </w:numPr>
-        <w:spacing w:after="60"/>
-      </w:pPr>
-      <w:r>
-        <w:rPr>
-          <w:sz w:val="22"/>
-          <w:szCs w:val="22"/>
-        </w:rPr>
-        <w:t xml:space="preserve">This year's energy file has a baseline and a result, not a poster.</w:t>
-      </w:r>
-    </w:p>
-    <w:p>
-      <w:pPr>
-        <w:pStyle w:val="ListParagraph"/>
-        <w:numPr>
-          <w:ilvl w:val="0"/>
-          <w:numId w:val="1"/>
-        </w:numPr>
-        <w:spacing w:after="60"/>
-      </w:pPr>
-      <w:r>
-        <w:rPr>
-          <w:sz w:val="22"/>
-          <w:szCs w:val="22"/>
-        </w:rPr>
-        <w:t xml:space="preserve">Dialysis-water method exists only if dialysis is offered.</w:t>
-      </w:r>
-    </w:p>
-    <w:p>
-      <w:pPr>
-        <w:spacing w:after="140"/>
-      </w:pPr>
-      <w:r>
-        <w:rPr>
-          <w:sz w:val="22"/>
-          <w:szCs w:val="22"/>
-        </w:rPr>
-        <w:t xml:space="preserve">Root-cause analysis is required when: a backup test fails under load; an essential circuit is found dark after hours; a drawing does not match the floor; or an energy action cut clinical ventilation. CAPA is dated, has an owner, and is checked at the next quarterly audit. An open CAPA older than «thirty days» is escalated to the Medical Superintendent.</w:t>
-      </w:r>
-    </w:p>
-    <w:p>
-      <w:pPr>
-        <w:spacing w:after="140"/>
-      </w:pPr>
-      <w:r>
-        <w:rPr>
-          <w:sz w:val="22"/>
-          <w:szCs w:val="22"/>
-        </w:rPr>
-        <w:t xml:space="preserve">This policy is reviewed «annually», and sooner after a failed loaded test or a change to the service directory.</w:t>
+        <w:t xml:space="preserve">Space still matches the service directory; unused services are recorded as not offered, not given another hospital's floor plate.</w:t>
+      </w:r>
+    </w:p>
+    <w:p>
+      <w:pPr>
+        <w:pStyle w:val="ListParagraph"/>
+        <w:numPr>
+          <w:ilvl w:val="0"/>
+          <w:numId w:val="1"/>
+        </w:numPr>
+        <w:spacing w:after="60"/>
+      </w:pPr>
+      <w:r>
+        <w:rPr>
+          <w:sz w:val="22"/>
+          <w:szCs w:val="22"/>
+        </w:rPr>
+        <w:t xml:space="preserve">As-built set matches the built hospital and the occupancy the authority actually required; last update is dated.</w:t>
+      </w:r>
+    </w:p>
+    <w:p>
+      <w:pPr>
+        <w:pStyle w:val="ListParagraph"/>
+        <w:numPr>
+          <w:ilvl w:val="0"/>
+          <w:numId w:val="1"/>
+        </w:numPr>
+        <w:spacing w:after="60"/>
+      </w:pPr>
+      <w:r>
+        <w:rPr>
+          <w:sz w:val="22"/>
+          <w:szCs w:val="22"/>
+        </w:rPr>
+        <w:t xml:space="preserve">Wayfinding still directs a first-time family; it is not a radiation notice or a fire-exit display counted twice.</w:t>
+      </w:r>
+    </w:p>
+    <w:p>
+      <w:pPr>
+        <w:pStyle w:val="ListParagraph"/>
+        <w:numPr>
+          <w:ilvl w:val="0"/>
+          <w:numId w:val="1"/>
+        </w:numPr>
+        <w:spacing w:after="60"/>
+      </w:pPr>
+      <w:r>
+        <w:rPr>
+          <w:sz w:val="22"/>
+          <w:szCs w:val="22"/>
+        </w:rPr>
+        <w:t xml:space="preserve">Availability records cover night and holiday, not only a morning check.</w:t>
+      </w:r>
+    </w:p>
+    <w:p>
+      <w:pPr>
+        <w:pStyle w:val="ListParagraph"/>
+        <w:numPr>
+          <w:ilvl w:val="0"/>
+          <w:numId w:val="1"/>
+        </w:numPr>
+        <w:spacing w:after="60"/>
+      </w:pPr>
+      <w:r>
+        <w:rPr>
+          <w:sz w:val="22"/>
+          <w:szCs w:val="22"/>
+        </w:rPr>
+        <w:t xml:space="preserve">Last loaded electricity test took the essential-circuit list; last water test moved water to a point of use. A no-load crank is a finding.</w:t>
+      </w:r>
+    </w:p>
+    <w:p>
+      <w:pPr>
+        <w:pStyle w:val="ListParagraph"/>
+        <w:numPr>
+          <w:ilvl w:val="0"/>
+          <w:numId w:val="1"/>
+        </w:numPr>
+        <w:spacing w:after="60"/>
+      </w:pPr>
+      <w:r>
+        <w:rPr>
+          <w:sz w:val="22"/>
+          <w:szCs w:val="22"/>
+        </w:rPr>
+        <w:t xml:space="preserve">This year's energy file has a named owner, a baseline and a result, not a poster. Clinical ventilation was not cut to show a saving.</w:t>
+      </w:r>
+    </w:p>
+    <w:p>
+      <w:pPr>
+        <w:pStyle w:val="ListParagraph"/>
+        <w:numPr>
+          <w:ilvl w:val="0"/>
+          <w:numId w:val="1"/>
+        </w:numPr>
+        <w:spacing w:after="60"/>
+      </w:pPr>
+      <w:r>
+        <w:rPr>
+          <w:sz w:val="22"/>
+          <w:szCs w:val="22"/>
+        </w:rPr>
+        <w:t xml:space="preserve">Dialysis-water method exists only if dialysis is in the service directory.</w:t>
+      </w:r>
+    </w:p>
+    <w:p>
+      <w:pPr>
+        <w:pStyle w:val="ListParagraph"/>
+        <w:numPr>
+          <w:ilvl w:val="0"/>
+          <w:numId w:val="1"/>
+        </w:numPr>
+        <w:spacing w:after="60"/>
+      </w:pPr>
+      <w:r>
+        <w:rPr>
+          <w:sz w:val="22"/>
+          <w:szCs w:val="22"/>
+        </w:rPr>
+        <w:t xml:space="preserve">Biomedical-waste colours were left with the infection-control waste programme.</w:t>
+      </w:r>
+    </w:p>
+    <w:p>
+      <w:pPr>
+        <w:spacing w:after="140"/>
+      </w:pPr>
+      <w:r>
+        <w:rPr>
+          <w:sz w:val="22"/>
+          <w:szCs w:val="22"/>
+        </w:rPr>
+        <w:t xml:space="preserve">Any non-conformity is a finding. The Maintenance In-Charge owns the corrective action for plant, drawings and tests. The named initiative owner owns the corrective action for an energy file with no result. Root-cause analysis is required when: a backup test fails under load; an essential circuit is found dark after hours; a clinical tap is found dry after hours; a drawing does not match the floor; or an energy action cut clinical ventilation.</w:t>
+      </w:r>
+    </w:p>
+    <w:p>
+      <w:pPr>
+        <w:spacing w:after="140"/>
+      </w:pPr>
+      <w:r>
+        <w:rPr>
+          <w:sz w:val="22"/>
+          <w:szCs w:val="22"/>
+        </w:rPr>
+        <w:t xml:space="preserve">Corrective and preventive action is dated, has an owner, and is checked at the next quarterly audit. An open CAPA older than «thirty days» is escalated to the Medical Superintendent.</w:t>
+      </w:r>
+    </w:p>
+    <w:p>
+      <w:pPr>
+        <w:spacing w:after="140"/>
+      </w:pPr>
+      <w:r>
+        <w:rPr>
+          <w:sz w:val="22"/>
+          <w:szCs w:val="22"/>
+        </w:rPr>
+        <w:t xml:space="preserve">This policy is reviewed «annually», and sooner after a failed loaded test, a change to the service directory, or a building or major-service change that should have updated the as-built set.</w:t>
       </w:r>
     </w:p>
     <w:p>
@@ -1805,7 +2324,7 @@
           <w:sz w:val="22"/>
           <w:szCs w:val="22"/>
         </w:rPr>
-        <w:t xml:space="preserve">Staff who operate plant, post signs, or work on an occupied floor are trained against this policy at induction and «once a year» thereafter. Training covers: the public route, reporting a dark circuit or dry tap, and the non-negotiable rules. Staff who may start the generator or operate changeover are named on a trained-operator list held by the Maintenance In-Charge.</w:t>
+        <w:t xml:space="preserve">Staff who operate plant, post signs, or whose department space must match the service directory are trained against this policy at induction and «once a year» thereafter. Training covers: reporting a dark circuit or dry tap; the public wayfinding route; not signing a backup test that did not take load; and the non-negotiable rules. Staff who may start the generator or operate changeover are named on a trained-operator list held by the Maintenance In-Charge.</w:t>
       </w:r>
     </w:p>
     <w:p>
@@ -1829,7 +2348,7 @@
           <w:sz w:val="22"/>
           <w:szCs w:val="22"/>
         </w:rPr>
-        <w:t xml:space="preserve">I have read this Planned Facilities, Utilities and Environment-Friendly Measures policy of Preview Hospital. I will not occupy a clinical area whose essential water or electricity is known to have failed. I will not treat a no-load crank as a backup test. I will not shut clinical ventilation to show an energy saving.</w:t>
+        <w:t xml:space="preserve">I have read this Planned Facilities, Utilities and Environment-Friendly Measures policy of Preview Hospital. I will not draw drinking or clinical-wash water from a failed or non-potable tap. I will not sign a backup-test sheet for a generator that did not take the essential-circuit list. I will not shut clinical ventilation to show an energy saving.</w:t>
       </w:r>
     </w:p>
     <w:p>
@@ -2576,7 +3095,7 @@
           <w:sz w:val="20"/>
           <w:szCs w:val="20"/>
         </w:rPr>
-        <w:t xml:space="preserve">The Nursing Superintendent holds signed acknowledgements with the induction record. Staff who start the generator or operate changeover are named on the trained-operator list.</w:t>
+        <w:t xml:space="preserve">The Maintenance In-Charge holds signed acknowledgements of plant operators and department heads with the induction record. Staff who start the generator or operate changeover are named on the trained-operator list.</w:t>
       </w:r>
     </w:p>
     <w:p>
@@ -2602,7 +3121,24 @@
           <w:sz w:val="22"/>
           <w:szCs w:val="22"/>
         </w:rPr>
-        <w:t xml:space="preserve">National Building Code of India, 2016 (Bureau of Indian Standards), occupancy, services and as-built drawing framework as the local building and fire authority has applied it; not a universal sprinkler or bed-count mandate.</w:t>
+        <w:t xml:space="preserve">National Accreditation Board for Hospitals and Healthcare Providers (NABH), Standards for Small Healthcare Organisations, 3rd Edition — Chapter 8 FMS, standard FMS.1 (this policy is written so that those requirements are met in operation; it is not a commentary on the standard).</w:t>
+      </w:r>
+    </w:p>
+    <w:p>
+      <w:pPr>
+        <w:pStyle w:val="ListParagraph"/>
+        <w:numPr>
+          <w:ilvl w:val="0"/>
+          <w:numId w:val="1"/>
+        </w:numPr>
+        <w:spacing w:after="60"/>
+      </w:pPr>
+      <w:r>
+        <w:rPr>
+          <w:sz w:val="22"/>
+          <w:szCs w:val="22"/>
+        </w:rPr>
+        <w:t xml:space="preserve">National Building Code of India, 2016. Bureau of Indian Standards — occupancy, services and as-built drawing framework as the local building and fire authority has applied it to this facility; not a universal sprinkler or bed-count mandate.</w:t>
       </w:r>
     </w:p>
     <w:p>
@@ -2636,92 +3172,75 @@
           <w:sz w:val="22"/>
           <w:szCs w:val="22"/>
         </w:rPr>
-        <w:t xml:space="preserve">Guidelines for Drinking-water Quality (4th Edition). World Health Organization (2011) — potable-water quality-testing framework, not a pasted protocol.</w:t>
-      </w:r>
-    </w:p>
-    <w:p>
-      <w:pPr>
-        <w:pStyle w:val="ListParagraph"/>
-        <w:numPr>
-          <w:ilvl w:val="0"/>
-          <w:numId w:val="1"/>
-        </w:numPr>
-        <w:spacing w:after="60"/>
-      </w:pPr>
-      <w:r>
-        <w:rPr>
-          <w:sz w:val="22"/>
-          <w:szCs w:val="22"/>
-        </w:rPr>
-        <w:t xml:space="preserve">Coulliette, A. D., &amp; Arduino, M. J. (2015). Hemodialysis and Water Quality. Semin Dial — dialysis-water framework only if dialysis is offered.</w:t>
-      </w:r>
-    </w:p>
-    <w:p>
-      <w:pPr>
-        <w:pStyle w:val="ListParagraph"/>
-        <w:numPr>
-          <w:ilvl w:val="0"/>
-          <w:numId w:val="1"/>
-        </w:numPr>
-        <w:spacing w:after="60"/>
-      </w:pPr>
-      <w:r>
-        <w:rPr>
-          <w:sz w:val="22"/>
-          <w:szCs w:val="22"/>
-        </w:rPr>
-        <w:t xml:space="preserve">Dhillon, V. S. (2015). Green Hospital and Climate Change. J Clin Diagn Res — energy-efficiency framework, not a named rating mandate.</w:t>
-      </w:r>
-    </w:p>
-    <w:p>
-      <w:pPr>
-        <w:pStyle w:val="ListParagraph"/>
-        <w:numPr>
-          <w:ilvl w:val="0"/>
-          <w:numId w:val="1"/>
-        </w:numPr>
-        <w:spacing w:after="60"/>
-      </w:pPr>
-      <w:r>
-        <w:rPr>
-          <w:sz w:val="22"/>
-          <w:szCs w:val="22"/>
-        </w:rPr>
-        <w:t xml:space="preserve">Indian Public Health Standards (2022). National Health Mission — space-planning framework, not a NABH bed-count mandate.</w:t>
-      </w:r>
-    </w:p>
-    <w:p>
-      <w:pPr>
-        <w:pStyle w:val="ListParagraph"/>
-        <w:numPr>
-          <w:ilvl w:val="0"/>
-          <w:numId w:val="1"/>
-        </w:numPr>
-        <w:spacing w:after="60"/>
-      </w:pPr>
-      <w:r>
-        <w:rPr>
-          <w:sz w:val="22"/>
-          <w:szCs w:val="22"/>
-        </w:rPr>
-        <w:t xml:space="preserve">NABH Standards for Small Healthcare Organisations, 3rd Edition, Chapter 8, standard FMS.1 (this policy is written so that those requirements are met in operation; it is not a commentary on the standard).</w:t>
-      </w:r>
-    </w:p>
-    <w:p>
-      <w:pPr>
-        <w:pStyle w:val="ListParagraph"/>
-        <w:numPr>
-          <w:ilvl w:val="0"/>
-          <w:numId w:val="1"/>
-        </w:numPr>
-        <w:spacing w:after="60"/>
-      </w:pPr>
-      <w:r>
-        <w:rPr>
-          <w:sz w:val="22"/>
-          <w:szCs w:val="22"/>
-        </w:rPr>
-        <w:t xml:space="preserve">Internal: service directory; as-built set; wayfinding; availability and backup-test records; energy-initiative file; facility-safety, equipment, gas and fire programmes; infection-control waste programme.</w:t>
+        <w:t xml:space="preserve">Guidelines for Drinking-water Quality (4th Edition). World Health Organization (2011) — potable-water quality-testing framework, not a pasted protocol or a NABH interval.</w:t>
+      </w:r>
+    </w:p>
+    <w:p>
+      <w:pPr>
+        <w:pStyle w:val="ListParagraph"/>
+        <w:numPr>
+          <w:ilvl w:val="0"/>
+          <w:numId w:val="1"/>
+        </w:numPr>
+        <w:spacing w:after="60"/>
+      </w:pPr>
+      <w:r>
+        <w:rPr>
+          <w:sz w:val="22"/>
+          <w:szCs w:val="22"/>
+        </w:rPr>
+        <w:t xml:space="preserve">Coulliette, A. D., &amp; Arduino, M. J. (2015). Hemodialysis and Water Quality. Semin Dial, 26(4), 427-438 — dialysis-water framework only if dialysis is in the service directory.</w:t>
+      </w:r>
+    </w:p>
+    <w:p>
+      <w:pPr>
+        <w:pStyle w:val="ListParagraph"/>
+        <w:numPr>
+          <w:ilvl w:val="0"/>
+          <w:numId w:val="1"/>
+        </w:numPr>
+        <w:spacing w:after="60"/>
+      </w:pPr>
+      <w:r>
+        <w:rPr>
+          <w:sz w:val="22"/>
+          <w:szCs w:val="22"/>
+        </w:rPr>
+        <w:t xml:space="preserve">Dhillon, V. S. (2015). Green Hospital and Climate Change: Their Interrelationship and the Way Forward. JOURNAL OF CLINICAL AND DIAGNOSTIC RESEARCH — energy-efficiency framework, not a named rating mandate.</w:t>
+      </w:r>
+    </w:p>
+    <w:p>
+      <w:pPr>
+        <w:pStyle w:val="ListParagraph"/>
+        <w:numPr>
+          <w:ilvl w:val="0"/>
+          <w:numId w:val="1"/>
+        </w:numPr>
+        <w:spacing w:after="60"/>
+      </w:pPr>
+      <w:r>
+        <w:rPr>
+          <w:sz w:val="22"/>
+          <w:szCs w:val="22"/>
+        </w:rPr>
+        <w:t xml:space="preserve">Indian Public Health Standards. (2022). National Health Mission — space-planning framework, not a NABH bed-count mandate.</w:t>
+      </w:r>
+    </w:p>
+    <w:p>
+      <w:pPr>
+        <w:pStyle w:val="ListParagraph"/>
+        <w:numPr>
+          <w:ilvl w:val="0"/>
+          <w:numId w:val="1"/>
+        </w:numPr>
+        <w:spacing w:after="60"/>
+      </w:pPr>
+      <w:r>
+        <w:rPr>
+          <w:sz w:val="22"/>
+          <w:szCs w:val="22"/>
+        </w:rPr>
+        <w:t xml:space="preserve">Internal documents of this hospital: service directory; as-built drawing set; wayfinding; potable-water and electrical records; backup-test records; energy-initiative file; facility-safety, equipment, medical-gas and fire programmes; infection-control waste programme.</w:t>
       </w:r>
     </w:p>
     <w:p>
@@ -2742,43 +3261,43 @@
           <w:sz w:val="22"/>
           <w:szCs w:val="22"/>
         </w:rPr>
-        <w:t xml:space="preserve">Controlled master: office of the Medical Superintendent, Preview Hospital, with a working copy held by the Maintenance In-Charge and the Quality Coordinator.</w:t>
-      </w:r>
-    </w:p>
-    <w:p>
-      <w:pPr>
-        <w:spacing w:after="140"/>
-      </w:pPr>
-      <w:r>
-        <w:rPr>
-          <w:sz w:val="22"/>
-          <w:szCs w:val="22"/>
-        </w:rPr>
-        <w:t xml:space="preserve">Issued to: Nursing Superintendent, Night Duty Officer folder, department in-charges whose space must match the service directory.</w:t>
-      </w:r>
-    </w:p>
-    <w:p>
-      <w:pPr>
-        <w:spacing w:after="140"/>
-      </w:pPr>
-      <w:r>
-        <w:rPr>
-          <w:sz w:val="22"/>
-          <w:szCs w:val="22"/>
-        </w:rPr>
-        <w:t xml:space="preserve">Available to all staff at the «Nursing Station policy folder» and, if the hospital keeps an intranet, at the «staff intranet / policies».</w:t>
-      </w:r>
-    </w:p>
-    <w:p>
-      <w:pPr>
-        <w:spacing w:after="140"/>
-      </w:pPr>
-      <w:r>
-        <w:rPr>
-          <w:sz w:val="22"/>
-          <w:szCs w:val="22"/>
-        </w:rPr>
-        <w:t xml:space="preserve">On revision, every displayed copy is withdrawn the same day. One dated superseded copy is retained by the Quality Coordinator.</w:t>
+        <w:t xml:space="preserve">Controlled master copy: office of the Medical Superintendent, Preview Hospital, with the «Maintenance In-Charge» and the Quality Coordinator.</w:t>
+      </w:r>
+    </w:p>
+    <w:p>
+      <w:pPr>
+        <w:spacing w:after="140"/>
+      </w:pPr>
+      <w:r>
+        <w:rPr>
+          <w:sz w:val="22"/>
+          <w:szCs w:val="22"/>
+        </w:rPr>
+        <w:t xml:space="preserve">Copies issued to: engineering and facilities staff who operate utilities and backups; department heads whose space must match the service directory.</w:t>
+      </w:r>
+    </w:p>
+    <w:p>
+      <w:pPr>
+        <w:spacing w:after="140"/>
+      </w:pPr>
+      <w:r>
+        <w:rPr>
+          <w:sz w:val="22"/>
+          <w:szCs w:val="22"/>
+        </w:rPr>
+        <w:t xml:space="preserve">The current version is available to all staff at the «engineering office policy file» and, if the hospital keeps an intranet, at the «staff intranet / policies».</w:t>
+      </w:r>
+    </w:p>
+    <w:p>
+      <w:pPr>
+        <w:spacing w:after="140"/>
+      </w:pPr>
+      <w:r>
+        <w:rPr>
+          <w:sz w:val="22"/>
+          <w:szCs w:val="22"/>
+        </w:rPr>
+        <w:t xml:space="preserve">Superseded versions are withdrawn from all points of use on issue of a revision. One dated copy of each is retained by the Quality Coordinator.</w:t>
       </w:r>
     </w:p>
     <w:p>
@@ -2804,23 +3323,13 @@
 UPS — uninterruptible power supply
 IPHS — Indian Public Health Standards
 GDWQ — WHO Guidelines for Drinking-water Quality
+WHO — World Health Organization
 MGPS — medical gas pipeline system
 RO — reverse osmosis
+CSSD — central sterile supply department
 CAPA — corrective and preventive action
-RCA — root-cause analysis</w:t>
-      </w:r>
-    </w:p>
-    <w:p>
-      <w:pPr>
-        <w:spacing w:after="140"/>
-      </w:pPr>
-      <w:r>
-        <w:rPr>
-          <w:sz w:val="22"/>
-          <w:szCs w:val="22"/>
-        </w:rPr>
-        <w:t xml:space="preserve">Night Duty Officer — the senior doctor or senior nurse holding emergency command overnight
-Maintenance In-Charge — the person accountable for drawings, plant and backup tests under this policy</w:t>
+RCA — root-cause analysis
+HVAC — heating, ventilation and air-conditioning</w:t>
       </w:r>
     </w:p>
     <w:p>
@@ -3021,7 +3530,7 @@
                 <w:sz w:val="18"/>
                 <w:szCs w:val="18"/>
               </w:rPr>
-              <w:t xml:space="preserve">Section 3; 5.1 Space, drawings and wayfinding</w:t>
+              <w:t xml:space="preserve">Section 3; 5.1 Match built space to the services we offer</w:t>
             </w:r>
           </w:p>
         </w:tc>
@@ -3043,7 +3552,7 @@
                 <w:sz w:val="18"/>
                 <w:szCs w:val="18"/>
               </w:rPr>
-              <w:t xml:space="preserve">Medical Superintendent (accountable); Maintenance In-Charge (space record)</w:t>
+              <w:t xml:space="preserve">Medical Superintendent (accountable); Maintenance In-Charge (space record); clinical heads (confirm)</w:t>
             </w:r>
           </w:p>
         </w:tc>
@@ -3111,7 +3620,7 @@
                 <w:sz w:val="18"/>
                 <w:szCs w:val="18"/>
               </w:rPr>
-              <w:t xml:space="preserve">Section 3; 5.1 Space, drawings and wayfinding</w:t>
+              <w:t xml:space="preserve">Section 3; 5.2 Hold the as-built drawings and update them</w:t>
             </w:r>
           </w:p>
         </w:tc>
@@ -3201,7 +3710,7 @@
                 <w:sz w:val="18"/>
                 <w:szCs w:val="18"/>
               </w:rPr>
-              <w:t xml:space="preserve">Section 3; 5.1 Space, drawings and wayfinding</w:t>
+              <w:t xml:space="preserve">Section 3; 5.3 Post internal and external wayfinding</w:t>
             </w:r>
           </w:p>
         </w:tc>
@@ -3223,7 +3732,7 @@
                 <w:sz w:val="18"/>
                 <w:szCs w:val="18"/>
               </w:rPr>
-              <w:t xml:space="preserve">Maintenance In-Charge (signs); Nursing Superintendent (notices not covering them)</w:t>
+              <w:t xml:space="preserve">Maintenance In-Charge</w:t>
             </w:r>
           </w:p>
         </w:tc>
@@ -3291,7 +3800,7 @@
                 <w:sz w:val="18"/>
                 <w:szCs w:val="18"/>
               </w:rPr>
-              <w:t xml:space="preserve">Section 3; 5.2 Round-the-clock water and electricity</w:t>
+              <w:t xml:space="preserve">Section 3; 5.4 Keep potable water and electricity available round the clock</w:t>
             </w:r>
           </w:p>
         </w:tc>
@@ -3313,7 +3822,7 @@
                 <w:sz w:val="18"/>
                 <w:szCs w:val="18"/>
               </w:rPr>
-              <w:t xml:space="preserve">Maintenance In-Charge; Night Duty Officer (night interruptions)</w:t>
+              <w:t xml:space="preserve">Maintenance In-Charge; after-hours facilities roster when the lead is off site</w:t>
             </w:r>
           </w:p>
         </w:tc>
@@ -3381,7 +3890,7 @@
                 <w:sz w:val="18"/>
                 <w:szCs w:val="18"/>
               </w:rPr>
-              <w:t xml:space="preserve">Section 3; 5.3 Alternate sources — loaded tests</w:t>
+              <w:t xml:space="preserve">Section 3; 5.5 Test backup electricity and water so they actually work</w:t>
             </w:r>
           </w:p>
         </w:tc>
@@ -3471,7 +3980,7 @@
                 <w:sz w:val="18"/>
                 <w:szCs w:val="18"/>
               </w:rPr>
-              <w:t xml:space="preserve">Section 3; 5.4 Energy and environment initiatives</w:t>
+              <w:t xml:space="preserve">Section 3; 5.6 Take this year's energy and environment initiatives</w:t>
             </w:r>
           </w:p>
         </w:tc>
@@ -3584,6 +4093,23 @@
     </w:p>
     <w:p>
       <w:pPr>
+        <w:pStyle w:val="ListParagraph"/>
+        <w:numPr>
+          <w:ilvl w:val="0"/>
+          <w:numId w:val="1"/>
+        </w:numPr>
+        <w:spacing w:after="60"/>
+      </w:pPr>
+      <w:r>
+        <w:rPr>
+          <w:sz w:val="22"/>
+          <w:szCs w:val="22"/>
+        </w:rPr>
+        <w:t xml:space="preserve">Update of the space record when a service is added or withdrawn.</w:t>
+      </w:r>
+    </w:p>
+    <w:p>
+      <w:pPr>
         <w:pStyle w:val="Heading2"/>
         <w:spacing w:after="100" w:before="220"/>
       </w:pPr>
@@ -3639,7 +4165,7 @@
           <w:sz w:val="22"/>
           <w:szCs w:val="22"/>
         </w:rPr>
-        <w:t xml:space="preserve">Fire and medical-gas sheets issued as working copies, not second masters.</w:t>
+        <w:t xml:space="preserve">Working copies of fire sheets issued to the fire programme, and of medical-gas sheets to the gas programme if piped, without creating a second master.</w:t>
       </w:r>
     </w:p>
     <w:p>
@@ -3665,41 +4191,41 @@
           <w:sz w:val="22"/>
           <w:szCs w:val="22"/>
         </w:rPr>
-        <w:t xml:space="preserve">Monthly wayfinding inspection.</w:t>
-      </w:r>
-    </w:p>
-    <w:p>
-      <w:pPr>
-        <w:pStyle w:val="ListParagraph"/>
-        <w:numPr>
-          <w:ilvl w:val="0"/>
-          <w:numId w:val="1"/>
-        </w:numPr>
-        <w:spacing w:after="60"/>
-      </w:pPr>
-      <w:r>
-        <w:rPr>
-          <w:sz w:val="22"/>
-          <w:szCs w:val="22"/>
-        </w:rPr>
-        <w:t xml:space="preserve">Induction record that staff walked the public route before a first night shift.</w:t>
-      </w:r>
-    </w:p>
-    <w:p>
-      <w:pPr>
-        <w:pStyle w:val="ListParagraph"/>
-        <w:numPr>
-          <w:ilvl w:val="0"/>
-          <w:numId w:val="1"/>
-        </w:numPr>
-        <w:spacing w:after="60"/>
-      </w:pPr>
-      <w:r>
-        <w:rPr>
-          <w:sz w:val="22"/>
-          <w:szCs w:val="22"/>
-        </w:rPr>
         <w:t xml:space="preserve">Languages and pictograms as issued.</w:t>
+      </w:r>
+    </w:p>
+    <w:p>
+      <w:pPr>
+        <w:pStyle w:val="ListParagraph"/>
+        <w:numPr>
+          <w:ilvl w:val="0"/>
+          <w:numId w:val="1"/>
+        </w:numPr>
+        <w:spacing w:after="60"/>
+      </w:pPr>
+      <w:r>
+        <w:rPr>
+          <w:sz w:val="22"/>
+          <w:szCs w:val="22"/>
+        </w:rPr>
+        <w:t xml:space="preserve">Monthly wayfinding inspection for faded, contradictory or missing signs.</w:t>
+      </w:r>
+    </w:p>
+    <w:p>
+      <w:pPr>
+        <w:pStyle w:val="ListParagraph"/>
+        <w:numPr>
+          <w:ilvl w:val="0"/>
+          <w:numId w:val="1"/>
+        </w:numPr>
+        <w:spacing w:after="60"/>
+      </w:pPr>
+      <w:r>
+        <w:rPr>
+          <w:sz w:val="22"/>
+          <w:szCs w:val="22"/>
+        </w:rPr>
+        <w:t xml:space="preserve">Record that radiation / PC-PNDT notices and fire-exit display are not counted as this posting.</w:t>
       </w:r>
     </w:p>
     <w:p>
@@ -3759,24 +4285,58 @@
           <w:sz w:val="22"/>
           <w:szCs w:val="22"/>
         </w:rPr>
-        <w:t xml:space="preserve">WHO GDWQ quality-test records at the defined points.</w:t>
-      </w:r>
-    </w:p>
-    <w:p>
-      <w:pPr>
-        <w:pStyle w:val="ListParagraph"/>
-        <w:numPr>
-          <w:ilvl w:val="0"/>
-          <w:numId w:val="1"/>
-        </w:numPr>
-        <w:spacing w:after="60"/>
-      </w:pPr>
-      <w:r>
-        <w:rPr>
-          <w:sz w:val="22"/>
-          <w:szCs w:val="22"/>
-        </w:rPr>
-        <w:t xml:space="preserve">Dialysis-water method, or a recorded not-applicable if dialysis is not offered.</w:t>
+        <w:t xml:space="preserve">WHO GDWQ quality-test records at the defined parameters, points and interval.</w:t>
+      </w:r>
+    </w:p>
+    <w:p>
+      <w:pPr>
+        <w:pStyle w:val="ListParagraph"/>
+        <w:numPr>
+          <w:ilvl w:val="0"/>
+          <w:numId w:val="1"/>
+        </w:numPr>
+        <w:spacing w:after="60"/>
+      </w:pPr>
+      <w:r>
+        <w:rPr>
+          <w:sz w:val="22"/>
+          <w:szCs w:val="22"/>
+        </w:rPr>
+        <w:t xml:space="preserve">Dialysis-water method, or a recorded absence if dialysis is not in the service directory.</w:t>
+      </w:r>
+    </w:p>
+    <w:p>
+      <w:pPr>
+        <w:pStyle w:val="ListParagraph"/>
+        <w:numPr>
+          <w:ilvl w:val="0"/>
+          <w:numId w:val="1"/>
+        </w:numPr>
+        <w:spacing w:after="60"/>
+      </w:pPr>
+      <w:r>
+        <w:rPr>
+          <w:sz w:val="22"/>
+          <w:szCs w:val="22"/>
+        </w:rPr>
+        <w:t xml:space="preserve">Legionella / stagnant-water control for systems actually run, or a recorded absence if none exist.</w:t>
+      </w:r>
+    </w:p>
+    <w:p>
+      <w:pPr>
+        <w:pStyle w:val="ListParagraph"/>
+        <w:numPr>
+          <w:ilvl w:val="0"/>
+          <w:numId w:val="1"/>
+        </w:numPr>
+        <w:spacing w:after="60"/>
+      </w:pPr>
+      <w:r>
+        <w:rPr>
+          <w:sz w:val="22"/>
+          <w:szCs w:val="22"/>
+        </w:rPr>
+        <w:t xml:space="preserve">After-hours facilities roster.</w:t>
       </w:r>
     </w:p>
     <w:p>
@@ -3819,41 +4379,41 @@
           <w:sz w:val="22"/>
           <w:szCs w:val="22"/>
         </w:rPr>
-        <w:t xml:space="preserve">Loaded essential-circuit test records at the defined frequency.</w:t>
-      </w:r>
-    </w:p>
-    <w:p>
-      <w:pPr>
-        <w:pStyle w:val="ListParagraph"/>
-        <w:numPr>
-          <w:ilvl w:val="0"/>
-          <w:numId w:val="1"/>
-        </w:numPr>
-        <w:spacing w:after="60"/>
-      </w:pPr>
-      <w:r>
-        <w:rPr>
-          <w:sz w:val="22"/>
-          <w:szCs w:val="22"/>
-        </w:rPr>
-        <w:t xml:space="preserve">Tank-to-tap or pump auto-start records.</w:t>
-      </w:r>
-    </w:p>
-    <w:p>
-      <w:pPr>
-        <w:pStyle w:val="ListParagraph"/>
-        <w:numPr>
-          <w:ilvl w:val="0"/>
-          <w:numId w:val="1"/>
-        </w:numPr>
-        <w:spacing w:after="60"/>
-      </w:pPr>
-      <w:r>
-        <w:rPr>
-          <w:sz w:val="22"/>
-          <w:szCs w:val="22"/>
-        </w:rPr>
-        <w:t xml:space="preserve">Fuel, coolant and battery condition recorded with each electricity test.</w:t>
+        <w:t xml:space="preserve">Loaded essential-circuit test records at the predefined frequency, with fuel, coolant and battery condition.</w:t>
+      </w:r>
+    </w:p>
+    <w:p>
+      <w:pPr>
+        <w:pStyle w:val="ListParagraph"/>
+        <w:numPr>
+          <w:ilvl w:val="0"/>
+          <w:numId w:val="1"/>
+        </w:numPr>
+        <w:spacing w:after="60"/>
+      </w:pPr>
+      <w:r>
+        <w:rPr>
+          <w:sz w:val="22"/>
+          <w:szCs w:val="22"/>
+        </w:rPr>
+        <w:t xml:space="preserve">Tank-to-tap, pump auto-start, or tanker-mobilisation records at the predefined frequency.</w:t>
+      </w:r>
+    </w:p>
+    <w:p>
+      <w:pPr>
+        <w:pStyle w:val="ListParagraph"/>
+        <w:numPr>
+          <w:ilvl w:val="0"/>
+          <w:numId w:val="1"/>
+        </w:numPr>
+        <w:spacing w:after="60"/>
+      </w:pPr>
+      <w:r>
+        <w:rPr>
+          <w:sz w:val="22"/>
+          <w:szCs w:val="22"/>
+        </w:rPr>
+        <w:t xml:space="preserve">Trained-operator list for generator start and changeover.</w:t>
       </w:r>
     </w:p>
     <w:p>
@@ -3914,6 +4474,23 @@
           <w:szCs w:val="22"/>
         </w:rPr>
         <w:t xml:space="preserve">Record that clinical ventilation was not cut to show a saving.</w:t>
+      </w:r>
+    </w:p>
+    <w:p>
+      <w:pPr>
+        <w:pStyle w:val="ListParagraph"/>
+        <w:numPr>
+          <w:ilvl w:val="0"/>
+          <w:numId w:val="1"/>
+        </w:numPr>
+        <w:spacing w:after="60"/>
+      </w:pPr>
+      <w:r>
+        <w:rPr>
+          <w:sz w:val="22"/>
+          <w:szCs w:val="22"/>
+        </w:rPr>
+        <w:t xml:space="preserve">Record that biomedical-waste colours remain the infection-control waste programme.</w:t>
       </w:r>
     </w:p>
     <w:p>

</xml_diff>

<commit_message>
draft(UNAPPROVED): plain-English rewrite of FMS.1–4 v2
Same rules, bans, frameworks and intervals. Short sentences and everyday
words so ward and facilities staff can read the policies on first pass.
No SQL. Status remains draft.

Co-authored-by: upadhyaymehul9-prog <upadhyaymehul9-prog@users.noreply.github.com>
</commit_message>
<xml_diff>
--- a/policies/build/preview/FMS.1_v2_preview.docx
+++ b/policies/build/preview/FMS.1_v2_preview.docx
@@ -44,7 +44,7 @@
           <w:sz w:val="20"/>
           <w:szCs w:val="20"/>
         </w:rPr>
-        <w:t xml:space="preserve">Standards for planned space, utilities and measured energy initiatives.</w:t>
+        <w:t xml:space="preserve">How this hospital plans space, keeps water and power working, and runs energy projects.</w:t>
       </w:r>
     </w:p>
     <w:p>
@@ -175,7 +175,7 @@
                 <w:sz w:val="18"/>
                 <w:szCs w:val="18"/>
               </w:rPr>
-              <w:t xml:space="preserve">2.1</w:t>
+              <w:t xml:space="preserve">2.2</w:t>
             </w:r>
           </w:p>
         </w:tc>
@@ -751,7 +751,7 @@
           <w:sz w:val="22"/>
           <w:szCs w:val="22"/>
         </w:rPr>
-        <w:t xml:space="preserve">A tap that should serve a patient and a circuit that should serve care are live at 03:00. A drawing matches the floor. A green poster is not an initiative.</w:t>
+        <w:t xml:space="preserve">Drinking water and power for care must work at 3 a.m. The drawing must match the building. A green poster is not an energy project.</w:t>
       </w:r>
     </w:p>
     <w:p>
@@ -772,31 +772,145 @@
           <w:sz w:val="22"/>
           <w:szCs w:val="22"/>
         </w:rPr>
-        <w:t xml:space="preserve">This policy governs how Preview Hospital matches built space to the services it actually offers, holds the as-built drawings the occupancy required, posts wayfinding patients and families can follow, keeps potable water and electricity available round the clock, proves that alternate electricity and water work under load, and runs named energy-efficient and environment-friendly initiatives.</w:t>
-      </w:r>
-    </w:p>
-    <w:p>
-      <w:pPr>
-        <w:spacing w:after="140"/>
-      </w:pPr>
-      <w:r>
-        <w:rPr>
-          <w:sz w:val="22"/>
-          <w:szCs w:val="22"/>
-        </w:rPr>
-        <w:t xml:space="preserve">It is the planned-operation method for the building and its utilities. It is not a consultant drawing set, a generator-vendor manual, a green-hospital certification application, or a substitute for the occupancy conditions the local building authority issued for this site.</w:t>
-      </w:r>
-    </w:p>
-    <w:p>
-      <w:pPr>
-        <w:spacing w:after="140"/>
-      </w:pPr>
-      <w:r>
-        <w:rPr>
-          <w:sz w:val="22"/>
-          <w:szCs w:val="22"/>
-        </w:rPr>
-        <w:t xml:space="preserve">Editable defaults in this document are marked «like this». A hospital that adopts the default keeps the wording. A hospital that needs a different owner, interval or arrangement replaces the marked text before issue. True blanks — «________» — have no sensible default and must be completed before this document is signed.</w:t>
+        <w:t xml:space="preserve">This policy says how Preview Hospital plans its rooms and plant.</w:t>
+      </w:r>
+    </w:p>
+    <w:p>
+      <w:pPr>
+        <w:spacing w:after="140"/>
+      </w:pPr>
+      <w:r>
+        <w:rPr>
+          <w:sz w:val="22"/>
+          <w:szCs w:val="22"/>
+        </w:rPr>
+        <w:t xml:space="preserve">It covers six jobs:</w:t>
+      </w:r>
+    </w:p>
+    <w:p>
+      <w:pPr>
+        <w:pStyle w:val="ListParagraph"/>
+        <w:numPr>
+          <w:ilvl w:val="0"/>
+          <w:numId w:val="1"/>
+        </w:numPr>
+        <w:spacing w:after="60"/>
+      </w:pPr>
+      <w:r>
+        <w:rPr>
+          <w:sz w:val="22"/>
+          <w:szCs w:val="22"/>
+        </w:rPr>
+        <w:t xml:space="preserve">match the built space to the services this hospital actually offers;</w:t>
+      </w:r>
+    </w:p>
+    <w:p>
+      <w:pPr>
+        <w:pStyle w:val="ListParagraph"/>
+        <w:numPr>
+          <w:ilvl w:val="0"/>
+          <w:numId w:val="1"/>
+        </w:numPr>
+        <w:spacing w:after="60"/>
+      </w:pPr>
+      <w:r>
+        <w:rPr>
+          <w:sz w:val="22"/>
+          <w:szCs w:val="22"/>
+        </w:rPr>
+        <w:t xml:space="preserve">keep the as-built drawings (drawings that show the building as it was actually built);</w:t>
+      </w:r>
+    </w:p>
+    <w:p>
+      <w:pPr>
+        <w:pStyle w:val="ListParagraph"/>
+        <w:numPr>
+          <w:ilvl w:val="0"/>
+          <w:numId w:val="1"/>
+        </w:numPr>
+        <w:spacing w:after="60"/>
+      </w:pPr>
+      <w:r>
+        <w:rPr>
+          <w:sz w:val="22"/>
+          <w:szCs w:val="22"/>
+        </w:rPr>
+        <w:t xml:space="preserve">put up signs that patients and families can follow;</w:t>
+      </w:r>
+    </w:p>
+    <w:p>
+      <w:pPr>
+        <w:pStyle w:val="ListParagraph"/>
+        <w:numPr>
+          <w:ilvl w:val="0"/>
+          <w:numId w:val="1"/>
+        </w:numPr>
+        <w:spacing w:after="60"/>
+      </w:pPr>
+      <w:r>
+        <w:rPr>
+          <w:sz w:val="22"/>
+          <w:szCs w:val="22"/>
+        </w:rPr>
+        <w:t xml:space="preserve">keep drinking water and electricity available day and night;</w:t>
+      </w:r>
+    </w:p>
+    <w:p>
+      <w:pPr>
+        <w:pStyle w:val="ListParagraph"/>
+        <w:numPr>
+          <w:ilvl w:val="0"/>
+          <w:numId w:val="1"/>
+        </w:numPr>
+        <w:spacing w:after="60"/>
+      </w:pPr>
+      <w:r>
+        <w:rPr>
+          <w:sz w:val="22"/>
+          <w:szCs w:val="22"/>
+        </w:rPr>
+        <w:t xml:space="preserve">prove that backup power and backup water work;</w:t>
+      </w:r>
+    </w:p>
+    <w:p>
+      <w:pPr>
+        <w:pStyle w:val="ListParagraph"/>
+        <w:numPr>
+          <w:ilvl w:val="0"/>
+          <w:numId w:val="1"/>
+        </w:numPr>
+        <w:spacing w:after="60"/>
+      </w:pPr>
+      <w:r>
+        <w:rPr>
+          <w:sz w:val="22"/>
+          <w:szCs w:val="22"/>
+        </w:rPr>
+        <w:t xml:space="preserve">run named energy-saving and environment projects this year.</w:t>
+      </w:r>
+    </w:p>
+    <w:p>
+      <w:pPr>
+        <w:spacing w:after="140"/>
+      </w:pPr>
+      <w:r>
+        <w:rPr>
+          <w:sz w:val="22"/>
+          <w:szCs w:val="22"/>
+        </w:rPr>
+        <w:t xml:space="preserve">This is the method for running the building and its utilities. It is not a consultant's drawing set. It is not a generator-vendor manual. It is not an application for a green-hospital certificate. It does not replace the occupancy conditions the local building authority issued for this site.</w:t>
+      </w:r>
+    </w:p>
+    <w:p>
+      <w:pPr>
+        <w:spacing w:after="140"/>
+      </w:pPr>
+      <w:r>
+        <w:rPr>
+          <w:sz w:val="22"/>
+          <w:szCs w:val="22"/>
+        </w:rPr>
+        <w:t xml:space="preserve">Words marked «like this» are defaults a small hospital can keep. Change the marked text before issue if this hospital needs a different owner, interval or arrangement. A blank marked «________» has no sensible default. Fill it in before this document is signed.</w:t>
       </w:r>
     </w:p>
     <w:p>
@@ -817,115 +931,241 @@
           <w:sz w:val="22"/>
           <w:szCs w:val="22"/>
         </w:rPr>
-        <w:t xml:space="preserve">This policy applies to the physical facilities of Preview Hospital and to the people who plan space, hold drawings, post wayfinding, operate potable-water and electrical systems and their backups, and run this year's energy and environment initiatives.</w:t>
-      </w:r>
-    </w:p>
-    <w:p>
-      <w:pPr>
-        <w:spacing w:after="140"/>
-      </w:pPr>
-      <w:r>
-        <w:rPr>
-          <w:sz w:val="22"/>
-          <w:szCs w:val="22"/>
-        </w:rPr>
-        <w:t xml:space="preserve">It covers: appropriateness of facilities and space to the defined scope of services; as-built and updated drawings; internal and external sign postings; round-the-clock potable water and electricity; alternate electricity and water sources and the tests that prove they work; and energy-efficient / environment-friendly initiatives.</w:t>
-      </w:r>
-    </w:p>
-    <w:p>
-      <w:pPr>
-        <w:spacing w:after="140"/>
-      </w:pPr>
-      <w:r>
-        <w:rPr>
-          <w:sz w:val="22"/>
-          <w:szCs w:val="22"/>
-        </w:rPr>
-        <w:t xml:space="preserve">It does not govern patient-safety devices, monthly facility inspection rounds, electrical-installation audits, unused-material disposal, or building hazardous materials — those belong to the facility-safety programme. It does not govern medical-equipment preventive maintenance, medical gases, or fire and non-fire emergency plans. A power or water failure that is declared an emergency is handed to the fire-and-non-fire programme; routine backup testing stays here.</w:t>
-      </w:r>
-    </w:p>
-    <w:p>
-      <w:pPr>
-        <w:spacing w:after="140"/>
-      </w:pPr>
-      <w:r>
-        <w:rPr>
-          <w:sz w:val="22"/>
-          <w:szCs w:val="22"/>
-        </w:rPr>
-        <w:t xml:space="preserve">The defined scope of services is the service-directory programme. This policy owns that the built space can hold those services. A service the directory does not provide is a recorded absence, not another hospital's floor plate.</w:t>
-      </w:r>
-    </w:p>
-    <w:p>
-      <w:pPr>
-        <w:spacing w:after="140"/>
-      </w:pPr>
-      <w:r>
-        <w:rPr>
-          <w:sz w:val="22"/>
-          <w:szCs w:val="22"/>
-        </w:rPr>
-        <w:t xml:space="preserve">Radiation, restricted-area, pregnancy-caution and PC-PNDT notices are the laboratory and imaging safety programme. This policy owns hospital-wide wayfinding. Emergency-exit display is the fire programme; those sheets must be consistent with wayfinding but are not this posting counted twice.</w:t>
-      </w:r>
-    </w:p>
-    <w:p>
-      <w:pPr>
-        <w:spacing w:after="140"/>
-      </w:pPr>
-      <w:r>
-        <w:rPr>
-          <w:sz w:val="22"/>
-          <w:szCs w:val="22"/>
-        </w:rPr>
-        <w:t xml:space="preserve">A diesel generator, pump or UPS that is building plant is this policy. A ventilator or steriliser is the equipment programme. Steriliser validation as a reprocessing act stays the infection-control sterilisation programme.</w:t>
-      </w:r>
-    </w:p>
-    <w:p>
-      <w:pPr>
-        <w:spacing w:after="140"/>
-      </w:pPr>
-      <w:r>
-        <w:rPr>
-          <w:sz w:val="22"/>
-          <w:szCs w:val="22"/>
-        </w:rPr>
-        <w:t xml:space="preserve">Piped medical-gas plant electricity or water may be essential circuits here; the gas programme remains the gas programme.</w:t>
-      </w:r>
-    </w:p>
-    <w:p>
-      <w:pPr>
-        <w:spacing w:after="140"/>
-      </w:pPr>
-      <w:r>
-        <w:rPr>
-          <w:sz w:val="22"/>
-          <w:szCs w:val="22"/>
-        </w:rPr>
-        <w:t xml:space="preserve">Biomedical-waste colour, transport and authorisation stay the infection-control waste programme. Kitchen food-safety stays that waste/food programme. Patient-facing expected cost is not a facilities tariff.</w:t>
-      </w:r>
-    </w:p>
-    <w:p>
-      <w:pPr>
-        <w:spacing w:after="140"/>
-      </w:pPr>
-      <w:r>
-        <w:rPr>
-          <w:sz w:val="22"/>
-          <w:szCs w:val="22"/>
-        </w:rPr>
-        <w:t xml:space="preserve">Indian Public Health Standards 2022 and the National Building Code of India, 2016, are space and building-code frameworks as the local authority applied them. They are not a NABH bed-count, occupancy-subdivision or sprinkler mandate for every small hospital.</w:t>
-      </w:r>
-    </w:p>
-    <w:p>
-      <w:pPr>
-        <w:spacing w:after="140"/>
-      </w:pPr>
-      <w:r>
-        <w:rPr>
-          <w:sz w:val="22"/>
-          <w:szCs w:val="22"/>
-        </w:rPr>
-        <w:t xml:space="preserve">Coulliette and Arduino is the dialysis-water framework only if dialysis is in the service directory. If dialysis is not provided, that is a recorded absence, not a copied reverse-osmosis SOP.</w:t>
+        <w:t xml:space="preserve">This policy applies to the buildings of Preview Hospital. It also applies to the people who plan space, keep drawings, put up signs, run water and electrical systems and their backups, and run this year's energy and environment projects.</w:t>
+      </w:r>
+    </w:p>
+    <w:p>
+      <w:pPr>
+        <w:spacing w:after="140"/>
+      </w:pPr>
+      <w:r>
+        <w:rPr>
+          <w:sz w:val="22"/>
+          <w:szCs w:val="22"/>
+        </w:rPr>
+        <w:t xml:space="preserve">It covers:</w:t>
+      </w:r>
+    </w:p>
+    <w:p>
+      <w:pPr>
+        <w:pStyle w:val="ListParagraph"/>
+        <w:numPr>
+          <w:ilvl w:val="0"/>
+          <w:numId w:val="1"/>
+        </w:numPr>
+        <w:spacing w:after="60"/>
+      </w:pPr>
+      <w:r>
+        <w:rPr>
+          <w:sz w:val="22"/>
+          <w:szCs w:val="22"/>
+        </w:rPr>
+        <w:t xml:space="preserve">whether rooms and facilities fit the services this hospital offers;</w:t>
+      </w:r>
+    </w:p>
+    <w:p>
+      <w:pPr>
+        <w:pStyle w:val="ListParagraph"/>
+        <w:numPr>
+          <w:ilvl w:val="0"/>
+          <w:numId w:val="1"/>
+        </w:numPr>
+        <w:spacing w:after="60"/>
+      </w:pPr>
+      <w:r>
+        <w:rPr>
+          <w:sz w:val="22"/>
+          <w:szCs w:val="22"/>
+        </w:rPr>
+        <w:t xml:space="preserve">as-built drawings, and updates when the building changes;</w:t>
+      </w:r>
+    </w:p>
+    <w:p>
+      <w:pPr>
+        <w:pStyle w:val="ListParagraph"/>
+        <w:numPr>
+          <w:ilvl w:val="0"/>
+          <w:numId w:val="1"/>
+        </w:numPr>
+        <w:spacing w:after="60"/>
+      </w:pPr>
+      <w:r>
+        <w:rPr>
+          <w:sz w:val="22"/>
+          <w:szCs w:val="22"/>
+        </w:rPr>
+        <w:t xml:space="preserve">signs inside and outside the building;</w:t>
+      </w:r>
+    </w:p>
+    <w:p>
+      <w:pPr>
+        <w:pStyle w:val="ListParagraph"/>
+        <w:numPr>
+          <w:ilvl w:val="0"/>
+          <w:numId w:val="1"/>
+        </w:numPr>
+        <w:spacing w:after="60"/>
+      </w:pPr>
+      <w:r>
+        <w:rPr>
+          <w:sz w:val="22"/>
+          <w:szCs w:val="22"/>
+        </w:rPr>
+        <w:t xml:space="preserve">drinking water and electricity available day and night;</w:t>
+      </w:r>
+    </w:p>
+    <w:p>
+      <w:pPr>
+        <w:pStyle w:val="ListParagraph"/>
+        <w:numPr>
+          <w:ilvl w:val="0"/>
+          <w:numId w:val="1"/>
+        </w:numPr>
+        <w:spacing w:after="60"/>
+      </w:pPr>
+      <w:r>
+        <w:rPr>
+          <w:sz w:val="22"/>
+          <w:szCs w:val="22"/>
+        </w:rPr>
+        <w:t xml:space="preserve">backup electricity and backup water, and the tests that prove they work;</w:t>
+      </w:r>
+    </w:p>
+    <w:p>
+      <w:pPr>
+        <w:pStyle w:val="ListParagraph"/>
+        <w:numPr>
+          <w:ilvl w:val="0"/>
+          <w:numId w:val="1"/>
+        </w:numPr>
+        <w:spacing w:after="60"/>
+      </w:pPr>
+      <w:r>
+        <w:rPr>
+          <w:sz w:val="22"/>
+          <w:szCs w:val="22"/>
+        </w:rPr>
+        <w:t xml:space="preserve">energy-saving and environment-friendly projects.</w:t>
+      </w:r>
+    </w:p>
+    <w:p>
+      <w:pPr>
+        <w:spacing w:after="140"/>
+      </w:pPr>
+      <w:r>
+        <w:rPr>
+          <w:sz w:val="22"/>
+          <w:szCs w:val="22"/>
+        </w:rPr>
+        <w:t xml:space="preserve">It does not cover grab rails, monthly safety walks, electrical-installation audits, unused items, or building chemicals. Those belong to the facility-safety policy.</w:t>
+      </w:r>
+    </w:p>
+    <w:p>
+      <w:pPr>
+        <w:spacing w:after="140"/>
+      </w:pPr>
+      <w:r>
+        <w:rPr>
+          <w:sz w:val="22"/>
+          <w:szCs w:val="22"/>
+        </w:rPr>
+        <w:t xml:space="preserve">It does not cover medical-equipment maintenance. It does not cover medical gases. It does not cover fire and non-fire emergency plans.</w:t>
+      </w:r>
+    </w:p>
+    <w:p>
+      <w:pPr>
+        <w:spacing w:after="140"/>
+      </w:pPr>
+      <w:r>
+        <w:rPr>
+          <w:sz w:val="22"/>
+          <w:szCs w:val="22"/>
+        </w:rPr>
+        <w:t xml:space="preserve">If a power or water failure is declared an emergency, the fire-and-non-fire policy takes over. Routine backup testing stays here.</w:t>
+      </w:r>
+    </w:p>
+    <w:p>
+      <w:pPr>
+        <w:spacing w:after="140"/>
+      </w:pPr>
+      <w:r>
+        <w:rPr>
+          <w:sz w:val="22"/>
+          <w:szCs w:val="22"/>
+        </w:rPr>
+        <w:t xml:space="preserve">The list of services this hospital offers sits in the service-directory policy. This policy checks that the built space can hold those services. If the directory does not list a service, write down that this hospital does not offer it. Do not copy another hospital's intensive-care floor layout for a service this hospital does not run.</w:t>
+      </w:r>
+    </w:p>
+    <w:p>
+      <w:pPr>
+        <w:spacing w:after="140"/>
+      </w:pPr>
+      <w:r>
+        <w:rPr>
+          <w:sz w:val="22"/>
+          <w:szCs w:val="22"/>
+        </w:rPr>
+        <w:t xml:space="preserve">Radiation signs, restricted-area signs, pregnancy-caution signs and Pre-Conception and Pre-Natal Diagnostic Techniques (PC-PNDT) notices belong to the laboratory and imaging safety policy. This policy covers hospital-wide direction signs. Emergency-exit plans belong to the fire policy. Those exit plans must not contradict the direction signs. They are not a substitute for the direction signs.</w:t>
+      </w:r>
+    </w:p>
+    <w:p>
+      <w:pPr>
+        <w:spacing w:after="140"/>
+      </w:pPr>
+      <w:r>
+        <w:rPr>
+          <w:sz w:val="22"/>
+          <w:szCs w:val="22"/>
+        </w:rPr>
+        <w:t xml:space="preserve">A diesel generator (DG), a pump, or an uninterruptible power supply (UPS — a battery backup that keeps selected circuits live while the generator starts) that is building plant belongs here. A ventilator or a steriliser belongs to the equipment policy. Checking that a steriliser cycle actually sterilised the load belongs to the infection-control sterilisation policy.</w:t>
+      </w:r>
+    </w:p>
+    <w:p>
+      <w:pPr>
+        <w:spacing w:after="140"/>
+      </w:pPr>
+      <w:r>
+        <w:rPr>
+          <w:sz w:val="22"/>
+          <w:szCs w:val="22"/>
+        </w:rPr>
+        <w:t xml:space="preserve">Electricity or water that feeds a piped medical-gas plant may sit on this policy's essential-circuit list. How medical gases are bought, stored and used belongs to the gas policy.</w:t>
+      </w:r>
+    </w:p>
+    <w:p>
+      <w:pPr>
+        <w:spacing w:after="140"/>
+      </w:pPr>
+      <w:r>
+        <w:rPr>
+          <w:sz w:val="22"/>
+          <w:szCs w:val="22"/>
+        </w:rPr>
+        <w:t xml:space="preserve">Biomedical-waste colours, transport and authorisation belong to the infection-control waste policy. Kitchen food safety belongs to that waste and food policy. What a patient is told about cost is not a facilities charge sheet.</w:t>
+      </w:r>
+    </w:p>
+    <w:p>
+      <w:pPr>
+        <w:spacing w:after="140"/>
+      </w:pPr>
+      <w:r>
+        <w:rPr>
+          <w:sz w:val="22"/>
+          <w:szCs w:val="22"/>
+        </w:rPr>
+        <w:t xml:space="preserve">Indian Public Health Standards (IPHS) 2022 and the National Building Code of India, 2016 (NBC 2016) are guides for space and building work, as the local authority applied them to this site. They do not set a NABH bed count, occupancy type, or sprinkler rule for every small hospital.</w:t>
+      </w:r>
+    </w:p>
+    <w:p>
+      <w:pPr>
+        <w:spacing w:after="140"/>
+      </w:pPr>
+      <w:r>
+        <w:rPr>
+          <w:sz w:val="22"/>
+          <w:szCs w:val="22"/>
+        </w:rPr>
+        <w:t xml:space="preserve">Coulliette and Arduino is the dialysis-water guide only if dialysis is on the service directory. If this hospital does not provide dialysis, write that down. Do not copy a reverse-osmosis (RO) plant procedure from another hospital.</w:t>
       </w:r>
     </w:p>
     <w:p>
@@ -946,79 +1186,79 @@
           <w:sz w:val="22"/>
           <w:szCs w:val="22"/>
         </w:rPr>
-        <w:t xml:space="preserve">Preview Hospital matches waiting, clinical, diagnostic, utility, storage and staff space to the services it actually runs. A corridor is not a ward. A sluice is not a sterile store. A service the directory does not provide is recorded as not offered.</w:t>
-      </w:r>
-    </w:p>
-    <w:p>
-      <w:pPr>
-        <w:spacing w:after="140"/>
-      </w:pPr>
-      <w:r>
-        <w:rPr>
-          <w:sz w:val="22"/>
-          <w:szCs w:val="22"/>
-        </w:rPr>
-        <w:t xml:space="preserve">Preview Hospital holds the as-built drawing set the local building and fire authority required for this occupancy under the National Building Code of India, 2016, as applied, and updates that set when the building or a major service run changes. A brochure plan, or a consultant drawing never marked as-built, is not that set.</w:t>
-      </w:r>
-    </w:p>
-    <w:p>
-      <w:pPr>
-        <w:spacing w:after="140"/>
-      </w:pPr>
-      <w:r>
-        <w:rPr>
-          <w:sz w:val="22"/>
-          <w:szCs w:val="22"/>
-        </w:rPr>
-        <w:t xml:space="preserve">Preview Hospital posts internal and external wayfinding a first-time family can follow to the entrance, registration, toilets, emergency, lifts, wards and the way out, in «Gujarati and English». Radiation and PC-PNDT notices are not this wayfinding. Fire-exit plans are not this wayfinding.</w:t>
-      </w:r>
-    </w:p>
-    <w:p>
-      <w:pPr>
-        <w:spacing w:after="140"/>
-      </w:pPr>
-      <w:r>
-        <w:rPr>
-          <w:sz w:val="22"/>
-          <w:szCs w:val="22"/>
-        </w:rPr>
-        <w:t xml:space="preserve">Preview Hospital keeps potable water and electricity available round the clock at the points of use that serve patients and care, including night and holiday, not only at the morning check.</w:t>
-      </w:r>
-    </w:p>
-    <w:p>
-      <w:pPr>
-        <w:spacing w:after="140"/>
-      </w:pPr>
-      <w:r>
-        <w:rPr>
-          <w:sz w:val="22"/>
-          <w:szCs w:val="22"/>
-        </w:rPr>
-        <w:t xml:space="preserve">Preview Hospital provides alternate electricity and water for failure or shortage, and tests that they actually work at «monthly» frequency: a loaded run of the essential-circuit list, not a no-load crank; tank-to-tap movement or pump auto-start, not a sealed tanker memorandum with no night number.</w:t>
-      </w:r>
-    </w:p>
-    <w:p>
-      <w:pPr>
-        <w:spacing w:after="140"/>
-      </w:pPr>
-      <w:r>
-        <w:rPr>
-          <w:sz w:val="22"/>
-          <w:szCs w:val="22"/>
-        </w:rPr>
-        <w:t xml:space="preserve">Preview Hospital takes named energy-efficient and environment-friendly initiatives with an owner, a baseline and a result. Dhillon (2015) is the green-hospital framework, not a rating mandate and not authority to cut clinical ventilation below what the services require.</w:t>
-      </w:r>
-    </w:p>
-    <w:p>
-      <w:pPr>
-        <w:spacing w:after="140"/>
-      </w:pPr>
-      <w:r>
-        <w:rPr>
-          <w:sz w:val="22"/>
-          <w:szCs w:val="22"/>
-        </w:rPr>
-        <w:t xml:space="preserve">Preview Hospital does not treat a generator that is cranked but never takes essential-circuit load, a drawing that does not match the built floor, or a green-hospital poster with no measured initiative, as that duty.</w:t>
+        <w:t xml:space="preserve">Preview Hospital matches waiting rooms, clinical rooms, diagnostic rooms, utility rooms, stores and staff rooms to the services it actually runs. A corridor is not a ward. A sluice is not a sterile store. If the service directory does not list a service, record that it is not offered.</w:t>
+      </w:r>
+    </w:p>
+    <w:p>
+      <w:pPr>
+        <w:spacing w:after="140"/>
+      </w:pPr>
+      <w:r>
+        <w:rPr>
+          <w:sz w:val="22"/>
+          <w:szCs w:val="22"/>
+        </w:rPr>
+        <w:t xml:space="preserve">Preview Hospital keeps the as-built drawing set the local building and fire authority required for this occupancy under NBC 2016, as applied to this site. The set is updated when the building or a major service run changes. A brochure floor plan is not that set. A consultant drawing that was never marked as-built is not that set.</w:t>
+      </w:r>
+    </w:p>
+    <w:p>
+      <w:pPr>
+        <w:spacing w:after="140"/>
+      </w:pPr>
+      <w:r>
+        <w:rPr>
+          <w:sz w:val="22"/>
+          <w:szCs w:val="22"/>
+        </w:rPr>
+        <w:t xml:space="preserve">Preview Hospital puts up direction signs inside and outside so a family visiting for the first time can find the entrance, registration, toilets, emergency, lifts, wards and the way out. Signs are in «Gujarati and English». Radiation and PC-PNDT notices are not these direction signs. Fire-exit plans are not these direction signs.</w:t>
+      </w:r>
+    </w:p>
+    <w:p>
+      <w:pPr>
+        <w:spacing w:after="140"/>
+      </w:pPr>
+      <w:r>
+        <w:rPr>
+          <w:sz w:val="22"/>
+          <w:szCs w:val="22"/>
+        </w:rPr>
+        <w:t xml:space="preserve">Preview Hospital keeps drinking water and electricity available day and night at the taps and circuits that serve patients and care. This includes night and holidays. A morning check is not enough.</w:t>
+      </w:r>
+    </w:p>
+    <w:p>
+      <w:pPr>
+        <w:spacing w:after="140"/>
+      </w:pPr>
+      <w:r>
+        <w:rPr>
+          <w:sz w:val="22"/>
+          <w:szCs w:val="22"/>
+        </w:rPr>
+        <w:t xml:space="preserve">Preview Hospital provides backup electricity and backup water for a failure or shortage. It tests that they actually work «monthly». The electricity test is a loaded run of the essential-circuit list (the generator takes the real hospital load, not just a start with no load). The water test is water moving from tank to tap, or a pump that starts on its own. A sealed tanker letter with no night phone number is not a backup test.</w:t>
+      </w:r>
+    </w:p>
+    <w:p>
+      <w:pPr>
+        <w:spacing w:after="140"/>
+      </w:pPr>
+      <w:r>
+        <w:rPr>
+          <w:sz w:val="22"/>
+          <w:szCs w:val="22"/>
+        </w:rPr>
+        <w:t xml:space="preserve">Preview Hospital runs named energy-saving and environment-friendly projects. Each project has an owner, a starting figure (baseline), and a result. Dhillon (2015) is the green-hospital guide. It is not a rating this hospital must hold. It does not allow cutting clinical ventilation below what the services need.</w:t>
+      </w:r>
+    </w:p>
+    <w:p>
+      <w:pPr>
+        <w:spacing w:after="140"/>
+      </w:pPr>
+      <w:r>
+        <w:rPr>
+          <w:sz w:val="22"/>
+          <w:szCs w:val="22"/>
+        </w:rPr>
+        <w:t xml:space="preserve">Preview Hospital does not treat these as meeting this policy: a generator that is started but never takes the essential-circuit load; a drawing that does not match the building; a green-hospital poster with no measured project.</w:t>
       </w:r>
     </w:p>
     <w:p>
@@ -1039,7 +1279,7 @@
           <w:sz w:val="22"/>
           <w:szCs w:val="22"/>
         </w:rPr>
-        <w:t xml:space="preserve">The following are prohibited. There is no operational exception and no "until the vendor comes" exception.</w:t>
+        <w:t xml:space="preserve">These acts are banned. There is no operational exception. "Until the vendor comes" is not an exception.</w:t>
       </w:r>
     </w:p>
     <w:p>
@@ -1051,7 +1291,7 @@
           <w:sz w:val="22"/>
           <w:szCs w:val="22"/>
         </w:rPr>
-        <w:t xml:space="preserve">1. Using a corridor as a ward, a sluice as a sterile store, or another hospital's floor plate for a service this hospital's directory does not provide.</w:t>
+        <w:t xml:space="preserve">1. Using a corridor as a ward, or a sluice as a sterile store. Copying another hospital's floor layout for a service this hospital's directory does not list.</w:t>
       </w:r>
     </w:p>
     <w:p>
@@ -1063,7 +1303,7 @@
           <w:sz w:val="22"/>
           <w:szCs w:val="22"/>
         </w:rPr>
-        <w:t xml:space="preserve">2. Using a brochure floor plan, or a consultant drawing never marked as-built, as the occupancy set.</w:t>
+        <w:t xml:space="preserve">2. Using a brochure floor plan, or a consultant drawing never marked as-built, as the official occupancy drawing set.</w:t>
       </w:r>
     </w:p>
     <w:p>
@@ -1075,7 +1315,7 @@
           <w:sz w:val="22"/>
           <w:szCs w:val="22"/>
         </w:rPr>
-        <w:t xml:space="preserve">3. Occupying a newly altered floor before the controlled as-built set has been updated for that change.</w:t>
+        <w:t xml:space="preserve">3. Using a newly altered floor before the official as-built drawings have been updated for that change.</w:t>
       </w:r>
     </w:p>
     <w:p>
@@ -1087,7 +1327,7 @@
           <w:sz w:val="22"/>
           <w:szCs w:val="22"/>
         </w:rPr>
-        <w:t xml:space="preserve">4. Offering radiation, restricted-area, pregnancy-caution or PC-PNDT notices, or the fire-exit display, as the wayfinding system.</w:t>
+        <w:t xml:space="preserve">4. Using radiation, restricted-area, pregnancy-caution or PC-PNDT notices, or the fire-exit display, as the hospital's direction-sign system.</w:t>
       </w:r>
     </w:p>
     <w:p>
@@ -1099,7 +1339,7 @@
           <w:sz w:val="22"/>
           <w:szCs w:val="22"/>
         </w:rPr>
-        <w:t xml:space="preserve">5. Treating a morning check as round-the-clock availability. A tap that should serve patients and a circuit that should serve care must be live at night and on a holiday.</w:t>
+        <w:t xml:space="preserve">5. Treating a morning check as proof that water and power work all day and night. A tap that should serve patients, and a circuit that should serve care, must be live at night and on a holiday.</w:t>
       </w:r>
     </w:p>
     <w:p>
@@ -1111,7 +1351,7 @@
           <w:sz w:val="22"/>
           <w:szCs w:val="22"/>
         </w:rPr>
-        <w:t xml:space="preserve">6. Drawing drinking or clinical-wash water from a tap that failed its last quality test, or from a point labelled non-potable.</w:t>
+        <w:t xml:space="preserve">6. Taking drinking water or clinical-wash water from a tap that failed its last quality test, or from a tap labelled not safe to drink (non-potable).</w:t>
       </w:r>
     </w:p>
     <w:p>
@@ -1123,7 +1363,7 @@
           <w:sz w:val="22"/>
           <w:szCs w:val="22"/>
         </w:rPr>
-        <w:t xml:space="preserve">7. Treating a no-load generator crank, a UPS that has not been discharge-tested, a seized tank outlet, or a tanker memorandum with no night number, as a functioning backup test.</w:t>
+        <w:t xml:space="preserve">7. Treating any of these as a working backup test: starting the generator with no hospital load; a UPS whose batteries have not been discharge-tested; a tank outlet that will not open; a tanker letter with no night phone number.</w:t>
       </w:r>
     </w:p>
     <w:p>
@@ -1135,7 +1375,7 @@
           <w:sz w:val="22"/>
           <w:szCs w:val="22"/>
         </w:rPr>
-        <w:t xml:space="preserve">8. Signing a backup-test sheet for a generator that did not take the essential-circuit list, or for a water backup that did not move water to a point of use.</w:t>
+        <w:t xml:space="preserve">8. Signing a backup-test sheet for a generator that did not take the essential-circuit list, or for a water backup that did not move water to a tap or point of use.</w:t>
       </w:r>
     </w:p>
     <w:p>
@@ -1147,7 +1387,7 @@
           <w:sz w:val="22"/>
           <w:szCs w:val="22"/>
         </w:rPr>
-        <w:t xml:space="preserve">9. Shutting clinical ventilation, HVAC or essential circuits to show an energy saving.</w:t>
+        <w:t xml:space="preserve">9. Switching off clinical ventilation, heating, ventilation and air-conditioning (HVAC), or essential circuits in order to show an energy saving.</w:t>
       </w:r>
     </w:p>
     <w:p>
@@ -1159,7 +1399,7 @@
           <w:sz w:val="22"/>
           <w:szCs w:val="22"/>
         </w:rPr>
-        <w:t xml:space="preserve">10. Offering a green-hospital poster, a single LED retrofit as the whole programme, an unused rooftop array, an energy audit that produced no action, or a tree-planting photograph, as this year's initiative.</w:t>
+        <w:t xml:space="preserve">10. Treating any of these as this year's energy project: a green-hospital poster; one LED lighting change offered as the whole programme; unused solar panels on the roof; an energy audit that led to no action; a tree-planting photograph.</w:t>
       </w:r>
     </w:p>
     <w:p>
@@ -1171,19 +1411,19 @@
           <w:sz w:val="22"/>
           <w:szCs w:val="22"/>
         </w:rPr>
-        <w:t xml:space="preserve">11. Rewriting biomedical-waste colours, transport or authorisation as an environment-friendly measure. That waste stream stays the infection-control waste programme.</w:t>
-      </w:r>
-    </w:p>
-    <w:p>
-      <w:pPr>
-        <w:spacing w:after="140"/>
-      </w:pPr>
-      <w:r>
-        <w:rPr>
-          <w:sz w:val="22"/>
-          <w:szCs w:val="22"/>
-        </w:rPr>
-        <w:t xml:space="preserve">A person who finds a dry clinical tap, a dark essential circuit, a drawing that does not match the floor, or a backup test being signed without load, reports it the same shift to the «Maintenance In-Charge». If that person is not on site, the report goes to the «named person on the after-hours facilities roster».</w:t>
+        <w:t xml:space="preserve">11. Using biomedical-waste colours, transport or authorisation as an environment-friendly measure. That waste stream stays with the infection-control waste policy.</w:t>
+      </w:r>
+    </w:p>
+    <w:p>
+      <w:pPr>
+        <w:spacing w:after="140"/>
+      </w:pPr>
+      <w:r>
+        <w:rPr>
+          <w:sz w:val="22"/>
+          <w:szCs w:val="22"/>
+        </w:rPr>
+        <w:t xml:space="preserve">If you find a dry clinical tap, a dark essential circuit, a drawing that does not match the floor, or a backup test being signed without load, report it the same shift to the «Maintenance In-Charge». If that person is not on site, report it to the «named person on the after-hours facilities roster».</w:t>
       </w:r>
     </w:p>
     <w:p>
@@ -1213,31 +1453,43 @@
           <w:sz w:val="22"/>
           <w:szCs w:val="22"/>
         </w:rPr>
-        <w:t xml:space="preserve">The defined scope of services is the service directory. This section is the built match: waiting, clinical, diagnostic, utility, storage and staff spaces this hospital actually runs can physically hold those services.</w:t>
-      </w:r>
-    </w:p>
-    <w:p>
-      <w:pPr>
-        <w:spacing w:after="140"/>
-      </w:pPr>
-      <w:r>
-        <w:rPr>
-          <w:sz w:val="22"/>
-          <w:szCs w:val="22"/>
-        </w:rPr>
-        <w:t xml:space="preserve">How appropriateness is judged — against that directory and, as frameworks, Indian Public Health Standards 2022 and NBC 2016 occupancy as the local authority applied it — is held by the «Maintenance In-Charge» as a dated space-to-scope record. A mismatch is reported to the Medical Superintendent. A service the directory does not provide is a recorded absence, not a copied intensive-care floor plate.</w:t>
-      </w:r>
-    </w:p>
-    <w:p>
-      <w:pPr>
-        <w:spacing w:after="140"/>
-      </w:pPr>
-      <w:r>
-        <w:rPr>
-          <w:sz w:val="22"/>
-          <w:szCs w:val="22"/>
-        </w:rPr>
-        <w:t xml:space="preserve">When a service is added or withdrawn, the space record is updated before the service is offered or the room is re-used. Clinical heads confirm that the space still matches the services they actually run.</w:t>
+        <w:t xml:space="preserve">The list of services this hospital offers sits in the service directory. This section checks the built match. Waiting rooms, clinical rooms, diagnostic rooms, utility rooms, stores and staff rooms must be able to hold the services this hospital actually runs.</w:t>
+      </w:r>
+    </w:p>
+    <w:p>
+      <w:pPr>
+        <w:spacing w:after="140"/>
+      </w:pPr>
+      <w:r>
+        <w:rPr>
+          <w:sz w:val="22"/>
+          <w:szCs w:val="22"/>
+        </w:rPr>
+        <w:t xml:space="preserve">The «Maintenance In-Charge» keeps a dated record that compares space to the service directory. Indian Public Health Standards 2022 and NBC 2016 occupancy, as the local authority applied them, are guides for that judgement. They are not a NABH bed-count rule.</w:t>
+      </w:r>
+    </w:p>
+    <w:p>
+      <w:pPr>
+        <w:spacing w:after="140"/>
+      </w:pPr>
+      <w:r>
+        <w:rPr>
+          <w:sz w:val="22"/>
+          <w:szCs w:val="22"/>
+        </w:rPr>
+        <w:t xml:space="preserve">Report a mismatch to the Medical Superintendent. If the directory does not list a service, write down that this hospital does not offer it. Do not copy another hospital's intensive-care floor layout.</w:t>
+      </w:r>
+    </w:p>
+    <w:p>
+      <w:pPr>
+        <w:spacing w:after="140"/>
+      </w:pPr>
+      <w:r>
+        <w:rPr>
+          <w:sz w:val="22"/>
+          <w:szCs w:val="22"/>
+        </w:rPr>
+        <w:t xml:space="preserve">When a service is added or stopped, update the space record before the service is offered or the room is used for something else. Clinical heads confirm that the space still matches the services they actually run.</w:t>
       </w:r>
     </w:p>
     <w:p>
@@ -1258,31 +1510,31 @@
           <w:sz w:val="22"/>
           <w:szCs w:val="22"/>
         </w:rPr>
-        <w:t xml:space="preserve">NBC 2016 is the Indian building-code framework the local building and fire authority typically uses for occupancy, means of egress and services drawings. This hospital holds the as-built set that occupancy and that authority actually required.</w:t>
-      </w:r>
-    </w:p>
-    <w:p>
-      <w:pPr>
-        <w:spacing w:after="140"/>
-      </w:pPr>
-      <w:r>
-        <w:rPr>
-          <w:sz w:val="22"/>
-          <w:szCs w:val="22"/>
-        </w:rPr>
-        <w:t xml:space="preserve">The controlled set includes, as this occupancy required: architectural; structural; electrical single-line; plumbing and water; fire and detection sheets the fire programme will use; and medical-gas sheets the gas programme will use if a piped system exists. Those other programmes use working copies. This policy holds the master.</w:t>
-      </w:r>
-    </w:p>
-    <w:p>
-      <w:pPr>
-        <w:spacing w:after="140"/>
-      </w:pPr>
-      <w:r>
-        <w:rPr>
-          <w:sz w:val="22"/>
-          <w:szCs w:val="22"/>
-        </w:rPr>
-        <w:t xml:space="preserve">The «Maintenance In-Charge» updates the set when the building or a major service run changes, before the altered floor is reoccupied. A brochure floor plan is not this set.</w:t>
+        <w:t xml:space="preserve">NBC 2016 is the Indian building-code guide the local building and fire authority usually uses for occupancy, escape routes and services drawings. This hospital holds the as-built set that occupancy and that authority actually required.</w:t>
+      </w:r>
+    </w:p>
+    <w:p>
+      <w:pPr>
+        <w:spacing w:after="140"/>
+      </w:pPr>
+      <w:r>
+        <w:rPr>
+          <w:sz w:val="22"/>
+          <w:szCs w:val="22"/>
+        </w:rPr>
+        <w:t xml:space="preserve">The official set includes, as this occupancy required: architectural drawings; structural drawings; electrical single-line drawings; plumbing and water drawings; fire and detection sheets the fire policy will use; and medical-gas sheets the gas policy will use if a piped system exists. Those other policies use working copies. This policy holds the master set.</w:t>
+      </w:r>
+    </w:p>
+    <w:p>
+      <w:pPr>
+        <w:spacing w:after="140"/>
+      </w:pPr>
+      <w:r>
+        <w:rPr>
+          <w:sz w:val="22"/>
+          <w:szCs w:val="22"/>
+        </w:rPr>
+        <w:t xml:space="preserve">The «Maintenance In-Charge» updates the set when the building or a major service run changes. Update it before people use the altered floor again. A brochure floor plan is not this set.</w:t>
       </w:r>
     </w:p>
     <w:p>
@@ -1303,31 +1555,31 @@
           <w:sz w:val="22"/>
           <w:szCs w:val="22"/>
         </w:rPr>
-        <w:t xml:space="preserve">Wayfinding is how a first-time family finds the entrance, registration, toilets, emergency, lifts, wards and the way out, in language they actually read. Languages and scripts on the public route are «Gujarati and English». A visitor who cannot read the majority language is still directed by «pictograms at entrance, registration, emergency, toilets and exit».</w:t>
-      </w:r>
-    </w:p>
-    <w:p>
-      <w:pPr>
-        <w:spacing w:after="140"/>
-      </w:pPr>
-      <w:r>
-        <w:rPr>
-          <w:sz w:val="22"/>
-          <w:szCs w:val="22"/>
-        </w:rPr>
-        <w:t xml:space="preserve">Radiation, restricted-area, pregnancy-caution and PC-PNDT notices are not this system. Fire-exit plans are the fire programme; they must not contradict these signs.</w:t>
-      </w:r>
-    </w:p>
-    <w:p>
-      <w:pPr>
-        <w:spacing w:after="140"/>
-      </w:pPr>
-      <w:r>
-        <w:rPr>
-          <w:sz w:val="22"/>
-          <w:szCs w:val="22"/>
-        </w:rPr>
-        <w:t xml:space="preserve">The «Maintenance In-Charge» inspects faded, contradictory or missing signs «monthly». Department in-charges do not cover a public sign with a clinical notice.</w:t>
+        <w:t xml:space="preserve">Wayfinding means direction signs. A family visiting for the first time should be able to find the entrance, registration, toilets, emergency, lifts, wards and the way out, in a language they can read. Languages on the public route are «Gujarati and English». A visitor who cannot read the majority language is still directed by «pictograms at entrance, registration, emergency, toilets and exit».</w:t>
+      </w:r>
+    </w:p>
+    <w:p>
+      <w:pPr>
+        <w:spacing w:after="140"/>
+      </w:pPr>
+      <w:r>
+        <w:rPr>
+          <w:sz w:val="22"/>
+          <w:szCs w:val="22"/>
+        </w:rPr>
+        <w:t xml:space="preserve">Radiation, restricted-area, pregnancy-caution and PC-PNDT notices are not this sign system. Fire-exit plans belong to the fire policy. They must not contradict these signs.</w:t>
+      </w:r>
+    </w:p>
+    <w:p>
+      <w:pPr>
+        <w:spacing w:after="140"/>
+      </w:pPr>
+      <w:r>
+        <w:rPr>
+          <w:sz w:val="22"/>
+          <w:szCs w:val="22"/>
+        </w:rPr>
+        <w:t xml:space="preserve">The «Maintenance In-Charge» checks faded, contradictory or missing signs «monthly». Department in-charges must not cover a public sign with a clinical notice.</w:t>
       </w:r>
     </w:p>
     <w:p>
@@ -1348,55 +1600,91 @@
           <w:sz w:val="22"/>
           <w:szCs w:val="22"/>
         </w:rPr>
-        <w:t xml:space="preserve">Availability is the duty: a tap that should serve patients and a circuit that should serve care are live at 03:00, not only at the morning check.</w:t>
-      </w:r>
-    </w:p>
-    <w:p>
-      <w:pPr>
-        <w:spacing w:after="140"/>
-      </w:pPr>
-      <w:r>
-        <w:rPr>
-          <w:sz w:val="22"/>
-          <w:szCs w:val="22"/>
-        </w:rPr>
-        <w:t xml:space="preserve">Potable water. Points of use this hospital has defined for drinking, clinical wash, kitchen (as the food programme uses water, not as this document rewriting that programme), CSSD if present, and dialysis if present, actually deliver water when needed. A roof tank that is full on paper while the operating-theatre scrub is dry because a valve is shut is a failure of this policy.</w:t>
-      </w:r>
-    </w:p>
-    <w:p>
-      <w:pPr>
-        <w:spacing w:after="140"/>
-      </w:pPr>
-      <w:r>
-        <w:rPr>
-          <w:sz w:val="22"/>
-          <w:szCs w:val="22"/>
-        </w:rPr>
-        <w:t xml:space="preserve">Quality testing is not a second NABH interval invented here. WHO Guidelines for Drinking-water Quality, 4th edition, is the framework for which parameters are tested, at which points, and how often. Local values: parameters «________»; sample points «________»; interval «as WHO GDWQ 4th edition requires for this supply». Dialysis water, if dialysis is in the service directory, uses Coulliette and Arduino as the haemodialysis-water framework; if dialysis is not provided, that is a recorded absence, not a copied reverse-osmosis SOP. Legionella control for aerosolising systems this hospital actually runs (cooling towers, decorative fountains, unused dead-legs) is «the written stagnant-water and Legionella control for systems this hospital actually runs», or a recorded absence if none of those systems exist.</w:t>
-      </w:r>
-    </w:p>
-    <w:p>
-      <w:pPr>
-        <w:spacing w:after="140"/>
-      </w:pPr>
-      <w:r>
-        <w:rPr>
-          <w:sz w:val="22"/>
-          <w:szCs w:val="22"/>
-        </w:rPr>
-        <w:t xml:space="preserve">Electricity. Essential clinical and life-safety circuits — at minimum the areas this hospital actually runs that cannot wait for restoration: emergency; operating theatre, labour, intensive or high-dependency care, nursery and blood bank if those services exist; ventilators and their compressors; emergency lighting; fire detection; and medical-gas plant or manifold alarms — remain energised. A live incoming meter with a dark theatre because a changeover never closed is a failure of this policy.</w:t>
-      </w:r>
-    </w:p>
-    <w:p>
-      <w:pPr>
-        <w:spacing w:after="140"/>
-      </w:pPr>
-      <w:r>
-        <w:rPr>
-          <w:sz w:val="22"/>
-          <w:szCs w:val="22"/>
-        </w:rPr>
-        <w:t xml:space="preserve">The «Maintenance In-Charge» watches availability, including night and holiday. An interruption is recorded the same shift. Restoration is the same shift unless the Medical Superintendent has accepted a dated compensating arrangement. This policy does not invent a NABH minutes-to-restore clock. After hours, the «named person on the after-hours facilities roster» is who a night nurse calls when a tap is dry or an essential circuit is dark.</w:t>
+        <w:t xml:space="preserve">Potable water means water that is safe to drink. Availability means a tap that should serve patients, and a circuit that should serve care, work at 3 a.m. A morning check is not enough.</w:t>
+      </w:r>
+    </w:p>
+    <w:p>
+      <w:pPr>
+        <w:spacing w:after="140"/>
+      </w:pPr>
+      <w:r>
+        <w:rPr>
+          <w:sz w:val="22"/>
+          <w:szCs w:val="22"/>
+        </w:rPr>
+        <w:t xml:space="preserve">Drinking water, clinical-wash water, kitchen water (as the food policy uses it — this policy does not rewrite that policy), the central sterile supply department (CSSD) if present, and dialysis if present, must actually deliver water when needed. A roof tank that is full on paper while the operating-theatre scrub is dry because a valve is shut is a failure of this policy.</w:t>
+      </w:r>
+    </w:p>
+    <w:p>
+      <w:pPr>
+        <w:spacing w:after="140"/>
+      </w:pPr>
+      <w:r>
+        <w:rPr>
+          <w:sz w:val="22"/>
+          <w:szCs w:val="22"/>
+        </w:rPr>
+        <w:t xml:space="preserve">Water-quality testing is not a second NABH timetable invented here. The World Health Organization (WHO) Guidelines for Drinking-water Quality, 4th edition (GDWQ), is the guide for which tests are done, at which taps, and how often. Local values: parameters «________»; sample points «________»; interval «as WHO GDWQ 4th edition requires for this supply».</w:t>
+      </w:r>
+    </w:p>
+    <w:p>
+      <w:pPr>
+        <w:spacing w:after="140"/>
+      </w:pPr>
+      <w:r>
+        <w:rPr>
+          <w:sz w:val="22"/>
+          <w:szCs w:val="22"/>
+        </w:rPr>
+        <w:t xml:space="preserve">If dialysis is on the service directory, dialysis water follows Coulliette and Arduino as the haemodialysis-water guide. If dialysis is not provided, write that down. Do not copy an RO-plant procedure.</w:t>
+      </w:r>
+    </w:p>
+    <w:p>
+      <w:pPr>
+        <w:spacing w:after="140"/>
+      </w:pPr>
+      <w:r>
+        <w:rPr>
+          <w:sz w:val="22"/>
+          <w:szCs w:val="22"/>
+        </w:rPr>
+        <w:t xml:space="preserve">Legionella (a bacterium that can grow in warm standing water) control applies to spray systems this hospital actually runs, such as cooling towers, decorative fountains, or unused dead-end pipes. The method is «the written stagnant-water and Legionella control for systems this hospital actually runs». If none of those systems exist, write that down.</w:t>
+      </w:r>
+    </w:p>
+    <w:p>
+      <w:pPr>
+        <w:spacing w:after="140"/>
+      </w:pPr>
+      <w:r>
+        <w:rPr>
+          <w:sz w:val="22"/>
+          <w:szCs w:val="22"/>
+        </w:rPr>
+        <w:t xml:space="preserve">Essential clinical and life-safety circuits must stay live. At minimum this covers the areas this hospital actually runs that cannot wait for power to return: emergency; operating theatre, labour, intensive or high-dependency care, nursery and blood bank if those services exist; ventilators and their compressors; emergency lighting; fire detection; and medical-gas plant or manifold alarms. A live incoming meter with a dark theatre because a changeover never closed is a failure of this policy.</w:t>
+      </w:r>
+    </w:p>
+    <w:p>
+      <w:pPr>
+        <w:spacing w:after="140"/>
+      </w:pPr>
+      <w:r>
+        <w:rPr>
+          <w:sz w:val="22"/>
+          <w:szCs w:val="22"/>
+        </w:rPr>
+        <w:t xml:space="preserve">The «Maintenance In-Charge» watches availability, including night and holiday. Record an interruption the same shift. Restore it the same shift unless the Medical Superintendent has accepted a dated temporary arrangement. This policy does not invent a NABH minutes-to-restore clock.</w:t>
+      </w:r>
+    </w:p>
+    <w:p>
+      <w:pPr>
+        <w:spacing w:after="140"/>
+      </w:pPr>
+      <w:r>
+        <w:rPr>
+          <w:sz w:val="22"/>
+          <w:szCs w:val="22"/>
+        </w:rPr>
+        <w:t xml:space="preserve">After hours, a night nurse calls the «named person on the after-hours facilities roster» when a tap is dry or an essential circuit is dark.</w:t>
       </w:r>
     </w:p>
     <w:p>
@@ -1417,43 +1705,79 @@
           <w:sz w:val="22"/>
           <w:szCs w:val="22"/>
         </w:rPr>
-        <w:t xml:space="preserve">When incoming electricity fails or is shed, the backup that will carry the essential circuits named in 5.4 is: the diesel generator; UPS or inverter for circuits that cannot tolerate a start delay (ventilators, monitors, lights over an open table); and any automatic mains-failure changeover this hospital has installed. The failure this test exists to catch is a weekly no-load crank that proves the starter motor, not that the set will take theatre, intensive care and emergency lighting together, or a UPS whose batteries have not been discharge-tested. A start-only test is not a functioning test.</w:t>
-      </w:r>
-    </w:p>
-    <w:p>
-      <w:pPr>
-        <w:spacing w:after="140"/>
-      </w:pPr>
-      <w:r>
-        <w:rPr>
-          <w:sz w:val="22"/>
-          <w:szCs w:val="22"/>
-        </w:rPr>
-        <w:t xml:space="preserve">How the loaded test is done: essential-circuit load, not the workshop socket; the «Maintenance In-Charge» present so a changeover failure is seen before a night outage; fuel, coolant and battery condition recorded. Frequency: «monthly». IS 732 wiring practice and IS 3043 earthing inform how the installation should behave; they are NBC-pointed frameworks, not extra statutes in the disclaimer. Central Electricity Authority electrical-supply regulations are not a numbered FMS chapter reference and are not imported here.</w:t>
-      </w:r>
-    </w:p>
-    <w:p>
-      <w:pPr>
-        <w:spacing w:after="140"/>
-      </w:pPr>
-      <w:r>
-        <w:rPr>
-          <w:sz w:val="22"/>
-          <w:szCs w:val="22"/>
-        </w:rPr>
-        <w:t xml:space="preserve">When municipal or borewell water fails or is short, the backup that actually moves water to the points of use in 5.4 is: reserve tanks with working float valves; a second borewell if this hospital has one; a tanker contract that can deliver at night; and pumps that auto-start. A sealed tanker memorandum with no night number, or a tank whose outlet valve has seized, is not backup. The test proves tank-to-tap movement, pump auto-start, or tanker mobilisation. Frequency: «monthly».</w:t>
-      </w:r>
-    </w:p>
-    <w:p>
-      <w:pPr>
-        <w:spacing w:after="140"/>
-      </w:pPr>
-      <w:r>
-        <w:rPr>
-          <w:sz w:val="22"/>
-          <w:szCs w:val="22"/>
-        </w:rPr>
-        <w:t xml:space="preserve">A utility failure that is declared an emergency is handed to the fire-and-non-fire programme. This section is the test before that night.</w:t>
+        <w:t xml:space="preserve">When incoming electricity fails or is cut, backup must carry the essential circuits named in 5.4. Backup is: the diesel generator; UPS or inverter for circuits that cannot wait for the generator to start (ventilators, monitors, lights over an open table); and any automatic mains-failure changeover this hospital has installed.</w:t>
+      </w:r>
+    </w:p>
+    <w:p>
+      <w:pPr>
+        <w:spacing w:after="140"/>
+      </w:pPr>
+      <w:r>
+        <w:rPr>
+          <w:sz w:val="22"/>
+          <w:szCs w:val="22"/>
+        </w:rPr>
+        <w:t xml:space="preserve">The test that matters is a loaded test. The generator takes the real essential-circuit list, not a start with no hospital load. A weekly no-load start only proves the starter motor. It does not prove the set will take theatre, intensive care and emergency lighting together. A UPS whose batteries have not been discharge-tested is not a working backup. Starting the engine only is not a working test.</w:t>
+      </w:r>
+    </w:p>
+    <w:p>
+      <w:pPr>
+        <w:spacing w:after="140"/>
+      </w:pPr>
+      <w:r>
+        <w:rPr>
+          <w:sz w:val="22"/>
+          <w:szCs w:val="22"/>
+        </w:rPr>
+        <w:t xml:space="preserve">How the loaded test is done: use the essential-circuit load, not the workshop socket. The «Maintenance In-Charge» is present so a changeover failure is seen before a night outage. Record fuel, coolant and battery condition. Frequency: «monthly».</w:t>
+      </w:r>
+    </w:p>
+    <w:p>
+      <w:pPr>
+        <w:spacing w:after="140"/>
+      </w:pPr>
+      <w:r>
+        <w:rPr>
+          <w:sz w:val="22"/>
+          <w:szCs w:val="22"/>
+        </w:rPr>
+        <w:t xml:space="preserve">Indian Standard (IS) 732 (wiring practice) and IS 3043 (earthing) are NBC-pointed guides for how the installation should behave. They are not extra laws in the disclaimer. Central Electricity Authority electrical-supply regulations are not a numbered FMS chapter reference. They are not imported into this policy.</w:t>
+      </w:r>
+    </w:p>
+    <w:p>
+      <w:pPr>
+        <w:spacing w:after="140"/>
+      </w:pPr>
+      <w:r>
+        <w:rPr>
+          <w:sz w:val="22"/>
+          <w:szCs w:val="22"/>
+        </w:rPr>
+        <w:t xml:space="preserve">When municipal or borewell water fails or is short, backup must actually move water to the points of use in 5.4. Backup is: reserve tanks with working float valves; a second borewell if this hospital has one; a tanker contract that can deliver at night; and pumps that start on their own. A sealed tanker letter with no night number is not backup. A tank whose outlet valve will not open is not backup.</w:t>
+      </w:r>
+    </w:p>
+    <w:p>
+      <w:pPr>
+        <w:spacing w:after="140"/>
+      </w:pPr>
+      <w:r>
+        <w:rPr>
+          <w:sz w:val="22"/>
+          <w:szCs w:val="22"/>
+        </w:rPr>
+        <w:t xml:space="preserve">The water test proves tank-to-tap movement, pump auto-start, or tanker call-out. Frequency: «monthly».</w:t>
+      </w:r>
+    </w:p>
+    <w:p>
+      <w:pPr>
+        <w:spacing w:after="140"/>
+      </w:pPr>
+      <w:r>
+        <w:rPr>
+          <w:sz w:val="22"/>
+          <w:szCs w:val="22"/>
+        </w:rPr>
+        <w:t xml:space="preserve">If a utility failure is declared an emergency, the fire-and-non-fire policy takes over. This section is the test done before that night.</w:t>
       </w:r>
     </w:p>
     <w:p>
@@ -1474,43 +1798,55 @@
           <w:sz w:val="22"/>
           <w:szCs w:val="22"/>
         </w:rPr>
-        <w:t xml:space="preserve">Round-the-clock availability and backup testing are 5.4 and 5.5. This section is that the organisation takes initiatives toward using less energy and harming the environment less, while still meeting those availability duties.</w:t>
-      </w:r>
-    </w:p>
-    <w:p>
-      <w:pPr>
-        <w:spacing w:after="140"/>
-      </w:pPr>
-      <w:r>
-        <w:rPr>
-          <w:sz w:val="22"/>
-          <w:szCs w:val="22"/>
-        </w:rPr>
-        <w:t xml:space="preserve">Dhillon, V. S. (2015), Green Hospital and Climate Change, is the chapter's green-hospital framework. It is not a mandate to hold a named green-building rating, not a pasted energy-audit form, and not authority to reduce clinical ventilation below what this hospital's services require.</w:t>
-      </w:r>
-    </w:p>
-    <w:p>
-      <w:pPr>
-        <w:spacing w:after="140"/>
-      </w:pPr>
-      <w:r>
-        <w:rPr>
-          <w:sz w:val="22"/>
-          <w:szCs w:val="22"/>
-        </w:rPr>
-        <w:t xml:space="preserve">Each calendar year the Medical Superintendent names the initiatives in force, the owner, the baseline and the review date. Initiatives this hospital actually runs — measured electricity or fuel use, lighting or HVAC set-back in non-clinical hours, solar if installed, rainwater or condensate reuse if installed, segregation of municipal waste from the biomedical stream, reduction of single-use non-clinical materials — are recorded with a baseline and a result.</w:t>
-      </w:r>
-    </w:p>
-    <w:p>
-      <w:pPr>
-        <w:spacing w:after="140"/>
-      </w:pPr>
-      <w:r>
-        <w:rPr>
-          <w:sz w:val="22"/>
-          <w:szCs w:val="22"/>
-        </w:rPr>
-        <w:t xml:space="preserve">An unused rooftop solar array, an energy audit that produced no action, a single LED retrofit offered as the whole programme, or a tree-planting photograph, is not this year's initiative. Clinical ventilation is not reduced below what the services require. Biomedical-waste colour, transport and authorisation stay the infection-control waste programme; environment-friendly hospital here is not a second waste SOP.</w:t>
+        <w:t xml:space="preserve">Keeping water and power available, and testing backups, are sections 5.4 and 5.5. This section is separate. The hospital must run projects that use less energy and harm the environment less, without breaking those availability duties.</w:t>
+      </w:r>
+    </w:p>
+    <w:p>
+      <w:pPr>
+        <w:spacing w:after="140"/>
+      </w:pPr>
+      <w:r>
+        <w:rPr>
+          <w:sz w:val="22"/>
+          <w:szCs w:val="22"/>
+        </w:rPr>
+        <w:t xml:space="preserve">Dhillon, V. S. (2015), Green Hospital and Climate Change, is this chapter's green-hospital guide. It is not a requirement to hold a named green-building rating. It is not a pasted energy-audit form. It does not allow reducing clinical ventilation below what this hospital's services need.</w:t>
+      </w:r>
+    </w:p>
+    <w:p>
+      <w:pPr>
+        <w:spacing w:after="140"/>
+      </w:pPr>
+      <w:r>
+        <w:rPr>
+          <w:sz w:val="22"/>
+          <w:szCs w:val="22"/>
+        </w:rPr>
+        <w:t xml:space="preserve">Each calendar year the Medical Superintendent names the projects in force, the owner, the starting figure and the review date. Record projects this hospital actually runs, with a starting figure and a result. Examples: measured electricity or fuel use; lighting or HVAC set-back in non-clinical hours; solar if installed; rainwater or condensate reuse if installed; keeping ordinary municipal waste out of the biomedical-waste stream; reducing single-use non-clinical materials.</w:t>
+      </w:r>
+    </w:p>
+    <w:p>
+      <w:pPr>
+        <w:spacing w:after="140"/>
+      </w:pPr>
+      <w:r>
+        <w:rPr>
+          <w:sz w:val="22"/>
+          <w:szCs w:val="22"/>
+        </w:rPr>
+        <w:t xml:space="preserve">None of these counts as this year's project: unused solar panels on the roof; an energy audit that led to no action; one LED lighting change offered as the whole programme; a tree-planting photograph. Do not reduce clinical ventilation below what the services need.</w:t>
+      </w:r>
+    </w:p>
+    <w:p>
+      <w:pPr>
+        <w:spacing w:after="140"/>
+      </w:pPr>
+      <w:r>
+        <w:rPr>
+          <w:sz w:val="22"/>
+          <w:szCs w:val="22"/>
+        </w:rPr>
+        <w:t xml:space="preserve">Biomedical-waste colour, transport and authorisation stay with the infection-control waste policy. An environment-friendly hospital here is not a second waste procedure.</w:t>
       </w:r>
     </w:p>
     <w:p>
@@ -1531,99 +1867,99 @@
           <w:sz w:val="22"/>
           <w:szCs w:val="22"/>
         </w:rPr>
-        <w:t xml:space="preserve">A person who is about to do any of the following does not proceed:</w:t>
-      </w:r>
-    </w:p>
-    <w:p>
-      <w:pPr>
-        <w:pStyle w:val="ListParagraph"/>
-        <w:numPr>
-          <w:ilvl w:val="0"/>
-          <w:numId w:val="1"/>
-        </w:numPr>
-        <w:spacing w:after="60"/>
-      </w:pPr>
-      <w:r>
-        <w:rPr>
-          <w:sz w:val="22"/>
-          <w:szCs w:val="22"/>
-        </w:rPr>
-        <w:t xml:space="preserve">draw drinking or clinical-wash water from a tap that failed its last quality test, or from a point labelled non-potable;</w:t>
-      </w:r>
-    </w:p>
-    <w:p>
-      <w:pPr>
-        <w:pStyle w:val="ListParagraph"/>
-        <w:numPr>
-          <w:ilvl w:val="0"/>
-          <w:numId w:val="1"/>
-        </w:numPr>
-        <w:spacing w:after="60"/>
-      </w:pPr>
-      <w:r>
-        <w:rPr>
-          <w:sz w:val="22"/>
-          <w:szCs w:val="22"/>
-        </w:rPr>
-        <w:t xml:space="preserve">occupy or continue a procedure in a clinical room whose essential circuit is known dark, unless a compensating UPS or generator supply is already carrying that circuit;</w:t>
-      </w:r>
-    </w:p>
-    <w:p>
-      <w:pPr>
-        <w:pStyle w:val="ListParagraph"/>
-        <w:numPr>
-          <w:ilvl w:val="0"/>
-          <w:numId w:val="1"/>
-        </w:numPr>
-        <w:spacing w:after="60"/>
-      </w:pPr>
-      <w:r>
-        <w:rPr>
-          <w:sz w:val="22"/>
-          <w:szCs w:val="22"/>
-        </w:rPr>
-        <w:t xml:space="preserve">sign a backup-test sheet for a generator that did not take the essential-circuit list, or for a water backup that did not move water to a point of use;</w:t>
-      </w:r>
-    </w:p>
-    <w:p>
-      <w:pPr>
-        <w:pStyle w:val="ListParagraph"/>
-        <w:numPr>
-          <w:ilvl w:val="0"/>
-          <w:numId w:val="1"/>
-        </w:numPr>
-        <w:spacing w:after="60"/>
-      </w:pPr>
-      <w:r>
-        <w:rPr>
-          <w:sz w:val="22"/>
-          <w:szCs w:val="22"/>
-        </w:rPr>
-        <w:t xml:space="preserve">shut clinical ventilation or an essential circuit to produce an energy figure.</w:t>
-      </w:r>
-    </w:p>
-    <w:p>
-      <w:pPr>
-        <w:spacing w:after="140"/>
-      </w:pPr>
-      <w:r>
-        <w:rPr>
-          <w:sz w:val="22"/>
-          <w:szCs w:val="22"/>
-        </w:rPr>
-        <w:t xml:space="preserve">They isolate the tap or room if they are competent to, leave the test unsigned, and tell the «Maintenance In-Charge» the same shift — or, if that person is not on site, the «named person on the after-hours facilities roster».</w:t>
-      </w:r>
-    </w:p>
-    <w:p>
-      <w:pPr>
-        <w:spacing w:after="140"/>
-      </w:pPr>
-      <w:r>
-        <w:rPr>
-          <w:sz w:val="22"/>
-          <w:szCs w:val="22"/>
-        </w:rPr>
-        <w:t xml:space="preserve">A good-faith refusal to sign a test that did not take load is not a disciplinary matter. The test is not recorded as passed until a loaded run has been seen.</w:t>
+        <w:t xml:space="preserve">Do not go ahead if you are about to do any of the following:</w:t>
+      </w:r>
+    </w:p>
+    <w:p>
+      <w:pPr>
+        <w:pStyle w:val="ListParagraph"/>
+        <w:numPr>
+          <w:ilvl w:val="0"/>
+          <w:numId w:val="1"/>
+        </w:numPr>
+        <w:spacing w:after="60"/>
+      </w:pPr>
+      <w:r>
+        <w:rPr>
+          <w:sz w:val="22"/>
+          <w:szCs w:val="22"/>
+        </w:rPr>
+        <w:t xml:space="preserve">take drinking water or clinical-wash water from a tap that failed its last quality test, or from a tap labelled not safe to drink;</w:t>
+      </w:r>
+    </w:p>
+    <w:p>
+      <w:pPr>
+        <w:pStyle w:val="ListParagraph"/>
+        <w:numPr>
+          <w:ilvl w:val="0"/>
+          <w:numId w:val="1"/>
+        </w:numPr>
+        <w:spacing w:after="60"/>
+      </w:pPr>
+      <w:r>
+        <w:rPr>
+          <w:sz w:val="22"/>
+          <w:szCs w:val="22"/>
+        </w:rPr>
+        <w:t xml:space="preserve">occupy a clinical room, or continue a procedure there, when its essential circuit is known to be dark, unless a UPS or generator supply is already carrying that circuit;</w:t>
+      </w:r>
+    </w:p>
+    <w:p>
+      <w:pPr>
+        <w:pStyle w:val="ListParagraph"/>
+        <w:numPr>
+          <w:ilvl w:val="0"/>
+          <w:numId w:val="1"/>
+        </w:numPr>
+        <w:spacing w:after="60"/>
+      </w:pPr>
+      <w:r>
+        <w:rPr>
+          <w:sz w:val="22"/>
+          <w:szCs w:val="22"/>
+        </w:rPr>
+        <w:t xml:space="preserve">sign a backup-test sheet for a generator that did not take the essential-circuit list, or for a water backup that did not move water to a tap;</w:t>
+      </w:r>
+    </w:p>
+    <w:p>
+      <w:pPr>
+        <w:pStyle w:val="ListParagraph"/>
+        <w:numPr>
+          <w:ilvl w:val="0"/>
+          <w:numId w:val="1"/>
+        </w:numPr>
+        <w:spacing w:after="60"/>
+      </w:pPr>
+      <w:r>
+        <w:rPr>
+          <w:sz w:val="22"/>
+          <w:szCs w:val="22"/>
+        </w:rPr>
+        <w:t xml:space="preserve">switch off clinical ventilation or an essential circuit to produce an energy figure.</w:t>
+      </w:r>
+    </w:p>
+    <w:p>
+      <w:pPr>
+        <w:spacing w:after="140"/>
+      </w:pPr>
+      <w:r>
+        <w:rPr>
+          <w:sz w:val="22"/>
+          <w:szCs w:val="22"/>
+        </w:rPr>
+        <w:t xml:space="preserve">If you can do so safely, isolate the tap or room. Leave the test unsigned. Tell the «Maintenance In-Charge» the same shift. If that person is not on site, tell the «named person on the after-hours facilities roster».</w:t>
+      </w:r>
+    </w:p>
+    <w:p>
+      <w:pPr>
+        <w:spacing w:after="140"/>
+      </w:pPr>
+      <w:r>
+        <w:rPr>
+          <w:sz w:val="22"/>
+          <w:szCs w:val="22"/>
+        </w:rPr>
+        <w:t xml:space="preserve">Refusing in good faith to sign a test that did not take load is not a disciplinary matter. Do not record the test as passed until a loaded run has been seen.</w:t>
       </w:r>
     </w:p>
     <w:p>
@@ -1644,7 +1980,19 @@
           <w:sz w:val="22"/>
           <w:szCs w:val="22"/>
         </w:rPr>
-        <w:t xml:space="preserve">These are the jobs this utilities policy needs. In a small hospital one person may also hold the biomedical or gas-plant lead; they still keep this file as the facilities file, not as a combined fire-and-utilities binder.</w:t>
+        <w:t xml:space="preserve">These are the jobs this utilities policy needs. In a small hospital one person may also be the biomedical or gas-plant lead. They still keep this file as the facilities file. Do not merge it into a combined fire-and-utilities binder.</w:t>
+      </w:r>
+    </w:p>
+    <w:p>
+      <w:pPr>
+        <w:spacing w:after="140"/>
+      </w:pPr>
+      <w:r>
+        <w:rPr>
+          <w:sz w:val="22"/>
+          <w:szCs w:val="22"/>
+        </w:rPr>
+        <w:t xml:space="preserve">RACI in the snapshot below means: R = does the work; A = accountable (the person who must make sure it is done); C = consulted.</w:t>
       </w:r>
     </w:p>
     <w:p>
@@ -1695,24 +2043,24 @@
           <w:sz w:val="22"/>
           <w:szCs w:val="22"/>
         </w:rPr>
-        <w:t xml:space="preserve">Accepts in writing any residual risk while a failed essential utility has a compensating arrangement.</w:t>
-      </w:r>
-    </w:p>
-    <w:p>
-      <w:pPr>
-        <w:pStyle w:val="ListParagraph"/>
-        <w:numPr>
-          <w:ilvl w:val="0"/>
-          <w:numId w:val="1"/>
-        </w:numPr>
-        <w:spacing w:after="60"/>
-      </w:pPr>
-      <w:r>
-        <w:rPr>
-          <w:sz w:val="22"/>
-          <w:szCs w:val="22"/>
-        </w:rPr>
-        <w:t xml:space="preserve">Names this year's energy and environment initiatives and the owner of each.</w:t>
+        <w:t xml:space="preserve">Accepts in writing any remaining risk while a failed essential utility has a temporary arrangement.</w:t>
+      </w:r>
+    </w:p>
+    <w:p>
+      <w:pPr>
+        <w:pStyle w:val="ListParagraph"/>
+        <w:numPr>
+          <w:ilvl w:val="0"/>
+          <w:numId w:val="1"/>
+        </w:numPr>
+        <w:spacing w:after="60"/>
+      </w:pPr>
+      <w:r>
+        <w:rPr>
+          <w:sz w:val="22"/>
+          <w:szCs w:val="22"/>
+        </w:rPr>
+        <w:t xml:space="preserve">Names this year's energy and environment projects and the owner of each.</w:t>
       </w:r>
     </w:p>
     <w:p>
@@ -1746,7 +2094,7 @@
           <w:sz w:val="22"/>
           <w:szCs w:val="22"/>
         </w:rPr>
-        <w:t xml:space="preserve">Holds the space-to-scope record, the controlled as-built set and update log, wayfinding inspection, availability watch, loaded backup tests, and the energy-initiative file.</w:t>
+        <w:t xml:space="preserve">Holds the space-to-services record, the official as-built set and update log, direction-sign checks, availability watch, loaded backup tests, and the energy-project file.</w:t>
       </w:r>
     </w:p>
     <w:p>
@@ -1831,24 +2179,24 @@
           <w:sz w:val="22"/>
           <w:szCs w:val="22"/>
         </w:rPr>
-        <w:t xml:space="preserve">Report a mismatch when a service is added or withdrawn.</w:t>
-      </w:r>
-    </w:p>
-    <w:p>
-      <w:pPr>
-        <w:pStyle w:val="ListParagraph"/>
-        <w:numPr>
-          <w:ilvl w:val="0"/>
-          <w:numId w:val="1"/>
-        </w:numPr>
-        <w:spacing w:after="60"/>
-      </w:pPr>
-      <w:r>
-        <w:rPr>
-          <w:sz w:val="22"/>
-          <w:szCs w:val="22"/>
-        </w:rPr>
-        <w:t xml:space="preserve">Do not cover public wayfinding with a clinical notice.</w:t>
+        <w:t xml:space="preserve">Report a mismatch when a service is added or stopped.</w:t>
+      </w:r>
+    </w:p>
+    <w:p>
+      <w:pPr>
+        <w:pStyle w:val="ListParagraph"/>
+        <w:numPr>
+          <w:ilvl w:val="0"/>
+          <w:numId w:val="1"/>
+        </w:numPr>
+        <w:spacing w:after="60"/>
+      </w:pPr>
+      <w:r>
+        <w:rPr>
+          <w:sz w:val="22"/>
+          <w:szCs w:val="22"/>
+        </w:rPr>
+        <w:t xml:space="preserve">Do not cover public direction signs with a clinical notice.</w:t>
       </w:r>
     </w:p>
     <w:p>
@@ -1916,7 +2264,7 @@
           <w:sz w:val="22"/>
           <w:szCs w:val="22"/>
         </w:rPr>
-        <w:t xml:space="preserve">Named on the trained-operator list before they start the generator or operate changeover.</w:t>
+        <w:t xml:space="preserve">Must be named on the trained-operator list before they start the generator or operate changeover.</w:t>
       </w:r>
     </w:p>
     <w:p>
@@ -1967,7 +2315,7 @@
           <w:sz w:val="22"/>
           <w:szCs w:val="22"/>
         </w:rPr>
-        <w:t xml:space="preserve">Report a dark essential circuit, a dry clinical tap, a drawing that does not match the floor, or a green poster with no initiative.</w:t>
+        <w:t xml:space="preserve">Report a dark essential circuit, a dry clinical tap, a drawing that does not match the floor, or a green poster with no project.</w:t>
       </w:r>
     </w:p>
     <w:p>
@@ -2030,7 +2378,7 @@
           <w:sz w:val="22"/>
           <w:szCs w:val="22"/>
         </w:rPr>
-        <w:t xml:space="preserve">Wayfinding: Maintenance In-Charge (R/A)</w:t>
+        <w:t xml:space="preserve">Direction signs: Maintenance In-Charge (R/A)</w:t>
       </w:r>
     </w:p>
     <w:p>
@@ -2081,7 +2429,7 @@
           <w:sz w:val="22"/>
           <w:szCs w:val="22"/>
         </w:rPr>
-        <w:t xml:space="preserve">Energy initiatives: named owner (R); Medical Superintendent (A)</w:t>
+        <w:t xml:space="preserve">Energy projects: named owner (R); Medical Superintendent (A)</w:t>
       </w:r>
     </w:p>
     <w:p>
@@ -2119,70 +2467,70 @@
           <w:sz w:val="22"/>
           <w:szCs w:val="22"/>
         </w:rPr>
-        <w:t xml:space="preserve">The Quality Coordinator audits this policy «quarterly». The audit looks at the plant and the records, not at a binder.</w:t>
-      </w:r>
-    </w:p>
-    <w:p>
-      <w:pPr>
-        <w:spacing w:after="140"/>
-      </w:pPr>
-      <w:r>
-        <w:rPr>
-          <w:sz w:val="22"/>
-          <w:szCs w:val="22"/>
-        </w:rPr>
-        <w:t xml:space="preserve">What is monitored each quarter:</w:t>
-      </w:r>
-    </w:p>
-    <w:p>
-      <w:pPr>
-        <w:pStyle w:val="ListParagraph"/>
-        <w:numPr>
-          <w:ilvl w:val="0"/>
-          <w:numId w:val="1"/>
-        </w:numPr>
-        <w:spacing w:after="60"/>
-      </w:pPr>
-      <w:r>
-        <w:rPr>
-          <w:sz w:val="22"/>
-          <w:szCs w:val="22"/>
-        </w:rPr>
-        <w:t xml:space="preserve">Space still matches the service directory; unused services are recorded as not offered, not given another hospital's floor plate.</w:t>
-      </w:r>
-    </w:p>
-    <w:p>
-      <w:pPr>
-        <w:pStyle w:val="ListParagraph"/>
-        <w:numPr>
-          <w:ilvl w:val="0"/>
-          <w:numId w:val="1"/>
-        </w:numPr>
-        <w:spacing w:after="60"/>
-      </w:pPr>
-      <w:r>
-        <w:rPr>
-          <w:sz w:val="22"/>
-          <w:szCs w:val="22"/>
-        </w:rPr>
-        <w:t xml:space="preserve">As-built set matches the built hospital and the occupancy the authority actually required; last update is dated.</w:t>
-      </w:r>
-    </w:p>
-    <w:p>
-      <w:pPr>
-        <w:pStyle w:val="ListParagraph"/>
-        <w:numPr>
-          <w:ilvl w:val="0"/>
-          <w:numId w:val="1"/>
-        </w:numPr>
-        <w:spacing w:after="60"/>
-      </w:pPr>
-      <w:r>
-        <w:rPr>
-          <w:sz w:val="22"/>
-          <w:szCs w:val="22"/>
-        </w:rPr>
-        <w:t xml:space="preserve">Wayfinding still directs a first-time family; it is not a radiation notice or a fire-exit display counted twice.</w:t>
+        <w:t xml:space="preserve">The Quality Coordinator audits this policy «quarterly» (four times a year). The audit looks at the plant and the records. Looking only at a binder is not enough.</w:t>
+      </w:r>
+    </w:p>
+    <w:p>
+      <w:pPr>
+        <w:spacing w:after="140"/>
+      </w:pPr>
+      <w:r>
+        <w:rPr>
+          <w:sz w:val="22"/>
+          <w:szCs w:val="22"/>
+        </w:rPr>
+        <w:t xml:space="preserve">What is checked each quarter:</w:t>
+      </w:r>
+    </w:p>
+    <w:p>
+      <w:pPr>
+        <w:pStyle w:val="ListParagraph"/>
+        <w:numPr>
+          <w:ilvl w:val="0"/>
+          <w:numId w:val="1"/>
+        </w:numPr>
+        <w:spacing w:after="60"/>
+      </w:pPr>
+      <w:r>
+        <w:rPr>
+          <w:sz w:val="22"/>
+          <w:szCs w:val="22"/>
+        </w:rPr>
+        <w:t xml:space="preserve">Space still matches the service directory. Services not offered are written down as not offered. They are not given another hospital's floor layout.</w:t>
+      </w:r>
+    </w:p>
+    <w:p>
+      <w:pPr>
+        <w:pStyle w:val="ListParagraph"/>
+        <w:numPr>
+          <w:ilvl w:val="0"/>
+          <w:numId w:val="1"/>
+        </w:numPr>
+        <w:spacing w:after="60"/>
+      </w:pPr>
+      <w:r>
+        <w:rPr>
+          <w:sz w:val="22"/>
+          <w:szCs w:val="22"/>
+        </w:rPr>
+        <w:t xml:space="preserve">The as-built set matches the built hospital and the occupancy the authority actually required. The last update is dated.</w:t>
+      </w:r>
+    </w:p>
+    <w:p>
+      <w:pPr>
+        <w:pStyle w:val="ListParagraph"/>
+        <w:numPr>
+          <w:ilvl w:val="0"/>
+          <w:numId w:val="1"/>
+        </w:numPr>
+        <w:spacing w:after="60"/>
+      </w:pPr>
+      <w:r>
+        <w:rPr>
+          <w:sz w:val="22"/>
+          <w:szCs w:val="22"/>
+        </w:rPr>
+        <w:t xml:space="preserve">Direction signs still help a family visiting for the first time. They are not a radiation notice or a fire-exit display used as a substitute.</w:t>
       </w:r>
     </w:p>
     <w:p>
@@ -2216,94 +2564,106 @@
           <w:sz w:val="22"/>
           <w:szCs w:val="22"/>
         </w:rPr>
-        <w:t xml:space="preserve">Last loaded electricity test took the essential-circuit list; last water test moved water to a point of use. A no-load crank is a finding.</w:t>
-      </w:r>
-    </w:p>
-    <w:p>
-      <w:pPr>
-        <w:pStyle w:val="ListParagraph"/>
-        <w:numPr>
-          <w:ilvl w:val="0"/>
-          <w:numId w:val="1"/>
-        </w:numPr>
-        <w:spacing w:after="60"/>
-      </w:pPr>
-      <w:r>
-        <w:rPr>
-          <w:sz w:val="22"/>
-          <w:szCs w:val="22"/>
-        </w:rPr>
-        <w:t xml:space="preserve">This year's energy file has a named owner, a baseline and a result, not a poster. Clinical ventilation was not cut to show a saving.</w:t>
-      </w:r>
-    </w:p>
-    <w:p>
-      <w:pPr>
-        <w:pStyle w:val="ListParagraph"/>
-        <w:numPr>
-          <w:ilvl w:val="0"/>
-          <w:numId w:val="1"/>
-        </w:numPr>
-        <w:spacing w:after="60"/>
-      </w:pPr>
-      <w:r>
-        <w:rPr>
-          <w:sz w:val="22"/>
-          <w:szCs w:val="22"/>
-        </w:rPr>
-        <w:t xml:space="preserve">Dialysis-water method exists only if dialysis is in the service directory.</w:t>
-      </w:r>
-    </w:p>
-    <w:p>
-      <w:pPr>
-        <w:pStyle w:val="ListParagraph"/>
-        <w:numPr>
-          <w:ilvl w:val="0"/>
-          <w:numId w:val="1"/>
-        </w:numPr>
-        <w:spacing w:after="60"/>
-      </w:pPr>
-      <w:r>
-        <w:rPr>
-          <w:sz w:val="22"/>
-          <w:szCs w:val="22"/>
-        </w:rPr>
-        <w:t xml:space="preserve">Biomedical-waste colours were left with the infection-control waste programme.</w:t>
-      </w:r>
-    </w:p>
-    <w:p>
-      <w:pPr>
-        <w:spacing w:after="140"/>
-      </w:pPr>
-      <w:r>
-        <w:rPr>
-          <w:sz w:val="22"/>
-          <w:szCs w:val="22"/>
-        </w:rPr>
-        <w:t xml:space="preserve">Any non-conformity is a finding. The Maintenance In-Charge owns the corrective action for plant, drawings and tests. The named initiative owner owns the corrective action for an energy file with no result. Root-cause analysis is required when: a backup test fails under load; an essential circuit is found dark after hours; a clinical tap is found dry after hours; a drawing does not match the floor; or an energy action cut clinical ventilation.</w:t>
-      </w:r>
-    </w:p>
-    <w:p>
-      <w:pPr>
-        <w:spacing w:after="140"/>
-      </w:pPr>
-      <w:r>
-        <w:rPr>
-          <w:sz w:val="22"/>
-          <w:szCs w:val="22"/>
-        </w:rPr>
-        <w:t xml:space="preserve">Corrective and preventive action is dated, has an owner, and is checked at the next quarterly audit. An open CAPA older than «thirty days» is escalated to the Medical Superintendent.</w:t>
-      </w:r>
-    </w:p>
-    <w:p>
-      <w:pPr>
-        <w:spacing w:after="140"/>
-      </w:pPr>
-      <w:r>
-        <w:rPr>
-          <w:sz w:val="22"/>
-          <w:szCs w:val="22"/>
-        </w:rPr>
-        <w:t xml:space="preserve">This policy is reviewed «annually», and sooner after a failed loaded test, a change to the service directory, or a building or major-service change that should have updated the as-built set.</w:t>
+        <w:t xml:space="preserve">The last loaded electricity test took the essential-circuit list. The last water test moved water to a point of use. A no-load generator start is a finding.</w:t>
+      </w:r>
+    </w:p>
+    <w:p>
+      <w:pPr>
+        <w:pStyle w:val="ListParagraph"/>
+        <w:numPr>
+          <w:ilvl w:val="0"/>
+          <w:numId w:val="1"/>
+        </w:numPr>
+        <w:spacing w:after="60"/>
+      </w:pPr>
+      <w:r>
+        <w:rPr>
+          <w:sz w:val="22"/>
+          <w:szCs w:val="22"/>
+        </w:rPr>
+        <w:t xml:space="preserve">This year's energy file has a named owner, a starting figure and a result, not a poster. Clinical ventilation was not cut to show a saving.</w:t>
+      </w:r>
+    </w:p>
+    <w:p>
+      <w:pPr>
+        <w:pStyle w:val="ListParagraph"/>
+        <w:numPr>
+          <w:ilvl w:val="0"/>
+          <w:numId w:val="1"/>
+        </w:numPr>
+        <w:spacing w:after="60"/>
+      </w:pPr>
+      <w:r>
+        <w:rPr>
+          <w:sz w:val="22"/>
+          <w:szCs w:val="22"/>
+        </w:rPr>
+        <w:t xml:space="preserve">A dialysis-water method exists only if dialysis is on the service directory.</w:t>
+      </w:r>
+    </w:p>
+    <w:p>
+      <w:pPr>
+        <w:pStyle w:val="ListParagraph"/>
+        <w:numPr>
+          <w:ilvl w:val="0"/>
+          <w:numId w:val="1"/>
+        </w:numPr>
+        <w:spacing w:after="60"/>
+      </w:pPr>
+      <w:r>
+        <w:rPr>
+          <w:sz w:val="22"/>
+          <w:szCs w:val="22"/>
+        </w:rPr>
+        <w:t xml:space="preserve">Biomedical-waste colours were left with the infection-control waste policy.</w:t>
+      </w:r>
+    </w:p>
+    <w:p>
+      <w:pPr>
+        <w:spacing w:after="140"/>
+      </w:pPr>
+      <w:r>
+        <w:rPr>
+          <w:sz w:val="22"/>
+          <w:szCs w:val="22"/>
+        </w:rPr>
+        <w:t xml:space="preserve">Any failure to meet this policy is a finding. The Maintenance In-Charge owns the corrective action for plant, drawings and tests. The named project owner owns the corrective action for an energy file with no result.</w:t>
+      </w:r>
+    </w:p>
+    <w:p>
+      <w:pPr>
+        <w:spacing w:after="140"/>
+      </w:pPr>
+      <w:r>
+        <w:rPr>
+          <w:sz w:val="22"/>
+          <w:szCs w:val="22"/>
+        </w:rPr>
+        <w:t xml:space="preserve">Root-cause analysis (RCA — finding why something went wrong, not only what went wrong) is required when: a backup test fails under load; an essential circuit is found dark after hours; a clinical tap is found dry after hours; a drawing does not match the floor; or an energy action cut clinical ventilation.</w:t>
+      </w:r>
+    </w:p>
+    <w:p>
+      <w:pPr>
+        <w:spacing w:after="140"/>
+      </w:pPr>
+      <w:r>
+        <w:rPr>
+          <w:sz w:val="22"/>
+          <w:szCs w:val="22"/>
+        </w:rPr>
+        <w:t xml:space="preserve">Corrective and preventive action (CAPA — the fix and the step that stops it happening again) is dated, has an owner, and is checked at the next quarterly audit. An open CAPA older than «thirty days» is escalated to the Medical Superintendent.</w:t>
+      </w:r>
+    </w:p>
+    <w:p>
+      <w:pPr>
+        <w:spacing w:after="140"/>
+      </w:pPr>
+      <w:r>
+        <w:rPr>
+          <w:sz w:val="22"/>
+          <w:szCs w:val="22"/>
+        </w:rPr>
+        <w:t xml:space="preserve">This policy is reviewed «annually» (once a year), and sooner after a failed loaded test, a change to the service directory, or a building or major-service change that should have updated the as-built set.</w:t>
       </w:r>
     </w:p>
     <w:p>
@@ -2324,7 +2684,7 @@
           <w:sz w:val="22"/>
           <w:szCs w:val="22"/>
         </w:rPr>
-        <w:t xml:space="preserve">Staff who operate plant, post signs, or whose department space must match the service directory are trained against this policy at induction and «once a year» thereafter. Training covers: reporting a dark circuit or dry tap; the public wayfinding route; not signing a backup test that did not take load; and the non-negotiable rules. Staff who may start the generator or operate changeover are named on a trained-operator list held by the Maintenance In-Charge.</w:t>
+        <w:t xml:space="preserve">Staff who operate plant, put up signs, or whose department space must match the service directory are trained on this policy at induction and «once a year» after that. Training covers: reporting a dark circuit or dry tap; the public direction-sign route; not signing a backup test that did not take load; and the banned acts. Staff who may start the generator or operate changeover are named on a trained-operator list held by the Maintenance In-Charge.</w:t>
       </w:r>
     </w:p>
     <w:p>
@@ -2348,7 +2708,7 @@
           <w:sz w:val="22"/>
           <w:szCs w:val="22"/>
         </w:rPr>
-        <w:t xml:space="preserve">I have read this Planned Facilities, Utilities and Environment-Friendly Measures policy of Preview Hospital. I will not draw drinking or clinical-wash water from a failed or non-potable tap. I will not sign a backup-test sheet for a generator that did not take the essential-circuit list. I will not shut clinical ventilation to show an energy saving.</w:t>
+        <w:t xml:space="preserve">I have read this Planned Facilities, Utilities and Environment-Friendly Measures policy of Preview Hospital. I will not take drinking or clinical-wash water from a failed or non-potable tap. I will not sign a backup-test sheet for a generator that did not take the essential-circuit list. I will not switch off clinical ventilation to show an energy saving.</w:t>
       </w:r>
     </w:p>
     <w:p>
@@ -3095,7 +3455,7 @@
           <w:sz w:val="20"/>
           <w:szCs w:val="20"/>
         </w:rPr>
-        <w:t xml:space="preserve">The Maintenance In-Charge holds signed acknowledgements of plant operators and department heads with the induction record. Staff who start the generator or operate changeover are named on the trained-operator list.</w:t>
+        <w:t xml:space="preserve">The Maintenance In-Charge keeps signed acknowledgements of plant operators and department heads with the induction record. Staff who start the generator or operate changeover are named on the trained-operator list.</w:t>
       </w:r>
     </w:p>
     <w:p>
@@ -3121,126 +3481,126 @@
           <w:sz w:val="22"/>
           <w:szCs w:val="22"/>
         </w:rPr>
-        <w:t xml:space="preserve">National Accreditation Board for Hospitals and Healthcare Providers (NABH), Standards for Small Healthcare Organisations, 3rd Edition — Chapter 8 FMS, standard FMS.1 (this policy is written so that those requirements are met in operation; it is not a commentary on the standard).</w:t>
-      </w:r>
-    </w:p>
-    <w:p>
-      <w:pPr>
-        <w:pStyle w:val="ListParagraph"/>
-        <w:numPr>
-          <w:ilvl w:val="0"/>
-          <w:numId w:val="1"/>
-        </w:numPr>
-        <w:spacing w:after="60"/>
-      </w:pPr>
-      <w:r>
-        <w:rPr>
-          <w:sz w:val="22"/>
-          <w:szCs w:val="22"/>
-        </w:rPr>
-        <w:t xml:space="preserve">National Building Code of India, 2016. Bureau of Indian Standards — occupancy, services and as-built drawing framework as the local building and fire authority has applied it to this facility; not a universal sprinkler or bed-count mandate.</w:t>
-      </w:r>
-    </w:p>
-    <w:p>
-      <w:pPr>
-        <w:pStyle w:val="ListParagraph"/>
-        <w:numPr>
-          <w:ilvl w:val="0"/>
-          <w:numId w:val="1"/>
-        </w:numPr>
-        <w:spacing w:after="60"/>
-      </w:pPr>
-      <w:r>
-        <w:rPr>
-          <w:sz w:val="22"/>
-          <w:szCs w:val="22"/>
-        </w:rPr>
-        <w:t xml:space="preserve">IS 732 — wiring practice; IS 3043 — earthing (NBC-pointed frameworks, not extra disclaimer statutes).</w:t>
-      </w:r>
-    </w:p>
-    <w:p>
-      <w:pPr>
-        <w:pStyle w:val="ListParagraph"/>
-        <w:numPr>
-          <w:ilvl w:val="0"/>
-          <w:numId w:val="1"/>
-        </w:numPr>
-        <w:spacing w:after="60"/>
-      </w:pPr>
-      <w:r>
-        <w:rPr>
-          <w:sz w:val="22"/>
-          <w:szCs w:val="22"/>
-        </w:rPr>
-        <w:t xml:space="preserve">Guidelines for Drinking-water Quality (4th Edition). World Health Organization (2011) — potable-water quality-testing framework, not a pasted protocol or a NABH interval.</w:t>
-      </w:r>
-    </w:p>
-    <w:p>
-      <w:pPr>
-        <w:pStyle w:val="ListParagraph"/>
-        <w:numPr>
-          <w:ilvl w:val="0"/>
-          <w:numId w:val="1"/>
-        </w:numPr>
-        <w:spacing w:after="60"/>
-      </w:pPr>
-      <w:r>
-        <w:rPr>
-          <w:sz w:val="22"/>
-          <w:szCs w:val="22"/>
-        </w:rPr>
-        <w:t xml:space="preserve">Coulliette, A. D., &amp; Arduino, M. J. (2015). Hemodialysis and Water Quality. Semin Dial, 26(4), 427-438 — dialysis-water framework only if dialysis is in the service directory.</w:t>
-      </w:r>
-    </w:p>
-    <w:p>
-      <w:pPr>
-        <w:pStyle w:val="ListParagraph"/>
-        <w:numPr>
-          <w:ilvl w:val="0"/>
-          <w:numId w:val="1"/>
-        </w:numPr>
-        <w:spacing w:after="60"/>
-      </w:pPr>
-      <w:r>
-        <w:rPr>
-          <w:sz w:val="22"/>
-          <w:szCs w:val="22"/>
-        </w:rPr>
-        <w:t xml:space="preserve">Dhillon, V. S. (2015). Green Hospital and Climate Change: Their Interrelationship and the Way Forward. JOURNAL OF CLINICAL AND DIAGNOSTIC RESEARCH — energy-efficiency framework, not a named rating mandate.</w:t>
-      </w:r>
-    </w:p>
-    <w:p>
-      <w:pPr>
-        <w:pStyle w:val="ListParagraph"/>
-        <w:numPr>
-          <w:ilvl w:val="0"/>
-          <w:numId w:val="1"/>
-        </w:numPr>
-        <w:spacing w:after="60"/>
-      </w:pPr>
-      <w:r>
-        <w:rPr>
-          <w:sz w:val="22"/>
-          <w:szCs w:val="22"/>
-        </w:rPr>
-        <w:t xml:space="preserve">Indian Public Health Standards. (2022). National Health Mission — space-planning framework, not a NABH bed-count mandate.</w:t>
-      </w:r>
-    </w:p>
-    <w:p>
-      <w:pPr>
-        <w:pStyle w:val="ListParagraph"/>
-        <w:numPr>
-          <w:ilvl w:val="0"/>
-          <w:numId w:val="1"/>
-        </w:numPr>
-        <w:spacing w:after="60"/>
-      </w:pPr>
-      <w:r>
-        <w:rPr>
-          <w:sz w:val="22"/>
-          <w:szCs w:val="22"/>
-        </w:rPr>
-        <w:t xml:space="preserve">Internal documents of this hospital: service directory; as-built drawing set; wayfinding; potable-water and electrical records; backup-test records; energy-initiative file; facility-safety, equipment, medical-gas and fire programmes; infection-control waste programme.</w:t>
+        <w:t xml:space="preserve">National Accreditation Board for Hospitals and Healthcare Providers (NABH), Standards for Small Healthcare Organisations, 3rd Edition — Chapter 8 FMS, standard FMS.1 (this policy is written so those requirements are met in day-to-day work; it is not a commentary on the standard).</w:t>
+      </w:r>
+    </w:p>
+    <w:p>
+      <w:pPr>
+        <w:pStyle w:val="ListParagraph"/>
+        <w:numPr>
+          <w:ilvl w:val="0"/>
+          <w:numId w:val="1"/>
+        </w:numPr>
+        <w:spacing w:after="60"/>
+      </w:pPr>
+      <w:r>
+        <w:rPr>
+          <w:sz w:val="22"/>
+          <w:szCs w:val="22"/>
+        </w:rPr>
+        <w:t xml:space="preserve">National Building Code of India, 2016. Bureau of Indian Standards — occupancy, services and as-built drawing guide as the local building and fire authority has applied it to this facility; not a universal sprinkler or bed-count rule.</w:t>
+      </w:r>
+    </w:p>
+    <w:p>
+      <w:pPr>
+        <w:pStyle w:val="ListParagraph"/>
+        <w:numPr>
+          <w:ilvl w:val="0"/>
+          <w:numId w:val="1"/>
+        </w:numPr>
+        <w:spacing w:after="60"/>
+      </w:pPr>
+      <w:r>
+        <w:rPr>
+          <w:sz w:val="22"/>
+          <w:szCs w:val="22"/>
+        </w:rPr>
+        <w:t xml:space="preserve">IS 732 — wiring practice; IS 3043 — earthing (NBC-pointed guides, not extra disclaimer statutes).</w:t>
+      </w:r>
+    </w:p>
+    <w:p>
+      <w:pPr>
+        <w:pStyle w:val="ListParagraph"/>
+        <w:numPr>
+          <w:ilvl w:val="0"/>
+          <w:numId w:val="1"/>
+        </w:numPr>
+        <w:spacing w:after="60"/>
+      </w:pPr>
+      <w:r>
+        <w:rPr>
+          <w:sz w:val="22"/>
+          <w:szCs w:val="22"/>
+        </w:rPr>
+        <w:t xml:space="preserve">Guidelines for Drinking-water Quality (4th Edition). World Health Organization (2011) — drinking-water quality-testing guide, not a pasted protocol or a NABH interval.</w:t>
+      </w:r>
+    </w:p>
+    <w:p>
+      <w:pPr>
+        <w:pStyle w:val="ListParagraph"/>
+        <w:numPr>
+          <w:ilvl w:val="0"/>
+          <w:numId w:val="1"/>
+        </w:numPr>
+        <w:spacing w:after="60"/>
+      </w:pPr>
+      <w:r>
+        <w:rPr>
+          <w:sz w:val="22"/>
+          <w:szCs w:val="22"/>
+        </w:rPr>
+        <w:t xml:space="preserve">Coulliette, A. D., &amp; Arduino, M. J. (2015). Hemodialysis and Water Quality. Semin Dial, 26(4), 427-438 — dialysis-water guide only if dialysis is on the service directory.</w:t>
+      </w:r>
+    </w:p>
+    <w:p>
+      <w:pPr>
+        <w:pStyle w:val="ListParagraph"/>
+        <w:numPr>
+          <w:ilvl w:val="0"/>
+          <w:numId w:val="1"/>
+        </w:numPr>
+        <w:spacing w:after="60"/>
+      </w:pPr>
+      <w:r>
+        <w:rPr>
+          <w:sz w:val="22"/>
+          <w:szCs w:val="22"/>
+        </w:rPr>
+        <w:t xml:space="preserve">Dhillon, V. S. (2015). Green Hospital and Climate Change: Their Interrelationship and the Way Forward. JOURNAL OF CLINICAL AND DIAGNOSTIC RESEARCH — energy-efficiency guide, not a named rating this hospital must hold.</w:t>
+      </w:r>
+    </w:p>
+    <w:p>
+      <w:pPr>
+        <w:pStyle w:val="ListParagraph"/>
+        <w:numPr>
+          <w:ilvl w:val="0"/>
+          <w:numId w:val="1"/>
+        </w:numPr>
+        <w:spacing w:after="60"/>
+      </w:pPr>
+      <w:r>
+        <w:rPr>
+          <w:sz w:val="22"/>
+          <w:szCs w:val="22"/>
+        </w:rPr>
+        <w:t xml:space="preserve">Indian Public Health Standards. (2022). National Health Mission — space-planning guide, not a NABH bed-count rule.</w:t>
+      </w:r>
+    </w:p>
+    <w:p>
+      <w:pPr>
+        <w:pStyle w:val="ListParagraph"/>
+        <w:numPr>
+          <w:ilvl w:val="0"/>
+          <w:numId w:val="1"/>
+        </w:numPr>
+        <w:spacing w:after="60"/>
+      </w:pPr>
+      <w:r>
+        <w:rPr>
+          <w:sz w:val="22"/>
+          <w:szCs w:val="22"/>
+        </w:rPr>
+        <w:t xml:space="preserve">Internal documents of this hospital: service directory; as-built drawing set; direction signs; drinking-water and electrical records; backup-test records; energy-project file; facility-safety, equipment, medical-gas and fire policies; infection-control waste policy.</w:t>
       </w:r>
     </w:p>
     <w:p>
@@ -3261,7 +3621,7 @@
           <w:sz w:val="22"/>
           <w:szCs w:val="22"/>
         </w:rPr>
-        <w:t xml:space="preserve">Controlled master copy: office of the Medical Superintendent, Preview Hospital, with the «Maintenance In-Charge» and the Quality Coordinator.</w:t>
+        <w:t xml:space="preserve">Official master copy: office of the Medical Superintendent, Preview Hospital, with the «Maintenance In-Charge» and the Quality Coordinator.</w:t>
       </w:r>
     </w:p>
     <w:p>
@@ -3297,7 +3657,7 @@
           <w:sz w:val="22"/>
           <w:szCs w:val="22"/>
         </w:rPr>
-        <w:t xml:space="preserve">Superseded versions are withdrawn from all points of use on issue of a revision. One dated copy of each is retained by the Quality Coordinator.</w:t>
+        <w:t xml:space="preserve">When a new version is issued, take old copies out of use. The Quality Coordinator keeps one dated copy of each old version.</w:t>
       </w:r>
     </w:p>
     <w:p>
@@ -3324,12 +3684,15 @@
 IPHS — Indian Public Health Standards
 GDWQ — WHO Guidelines for Drinking-water Quality
 WHO — World Health Organization
+PC-PNDT — Pre-Conception and Pre-Natal Diagnostic Techniques
 MGPS — medical gas pipeline system
 RO — reverse osmosis
 CSSD — central sterile supply department
 CAPA — corrective and preventive action
 RCA — root-cause analysis
-HVAC — heating, ventilation and air-conditioning</w:t>
+HVAC — heating, ventilation and air-conditioning
+RACI — Responsible, Accountable, Consulted, Informed
+IS — Indian Standard</w:t>
       </w:r>
     </w:p>
     <w:p>
@@ -4054,24 +4417,24 @@
           <w:sz w:val="22"/>
           <w:szCs w:val="22"/>
         </w:rPr>
-        <w:t xml:space="preserve">Dated space-to-scope record against the service directory.</w:t>
-      </w:r>
-    </w:p>
-    <w:p>
-      <w:pPr>
-        <w:pStyle w:val="ListParagraph"/>
-        <w:numPr>
-          <w:ilvl w:val="0"/>
-          <w:numId w:val="1"/>
-        </w:numPr>
-        <w:spacing w:after="60"/>
-      </w:pPr>
-      <w:r>
-        <w:rPr>
-          <w:sz w:val="22"/>
-          <w:szCs w:val="22"/>
-        </w:rPr>
-        <w:t xml:space="preserve">Recorded absences for services not offered.</w:t>
+        <w:t xml:space="preserve">Dated record comparing rooms to the service directory.</w:t>
+      </w:r>
+    </w:p>
+    <w:p>
+      <w:pPr>
+        <w:pStyle w:val="ListParagraph"/>
+        <w:numPr>
+          <w:ilvl w:val="0"/>
+          <w:numId w:val="1"/>
+        </w:numPr>
+        <w:spacing w:after="60"/>
+      </w:pPr>
+      <w:r>
+        <w:rPr>
+          <w:sz w:val="22"/>
+          <w:szCs w:val="22"/>
+        </w:rPr>
+        <w:t xml:space="preserve">Written note that a service is not offered, where it is not on the directory.</w:t>
       </w:r>
     </w:p>
     <w:p>
@@ -4105,7 +4468,7 @@
           <w:sz w:val="22"/>
           <w:szCs w:val="22"/>
         </w:rPr>
-        <w:t xml:space="preserve">Update of the space record when a service is added or withdrawn.</w:t>
+        <w:t xml:space="preserve">Update of the space record when a service is added or stopped.</w:t>
       </w:r>
     </w:p>
     <w:p>
@@ -4131,7 +4494,7 @@
           <w:sz w:val="22"/>
           <w:szCs w:val="22"/>
         </w:rPr>
-        <w:t xml:space="preserve">Controlled as-built set the occupancy actually required.</w:t>
+        <w:t xml:space="preserve">Official as-built drawing set the occupancy actually required.</w:t>
       </w:r>
     </w:p>
     <w:p>
@@ -4165,7 +4528,7 @@
           <w:sz w:val="22"/>
           <w:szCs w:val="22"/>
         </w:rPr>
-        <w:t xml:space="preserve">Working copies of fire sheets issued to the fire programme, and of medical-gas sheets to the gas programme if piped, without creating a second master.</w:t>
+        <w:t xml:space="preserve">Working copies of fire sheets given to the fire policy, and of medical-gas sheets to the gas policy if piped, without creating a second master set.</w:t>
       </w:r>
     </w:p>
     <w:p>
@@ -4208,24 +4571,24 @@
           <w:sz w:val="22"/>
           <w:szCs w:val="22"/>
         </w:rPr>
-        <w:t xml:space="preserve">Monthly wayfinding inspection for faded, contradictory or missing signs.</w:t>
-      </w:r>
-    </w:p>
-    <w:p>
-      <w:pPr>
-        <w:pStyle w:val="ListParagraph"/>
-        <w:numPr>
-          <w:ilvl w:val="0"/>
-          <w:numId w:val="1"/>
-        </w:numPr>
-        <w:spacing w:after="60"/>
-      </w:pPr>
-      <w:r>
-        <w:rPr>
-          <w:sz w:val="22"/>
-          <w:szCs w:val="22"/>
-        </w:rPr>
-        <w:t xml:space="preserve">Record that radiation / PC-PNDT notices and fire-exit display are not counted as this posting.</w:t>
+        <w:t xml:space="preserve">Monthly check of faded, contradictory or missing direction signs.</w:t>
+      </w:r>
+    </w:p>
+    <w:p>
+      <w:pPr>
+        <w:pStyle w:val="ListParagraph"/>
+        <w:numPr>
+          <w:ilvl w:val="0"/>
+          <w:numId w:val="1"/>
+        </w:numPr>
+        <w:spacing w:after="60"/>
+      </w:pPr>
+      <w:r>
+        <w:rPr>
+          <w:sz w:val="22"/>
+          <w:szCs w:val="22"/>
+        </w:rPr>
+        <w:t xml:space="preserve">Note that radiation / PC-PNDT notices and the fire-exit display are not counted as these direction signs.</w:t>
       </w:r>
     </w:p>
     <w:p>
@@ -4268,7 +4631,7 @@
           <w:sz w:val="22"/>
           <w:szCs w:val="22"/>
         </w:rPr>
-        <w:t xml:space="preserve">Essential-circuit list actually energised.</w:t>
+        <w:t xml:space="preserve">Essential-circuit list that is actually kept live.</w:t>
       </w:r>
     </w:p>
     <w:p>
@@ -4302,24 +4665,24 @@
           <w:sz w:val="22"/>
           <w:szCs w:val="22"/>
         </w:rPr>
-        <w:t xml:space="preserve">Dialysis-water method, or a recorded absence if dialysis is not in the service directory.</w:t>
-      </w:r>
-    </w:p>
-    <w:p>
-      <w:pPr>
-        <w:pStyle w:val="ListParagraph"/>
-        <w:numPr>
-          <w:ilvl w:val="0"/>
-          <w:numId w:val="1"/>
-        </w:numPr>
-        <w:spacing w:after="60"/>
-      </w:pPr>
-      <w:r>
-        <w:rPr>
-          <w:sz w:val="22"/>
-          <w:szCs w:val="22"/>
-        </w:rPr>
-        <w:t xml:space="preserve">Legionella / stagnant-water control for systems actually run, or a recorded absence if none exist.</w:t>
+        <w:t xml:space="preserve">Dialysis-water method, or a written note that dialysis is not on the service directory.</w:t>
+      </w:r>
+    </w:p>
+    <w:p>
+      <w:pPr>
+        <w:pStyle w:val="ListParagraph"/>
+        <w:numPr>
+          <w:ilvl w:val="0"/>
+          <w:numId w:val="1"/>
+        </w:numPr>
+        <w:spacing w:after="60"/>
+      </w:pPr>
+      <w:r>
+        <w:rPr>
+          <w:sz w:val="22"/>
+          <w:szCs w:val="22"/>
+        </w:rPr>
+        <w:t xml:space="preserve">Legionella / stagnant-water control for systems actually run, or a written note that none exist.</w:t>
       </w:r>
     </w:p>
     <w:p>
@@ -4362,41 +4725,41 @@
           <w:sz w:val="22"/>
           <w:szCs w:val="22"/>
         </w:rPr>
-        <w:t xml:space="preserve">Named alternate electricity and water sources.</w:t>
-      </w:r>
-    </w:p>
-    <w:p>
-      <w:pPr>
-        <w:pStyle w:val="ListParagraph"/>
-        <w:numPr>
-          <w:ilvl w:val="0"/>
-          <w:numId w:val="1"/>
-        </w:numPr>
-        <w:spacing w:after="60"/>
-      </w:pPr>
-      <w:r>
-        <w:rPr>
-          <w:sz w:val="22"/>
-          <w:szCs w:val="22"/>
-        </w:rPr>
-        <w:t xml:space="preserve">Loaded essential-circuit test records at the predefined frequency, with fuel, coolant and battery condition.</w:t>
-      </w:r>
-    </w:p>
-    <w:p>
-      <w:pPr>
-        <w:pStyle w:val="ListParagraph"/>
-        <w:numPr>
-          <w:ilvl w:val="0"/>
-          <w:numId w:val="1"/>
-        </w:numPr>
-        <w:spacing w:after="60"/>
-      </w:pPr>
-      <w:r>
-        <w:rPr>
-          <w:sz w:val="22"/>
-          <w:szCs w:val="22"/>
-        </w:rPr>
-        <w:t xml:space="preserve">Tank-to-tap, pump auto-start, or tanker-mobilisation records at the predefined frequency.</w:t>
+        <w:t xml:space="preserve">Named backup electricity and water sources.</w:t>
+      </w:r>
+    </w:p>
+    <w:p>
+      <w:pPr>
+        <w:pStyle w:val="ListParagraph"/>
+        <w:numPr>
+          <w:ilvl w:val="0"/>
+          <w:numId w:val="1"/>
+        </w:numPr>
+        <w:spacing w:after="60"/>
+      </w:pPr>
+      <w:r>
+        <w:rPr>
+          <w:sz w:val="22"/>
+          <w:szCs w:val="22"/>
+        </w:rPr>
+        <w:t xml:space="preserve">Loaded essential-circuit test records at the set frequency, with fuel, coolant and battery condition.</w:t>
+      </w:r>
+    </w:p>
+    <w:p>
+      <w:pPr>
+        <w:pStyle w:val="ListParagraph"/>
+        <w:numPr>
+          <w:ilvl w:val="0"/>
+          <w:numId w:val="1"/>
+        </w:numPr>
+        <w:spacing w:after="60"/>
+      </w:pPr>
+      <w:r>
+        <w:rPr>
+          <w:sz w:val="22"/>
+          <w:szCs w:val="22"/>
+        </w:rPr>
+        <w:t xml:space="preserve">Tank-to-tap, pump auto-start, or tanker call-out records at the set frequency.</w:t>
       </w:r>
     </w:p>
     <w:p>
@@ -4439,58 +4802,58 @@
           <w:sz w:val="22"/>
           <w:szCs w:val="22"/>
         </w:rPr>
-        <w:t xml:space="preserve">This year's named initiatives, owner, baseline and review date.</w:t>
-      </w:r>
-    </w:p>
-    <w:p>
-      <w:pPr>
-        <w:pStyle w:val="ListParagraph"/>
-        <w:numPr>
-          <w:ilvl w:val="0"/>
-          <w:numId w:val="1"/>
-        </w:numPr>
-        <w:spacing w:after="60"/>
-      </w:pPr>
-      <w:r>
-        <w:rPr>
-          <w:sz w:val="22"/>
-          <w:szCs w:val="22"/>
-        </w:rPr>
-        <w:t xml:space="preserve">Measured result against the baseline.</w:t>
-      </w:r>
-    </w:p>
-    <w:p>
-      <w:pPr>
-        <w:pStyle w:val="ListParagraph"/>
-        <w:numPr>
-          <w:ilvl w:val="0"/>
-          <w:numId w:val="1"/>
-        </w:numPr>
-        <w:spacing w:after="60"/>
-      </w:pPr>
-      <w:r>
-        <w:rPr>
-          <w:sz w:val="22"/>
-          <w:szCs w:val="22"/>
-        </w:rPr>
-        <w:t xml:space="preserve">Record that clinical ventilation was not cut to show a saving.</w:t>
-      </w:r>
-    </w:p>
-    <w:p>
-      <w:pPr>
-        <w:pStyle w:val="ListParagraph"/>
-        <w:numPr>
-          <w:ilvl w:val="0"/>
-          <w:numId w:val="1"/>
-        </w:numPr>
-        <w:spacing w:after="60"/>
-      </w:pPr>
-      <w:r>
-        <w:rPr>
-          <w:sz w:val="22"/>
-          <w:szCs w:val="22"/>
-        </w:rPr>
-        <w:t xml:space="preserve">Record that biomedical-waste colours remain the infection-control waste programme.</w:t>
+        <w:t xml:space="preserve">This year's named projects, owner, starting figure and review date.</w:t>
+      </w:r>
+    </w:p>
+    <w:p>
+      <w:pPr>
+        <w:pStyle w:val="ListParagraph"/>
+        <w:numPr>
+          <w:ilvl w:val="0"/>
+          <w:numId w:val="1"/>
+        </w:numPr>
+        <w:spacing w:after="60"/>
+      </w:pPr>
+      <w:r>
+        <w:rPr>
+          <w:sz w:val="22"/>
+          <w:szCs w:val="22"/>
+        </w:rPr>
+        <w:t xml:space="preserve">Measured result against the starting figure.</w:t>
+      </w:r>
+    </w:p>
+    <w:p>
+      <w:pPr>
+        <w:pStyle w:val="ListParagraph"/>
+        <w:numPr>
+          <w:ilvl w:val="0"/>
+          <w:numId w:val="1"/>
+        </w:numPr>
+        <w:spacing w:after="60"/>
+      </w:pPr>
+      <w:r>
+        <w:rPr>
+          <w:sz w:val="22"/>
+          <w:szCs w:val="22"/>
+        </w:rPr>
+        <w:t xml:space="preserve">Note that clinical ventilation was not cut to show a saving.</w:t>
+      </w:r>
+    </w:p>
+    <w:p>
+      <w:pPr>
+        <w:pStyle w:val="ListParagraph"/>
+        <w:numPr>
+          <w:ilvl w:val="0"/>
+          <w:numId w:val="1"/>
+        </w:numPr>
+        <w:spacing w:after="60"/>
+      </w:pPr>
+      <w:r>
+        <w:rPr>
+          <w:sz w:val="22"/>
+          <w:szCs w:val="22"/>
+        </w:rPr>
+        <w:t xml:space="preserve">Note that biomedical-waste colours remain with the infection-control waste policy.</w:t>
       </w:r>
     </w:p>
     <w:p>

</xml_diff>